<commit_message>
docs: use plain build guide language
</commit_message>
<xml_diff>
--- a/docs/rebuild_guide.docx
+++ b/docs/rebuild_guide.docx
@@ -28,7 +28,7 @@
           <w:color w:val="0B6F7A"/>
           <w:sz w:val="21"/>
         </w:rPr>
-        <w:t>Builder Companion for the Riyadh Urban Intelligence Lab</w:t>
+        <w:t>Build Guide for the Riyadh Urban Intelligence Lab</w:t>
       </w:r>
     </w:p>
     <w:p>
@@ -45,7 +45,7 @@
           <w:color w:val="52616B"/>
           <w:sz w:val="21"/>
         </w:rPr>
-        <w:t>atomcamp Arabia x Microsoft hackathon builder handout</w:t>
+        <w:t>atomcamp Arabia x Microsoft hackathon build guide</w:t>
       </w:r>
     </w:p>
     <w:tbl>
@@ -95,7 +95,7 @@
                 <w:color w:val="12343B"/>
                 <w:sz w:val="19"/>
               </w:rPr>
-              <w:t>A clean companion for running, explaining, deploying, and adapting the Riyadh mobility scaffold.</w:t>
+              <w:t>A clean guide for running, explaining, deploying, and adapting the Riyadh mobility scaffold.</w:t>
             </w:r>
           </w:p>
         </w:tc>
@@ -140,7 +140,7 @@
           <w:color w:val="1D2B31"/>
           <w:sz w:val="21"/>
         </w:rPr>
-        <w:t>You have the code. This companion explains what the starter kit is, how it fits the hackathon tracks, how the app is built, and how teams can adapt it into their own mobility, district intelligence, sustainability, or visitor-experience prototypes.</w:t>
+        <w:t>You have the code. This guide explains what the starter kit is, how it fits the hackathon tracks, how the app is built, and how teams can adapt it into their own mobility, district intelligence, sustainability, or visitor-experience prototypes.</w:t>
       </w:r>
     </w:p>
     <w:p>
@@ -153,7 +153,7 @@
           <w:color w:val="1D2B31"/>
           <w:sz w:val="21"/>
         </w:rPr>
-        <w:t>This is a client-facing builder guide. It is not meant to document every internal line of code. It gives participants, mentors, and stakeholders a clear map of the product, the architecture, the Azure services, and the extension routes.</w:t>
+        <w:t>This guide is not meant to document every internal line of code. It gives builders and mentors a clear map of the product, the architecture, the Azure services, and the extension routes.</w:t>
       </w:r>
     </w:p>
     <w:p>
@@ -395,7 +395,7 @@
           <w:color w:val="1D2B31"/>
           <w:sz w:val="21"/>
         </w:rPr>
-        <w:t>Companion references to keep nearby:</w:t>
+        <w:t>Useful references to keep nearby:</w:t>
       </w:r>
     </w:p>
     <w:tbl>
@@ -618,7 +618,7 @@
                 <w:color w:val="12343B"/>
                 <w:sz w:val="18"/>
               </w:rPr>
-              <w:t>editable source for this companion</w:t>
+              <w:t>editable source for this guide</w:t>
             </w:r>
           </w:p>
         </w:tc>
@@ -672,7 +672,7 @@
                 <w:color w:val="12343B"/>
                 <w:sz w:val="18"/>
               </w:rPr>
-              <w:t>polished handout version</w:t>
+              <w:t>formatted guide</w:t>
             </w:r>
           </w:p>
         </w:tc>
@@ -2785,7 +2785,7 @@
               <w:br/>
               <w:t>├── infra/                       # Bicep modules</w:t>
               <w:br/>
-              <w:t>├── docs/                        # polished rebuild guide</w:t>
+              <w:t>├── docs/                        # build guide and supporting notes</w:t>
               <w:br/>
               <w:t>├── tests/                       # scoring, API, and data-shape checks</w:t>
               <w:br/>
@@ -8900,7 +8900,7 @@
                 <w:color w:val="12343B"/>
                 <w:sz w:val="18"/>
               </w:rPr>
-              <w:t>builder companion source</w:t>
+              <w:t>build guide source</w:t>
             </w:r>
           </w:p>
         </w:tc>
@@ -8953,7 +8953,7 @@
                 <w:color w:val="12343B"/>
                 <w:sz w:val="18"/>
               </w:rPr>
-              <w:t>polished builder companion</w:t>
+              <w:t>formatted build guide</w:t>
             </w:r>
           </w:p>
         </w:tc>
@@ -9731,7 +9731,7 @@
         <w:color w:val="52616B"/>
         <w:sz w:val="16"/>
       </w:rPr>
-      <w:t>Builder Companion | Riyadh Urban Intelligence Lab</w:t>
+      <w:t>Build Guide | Riyadh Urban Intelligence Lab</w:t>
     </w:r>
   </w:p>
 </w:ftr>

</xml_diff>

<commit_message>
docs: make guides more action oriented
</commit_message>
<xml_diff>
--- a/docs/rebuild_guide.docx
+++ b/docs/rebuild_guide.docx
@@ -140,7 +140,7 @@
           <w:color w:val="1D2B31"/>
           <w:sz w:val="21"/>
         </w:rPr>
-        <w:t>You have the code. This guide explains what the starter kit is, how it fits the hackathon tracks, how the app is built, and how teams can adapt it into their own mobility, district intelligence, sustainability, or visitor-experience prototypes.</w:t>
+        <w:t>Understand the app, run it locally, and adapt it for another use case.</w:t>
       </w:r>
     </w:p>
     <w:p>
@@ -153,7 +153,7 @@
           <w:color w:val="1D2B31"/>
           <w:sz w:val="21"/>
         </w:rPr>
-        <w:t>This guide is not meant to document every internal line of code. It gives builders and mentors a clear map of the product, the architecture, the Azure services, and the extension routes.</w:t>
+        <w:t>Focus on the working path first: local app, data flow, map layers, score panel, Azure deployment, and safe extension routes.</w:t>
       </w:r>
     </w:p>
     <w:p>
@@ -925,7 +925,7 @@
           <w:color w:val="1D2B31"/>
           <w:sz w:val="21"/>
         </w:rPr>
-        <w:t>The important point is that this is not only a one-off mobility dashboard. It is a reusable scaffold for building urban intelligence applications during a four-day hackathon.</w:t>
+        <w:t>Use this app as a mobility dashboard first, then reuse the same structure for other urban intelligence projects.</w:t>
       </w:r>
     </w:p>
     <w:p>
@@ -1018,7 +1018,7 @@
           <w:color w:val="1D2B31"/>
           <w:sz w:val="21"/>
         </w:rPr>
-        <w:t>The current score is intentionally transparent:</w:t>
+        <w:t>The current score uses this simple formula:</w:t>
       </w:r>
     </w:p>
     <w:tbl>
@@ -2295,7 +2295,7 @@
           <w:color w:val="1D2B31"/>
           <w:sz w:val="21"/>
         </w:rPr>
-        <w:t>Use this pitch when presenting the starter kit:</w:t>
+        <w:t>Use this summary when presenting the app:</w:t>
       </w:r>
     </w:p>
     <w:tbl>
@@ -2618,7 +2618,7 @@
           <w:color w:val="1D2B31"/>
           <w:sz w:val="21"/>
         </w:rPr>
-        <w:t>This is not meant to become an enterprise platform during the hackathon. It is a credible deployment-ready starter kit that shows how a city app could move from local demo to pilot conversation.</w:t>
+        <w:t>Use this Azure path to show how the local app can be deployed and extended with cloud services.</w:t>
       </w:r>
     </w:p>
     <w:p>

</xml_diff>

<commit_message>
Polish rebuild guide PDF output
</commit_message>
<xml_diff>
--- a/docs/rebuild_guide.docx
+++ b/docs/rebuild_guide.docx
@@ -19,7 +19,7 @@
         <w:jc w:val="center"/>
       </w:pPr>
       <w:r>
-        <w:t xml:space="preserve">Build and Deployment Guide</w:t>
+        <w:t xml:space="preserve">Build and Deployment Workbook</w:t>
       </w:r>
     </w:p>
     <w:p>
@@ -42,15 +42,15 @@
         <w:t xml:space="preserve">2026-06-03</w:t>
       </w:r>
     </w:p>
-    <w:bookmarkStart w:id="15" w:name="riyadh-mobility-intelligence-starter-kit"/>
-    <w:bookmarkStart w:id="14" w:name="build-and-deployment-guide"/>
+    <w:bookmarkStart w:id="12" w:name="riyadh-mobility-intelligence-starter-kit"/>
+    <w:bookmarkStart w:id="11" w:name="build-and-deployment-workbook"/>
     <w:p>
       <w:pPr>
         <w:pStyle w:val="FirstParagraph"/>
         <w:spacing w:line="259" w:lineRule="auto" w:before="0" w:after="140"/>
       </w:pPr>
       <w:r>
-        <w:t xml:space="preserve">This guide helps hackathon teams rebuild, run, adapt, and deploy the Riyadh Mobility Intelligence starter kit for urban intelligence use cases.</w:t>
+        <w:t xml:space="preserve">This working document helps August hackathon teams rebuild, run, adapt, and deploy the Riyadh Mobility Intelligence starter kit for Riyadh urban development use cases.</w:t>
       </w:r>
     </w:p>
     <w:p>
@@ -198,7 +198,7 @@
           <w:bCs/>
           <w:sz w:val="21"/>
         </w:rPr>
-        <w:t xml:space="preserve">Program links:</w:t>
+        <w:t xml:space="preserve">Resource index:</w:t>
       </w:r>
       <w:r>
         <w:rPr>
@@ -206,66 +206,12 @@
         </w:rPr>
         <w:t xml:space="preserve"> </w:t>
       </w:r>
-      <w:hyperlink r:id="rId11">
-        <w:r>
-          <w:rPr>
-            <w:rStyle w:val="Hyperlink"/>
-          </w:rPr>
-          <w:t xml:space="preserve">atomcamp Arabia</w:t>
-        </w:r>
-      </w:hyperlink>
       <w:r>
         <w:rPr>
           <w:sz w:val="21"/>
         </w:rPr>
-        <w:t xml:space="preserve"> </w:t>
-      </w:r>
-      <w:r>
-        <w:rPr>
-          <w:sz w:val="21"/>
-        </w:rPr>
-        <w:t xml:space="preserve">|</w:t>
-      </w:r>
-      <w:r>
-        <w:rPr>
-          <w:sz w:val="21"/>
-        </w:rPr>
-        <w:t xml:space="preserve"> </w:t>
-      </w:r>
-      <w:hyperlink r:id="rId12">
-        <w:r>
-          <w:rPr>
-            <w:rStyle w:val="Hyperlink"/>
-          </w:rPr>
-          <w:t xml:space="preserve">Azure Developer CLI</w:t>
-        </w:r>
-      </w:hyperlink>
-      <w:r>
-        <w:rPr>
-          <w:sz w:val="21"/>
-        </w:rPr>
-        <w:t xml:space="preserve"> </w:t>
-      </w:r>
-      <w:r>
-        <w:rPr>
-          <w:sz w:val="21"/>
-        </w:rPr>
-        <w:t xml:space="preserve">|</w:t>
-      </w:r>
-      <w:r>
-        <w:rPr>
-          <w:sz w:val="21"/>
-        </w:rPr>
-        <w:t xml:space="preserve"> </w:t>
-      </w:r>
-      <w:hyperlink r:id="rId13">
-        <w:r>
-          <w:rPr>
-            <w:rStyle w:val="Hyperlink"/>
-          </w:rPr>
-          <w:t xml:space="preserve">Azure Maps</w:t>
-        </w:r>
-      </w:hyperlink>
+        <w:t xml:space="preserve">see the appendix for Azure, deployment, and project references.</w:t>
+      </w:r>
     </w:p>
     <w:p>
       <w:pPr>
@@ -297,9 +243,9 @@
         <w:t xml:space="preserve">add approved atomcamp Arabia, Microsoft, Riyadh Urban Intelligence Lab, and strategic partner logos here when final brand assets are available.</w:t>
       </w:r>
     </w:p>
-    <w:bookmarkEnd w:id="14"/>
-    <w:bookmarkEnd w:id="15"/>
-    <w:bookmarkStart w:id="19" w:name="how-to-use-this-guide"/>
+    <w:bookmarkEnd w:id="11"/>
+    <w:bookmarkEnd w:id="12"/>
+    <w:bookmarkStart w:id="16" w:name="how-to-use-this-guide"/>
     <w:p>
       <w:pPr>
         <w:pStyle w:val="Heading1"/>
@@ -316,7 +262,7 @@
         <w:spacing w:line="259" w:lineRule="auto" w:before="0" w:after="140"/>
       </w:pPr>
       <w:r>
-        <w:t xml:space="preserve">This is a build workbook for hackathon builders, mentors, reviewers, and teams adapting the scaffold. It is not a formal transport model or a production planning system. It is a practical starter kit that shows how open mobility data, a simple scoring API, map layers, and Azure services can fit together in a credible prototype.</w:t>
+        <w:t xml:space="preserve">This is a build workbook for hackathon builders, mentors, reviewers, and teams adapting the scaffold during the August hackathon. It is not a formal transport model or a production planning system. It is a practical starter kit that shows how open mobility data, a simple scoring API, map layers, and Azure services can fit together in a credible prototype.</w:t>
       </w:r>
     </w:p>
     <w:p>
@@ -438,18 +384,18 @@
           <wp:inline>
             <wp:extent cx="5334000" cy="1274233"/>
             <wp:effectExtent b="0" l="0" r="0" t="0"/>
-            <wp:docPr descr="App layers" title="" id="17" name="Picture"/>
+            <wp:docPr descr="App layers" title="" id="14" name="Picture"/>
             <a:graphic>
               <a:graphicData uri="http://schemas.openxmlformats.org/drawingml/2006/picture">
                 <pic:pic>
                   <pic:nvPicPr>
-                    <pic:cNvPr descr="docs/assets/rebuild-guide/icon-row-app-layers.png" id="18" name="Picture"/>
+                    <pic:cNvPr descr="docs/assets/rebuild-guide/icon-row-app-layers.png" id="15" name="Picture"/>
                     <pic:cNvPicPr>
                       <a:picLocks noChangeArrowheads="1" noChangeAspect="1"/>
                     </pic:cNvPicPr>
                   </pic:nvPicPr>
                   <pic:blipFill>
-                    <a:blip r:embed="rId16"/>
+                    <a:blip r:embed="rId13"/>
                     <a:stretch>
                       <a:fillRect/>
                     </a:stretch>
@@ -503,8 +449,8 @@
         <w:t xml:space="preserve">Figure: the starter kit is easiest to explain as five layers: backend, data, map, scoring, and cloud-live deployment.</w:t>
       </w:r>
     </w:p>
-    <w:bookmarkEnd w:id="19"/>
-    <w:bookmarkStart w:id="23" w:name="what-you-are-building"/>
+    <w:bookmarkEnd w:id="16"/>
+    <w:bookmarkStart w:id="20" w:name="what-you-are-building"/>
     <w:p>
       <w:pPr>
         <w:pStyle w:val="Heading1"/>
@@ -685,18 +631,18 @@
           <wp:inline>
             <wp:extent cx="5334000" cy="4741333"/>
             <wp:effectExtent b="0" l="0" r="0" t="0"/>
-            <wp:docPr descr="Local dashboard screenshot" title="" id="21" name="Picture"/>
+            <wp:docPr descr="Local dashboard screenshot" title="" id="18" name="Picture"/>
             <a:graphic>
               <a:graphicData uri="http://schemas.openxmlformats.org/drawingml/2006/picture">
                 <pic:pic>
                   <pic:nvPicPr>
-                    <pic:cNvPr descr="docs/assets/rebuild-guide/local-dashboard-overview.png" id="22" name="Picture"/>
+                    <pic:cNvPr descr="docs/assets/rebuild-guide/local-dashboard-overview.png" id="19" name="Picture"/>
                     <pic:cNvPicPr>
                       <a:picLocks noChangeArrowheads="1" noChangeAspect="1"/>
                     </pic:cNvPicPr>
                   </pic:nvPicPr>
                   <pic:blipFill>
-                    <a:blip r:embed="rId20"/>
+                    <a:blip r:embed="rId17"/>
                     <a:stretch>
                       <a:fillRect/>
                     </a:stretch>
@@ -750,8 +696,8 @@
         <w:t xml:space="preserve">Figure: local dashboard running from bundled sample data with metro lines, bus routes, district selector, score panel, and Azure service explainer visible.</w:t>
       </w:r>
     </w:p>
-    <w:bookmarkEnd w:id="23"/>
-    <w:bookmarkStart w:id="27" w:name="urban-challenge-track-mapping"/>
+    <w:bookmarkEnd w:id="20"/>
+    <w:bookmarkStart w:id="24" w:name="urban-challenge-track-mapping"/>
     <w:p>
       <w:pPr>
         <w:pStyle w:val="Heading1"/>
@@ -822,18 +768,18 @@
           <wp:inline>
             <wp:extent cx="5334000" cy="1274233"/>
             <wp:effectExtent b="0" l="0" r="0" t="0"/>
-            <wp:docPr descr="Urban challenge routes" title="" id="25" name="Picture"/>
+            <wp:docPr descr="Urban challenge routes" title="" id="22" name="Picture"/>
             <a:graphic>
               <a:graphicData uri="http://schemas.openxmlformats.org/drawingml/2006/picture">
                 <pic:pic>
                   <pic:nvPicPr>
-                    <pic:cNvPr descr="docs/assets/rebuild-guide/icon-row-tracks.png" id="26" name="Picture"/>
+                    <pic:cNvPr descr="docs/assets/rebuild-guide/icon-row-tracks.png" id="23" name="Picture"/>
                     <pic:cNvPicPr>
                       <a:picLocks noChangeArrowheads="1" noChangeAspect="1"/>
                     </pic:cNvPicPr>
                   </pic:nvPicPr>
                   <pic:blipFill>
-                    <a:blip r:embed="rId24"/>
+                    <a:blip r:embed="rId21"/>
                     <a:stretch>
                       <a:fillRect/>
                     </a:stretch>
@@ -1435,8 +1381,8 @@
         <w:t xml:space="preserve">Build a Riyadh mobility intelligence prototype with public route data, district scoring, Azure Maps, and an Azure-backed live path. Use it directly for Transformational Technology, or extend the same scaffold into Prosperous People, Sustainable Solutions, or Culture use cases.</w:t>
       </w:r>
     </w:p>
-    <w:bookmarkEnd w:id="27"/>
-    <w:bookmarkStart w:id="28" w:name="services-and-tools-map"/>
+    <w:bookmarkEnd w:id="24"/>
+    <w:bookmarkStart w:id="25" w:name="services-and-tools-map"/>
     <w:p>
       <w:pPr>
         <w:pStyle w:val="Heading1"/>
@@ -2598,8 +2544,8 @@
         </w:tc>
       </w:tr>
     </w:tbl>
-    <w:bookmarkEnd w:id="28"/>
-    <w:bookmarkStart w:id="41" w:name="architecture-and-build-path"/>
+    <w:bookmarkEnd w:id="25"/>
+    <w:bookmarkStart w:id="38" w:name="architecture-and-build-path"/>
     <w:p>
       <w:pPr>
         <w:pStyle w:val="Heading1"/>
@@ -2629,7 +2575,7 @@
         <w:t xml:space="preserve">the app must remain useful even when Azure credentials, remote services, or live data are unavailable.</w:t>
       </w:r>
     </w:p>
-    <w:bookmarkStart w:id="32" w:name="local-first-workflow"/>
+    <w:bookmarkStart w:id="29" w:name="local-first-workflow"/>
     <w:p>
       <w:pPr>
         <w:pStyle w:val="Heading2"/>
@@ -2658,18 +2604,18 @@
           <wp:inline>
             <wp:extent cx="5334000" cy="1540933"/>
             <wp:effectExtent b="0" l="0" r="0" t="0"/>
-            <wp:docPr descr="Local-first workflow" title="" id="30" name="Picture"/>
+            <wp:docPr descr="Local-first workflow" title="" id="27" name="Picture"/>
             <a:graphic>
               <a:graphicData uri="http://schemas.openxmlformats.org/drawingml/2006/picture">
                 <pic:pic>
                   <pic:nvPicPr>
-                    <pic:cNvPr descr="docs/assets/rebuild-guide/diagram-local-first.png" id="31" name="Picture"/>
+                    <pic:cNvPr descr="docs/assets/rebuild-guide/diagram-local-first.png" id="28" name="Picture"/>
                     <pic:cNvPicPr>
                       <a:picLocks noChangeArrowheads="1" noChangeAspect="1"/>
                     </pic:cNvPicPr>
                   </pic:nvPicPr>
                   <pic:blipFill>
-                    <a:blip r:embed="rId29"/>
+                    <a:blip r:embed="rId26"/>
                     <a:stretch>
                       <a:fillRect/>
                     </a:stretch>
@@ -2719,8 +2665,8 @@
         <w:t xml:space="preserve">Local mode uses the same UI and API shape that the cloud deployment uses. The difference is the data source: bundled sample files replace cloud-backed records.</w:t>
       </w:r>
     </w:p>
-    <w:bookmarkEnd w:id="32"/>
-    <w:bookmarkStart w:id="36" w:name="azure-backed-workflow"/>
+    <w:bookmarkEnd w:id="29"/>
+    <w:bookmarkStart w:id="33" w:name="azure-backed-workflow"/>
     <w:p>
       <w:pPr>
         <w:pStyle w:val="Heading2"/>
@@ -2749,18 +2695,18 @@
           <wp:inline>
             <wp:extent cx="5334000" cy="1540933"/>
             <wp:effectExtent b="0" l="0" r="0" t="0"/>
-            <wp:docPr descr="Azure-backed workflow" title="" id="34" name="Picture"/>
+            <wp:docPr descr="Azure-backed workflow" title="" id="31" name="Picture"/>
             <a:graphic>
               <a:graphicData uri="http://schemas.openxmlformats.org/drawingml/2006/picture">
                 <pic:pic>
                   <pic:nvPicPr>
-                    <pic:cNvPr descr="docs/assets/rebuild-guide/diagram-azure-backed.png" id="35" name="Picture"/>
+                    <pic:cNvPr descr="docs/assets/rebuild-guide/diagram-azure-backed.png" id="32" name="Picture"/>
                     <pic:cNvPicPr>
                       <a:picLocks noChangeArrowheads="1" noChangeAspect="1"/>
                     </pic:cNvPicPr>
                   </pic:nvPicPr>
                   <pic:blipFill>
-                    <a:blip r:embed="rId33"/>
+                    <a:blip r:embed="rId30"/>
                     <a:stretch>
                       <a:fillRect/>
                     </a:stretch>
@@ -2810,8 +2756,8 @@
         <w:t xml:space="preserve">Use this path when the team is ready to show a credible cloud deployment or run post-deploy smoke tests.</w:t>
       </w:r>
     </w:p>
-    <w:bookmarkEnd w:id="36"/>
-    <w:bookmarkStart w:id="40" w:name="data-fallback-chain"/>
+    <w:bookmarkEnd w:id="33"/>
+    <w:bookmarkStart w:id="37" w:name="data-fallback-chain"/>
     <w:p>
       <w:pPr>
         <w:pStyle w:val="Heading2"/>
@@ -2840,18 +2786,18 @@
           <wp:inline>
             <wp:extent cx="5334000" cy="1540933"/>
             <wp:effectExtent b="0" l="0" r="0" t="0"/>
-            <wp:docPr descr="Data fallback chain" title="" id="38" name="Picture"/>
+            <wp:docPr descr="Data fallback chain" title="" id="35" name="Picture"/>
             <a:graphic>
               <a:graphicData uri="http://schemas.openxmlformats.org/drawingml/2006/picture">
                 <pic:pic>
                   <pic:nvPicPr>
-                    <pic:cNvPr descr="docs/assets/rebuild-guide/diagram-data-fallback.png" id="39" name="Picture"/>
+                    <pic:cNvPr descr="docs/assets/rebuild-guide/diagram-data-fallback.png" id="36" name="Picture"/>
                     <pic:cNvPicPr>
                       <a:picLocks noChangeArrowheads="1" noChangeAspect="1"/>
                     </pic:cNvPicPr>
                   </pic:nvPicPr>
                   <pic:blipFill>
-                    <a:blip r:embed="rId37"/>
+                    <a:blip r:embed="rId34"/>
                     <a:stretch>
                       <a:fillRect/>
                     </a:stretch>
@@ -2913,9 +2859,9 @@
         <w:t xml:space="preserve">, then move to Blob or Cosmos only after the local app is working.</w:t>
       </w:r>
     </w:p>
-    <w:bookmarkEnd w:id="40"/>
-    <w:bookmarkEnd w:id="41"/>
-    <w:bookmarkStart w:id="43" w:name="project-structure"/>
+    <w:bookmarkEnd w:id="37"/>
+    <w:bookmarkEnd w:id="38"/>
+    <w:bookmarkStart w:id="40" w:name="project-structure"/>
     <w:p>
       <w:pPr>
         <w:pStyle w:val="Heading1"/>
@@ -3890,7 +3836,7 @@
         </w:tc>
       </w:tr>
     </w:tbl>
-    <w:bookmarkStart w:id="42" w:name="where-the-data-comes-from"/>
+    <w:bookmarkStart w:id="39" w:name="where-the-data-comes-from"/>
     <w:p>
       <w:pPr>
         <w:pStyle w:val="Heading2"/>
@@ -4461,9 +4407,9 @@
         <w:t xml:space="preserve"># optional cloud step</w:t>
       </w:r>
     </w:p>
-    <w:bookmarkEnd w:id="42"/>
-    <w:bookmarkEnd w:id="43"/>
-    <w:bookmarkStart w:id="49" w:name="run-locally"/>
+    <w:bookmarkEnd w:id="39"/>
+    <w:bookmarkEnd w:id="40"/>
+    <w:bookmarkStart w:id="46" w:name="run-locally"/>
     <w:p>
       <w:pPr>
         <w:pStyle w:val="Heading1"/>
@@ -4483,7 +4429,7 @@
         <w:t xml:space="preserve">Local setup is deliberately direct. The goal is to get one useful screen running before adding cloud services.</w:t>
       </w:r>
     </w:p>
-    <w:bookmarkStart w:id="47" w:name="play-by-play"/>
+    <w:bookmarkStart w:id="44" w:name="play-by-play"/>
     <w:p>
       <w:pPr>
         <w:pStyle w:val="Heading2"/>
@@ -4737,18 +4683,18 @@
           <wp:inline>
             <wp:extent cx="5334000" cy="3669145"/>
             <wp:effectExtent b="0" l="0" r="0" t="0"/>
-            <wp:docPr descr="Map layers screenshot" title="" id="45" name="Picture"/>
+            <wp:docPr descr="Map layers screenshot" title="" id="42" name="Picture"/>
             <a:graphic>
               <a:graphicData uri="http://schemas.openxmlformats.org/drawingml/2006/picture">
                 <pic:pic>
                   <pic:nvPicPr>
-                    <pic:cNvPr descr="docs/assets/rebuild-guide/map-layers.png" id="46" name="Picture"/>
+                    <pic:cNvPr descr="docs/assets/rebuild-guide/map-layers.png" id="43" name="Picture"/>
                     <pic:cNvPicPr>
                       <a:picLocks noChangeArrowheads="1" noChangeAspect="1"/>
                     </pic:cNvPicPr>
                   </pic:nvPicPr>
                   <pic:blipFill>
-                    <a:blip r:embed="rId44"/>
+                    <a:blip r:embed="rId41"/>
                     <a:stretch>
                       <a:fillRect/>
                     </a:stretch>
@@ -4802,8 +4748,8 @@
         <w:t xml:space="preserve">Figure: metro and bus layers rendered locally with OpenStreetMap fallback tiles.</w:t>
       </w:r>
     </w:p>
-    <w:bookmarkEnd w:id="47"/>
-    <w:bookmarkStart w:id="48" w:name="local-verification-checklist"/>
+    <w:bookmarkEnd w:id="44"/>
+    <w:bookmarkStart w:id="45" w:name="local-verification-checklist"/>
     <w:p>
       <w:pPr>
         <w:pStyle w:val="Heading2"/>
@@ -5090,9 +5036,9 @@
         <w:t xml:space="preserve"> scripts/validate_data.py</w:t>
       </w:r>
     </w:p>
-    <w:bookmarkEnd w:id="48"/>
-    <w:bookmarkEnd w:id="49"/>
-    <w:bookmarkStart w:id="57" w:name="backend-walkthrough"/>
+    <w:bookmarkEnd w:id="45"/>
+    <w:bookmarkEnd w:id="46"/>
+    <w:bookmarkStart w:id="54" w:name="backend-walkthrough"/>
     <w:p>
       <w:pPr>
         <w:pStyle w:val="Heading1"/>
@@ -5928,18 +5874,18 @@
           <wp:inline>
             <wp:extent cx="5334000" cy="2927032"/>
             <wp:effectExtent b="0" l="0" r="0" t="0"/>
-            <wp:docPr descr="API data status screenshot" title="" id="51" name="Picture"/>
+            <wp:docPr descr="API data status screenshot" title="" id="48" name="Picture"/>
             <a:graphic>
               <a:graphicData uri="http://schemas.openxmlformats.org/drawingml/2006/picture">
                 <pic:pic>
                   <pic:nvPicPr>
-                    <pic:cNvPr descr="docs/assets/rebuild-guide/api-data-status.png" id="52" name="Picture"/>
+                    <pic:cNvPr descr="docs/assets/rebuild-guide/api-data-status.png" id="49" name="Picture"/>
                     <pic:cNvPicPr>
                       <a:picLocks noChangeArrowheads="1" noChangeAspect="1"/>
                     </pic:cNvPicPr>
                   </pic:nvPicPr>
                   <pic:blipFill>
-                    <a:blip r:embed="rId50"/>
+                    <a:blip r:embed="rId47"/>
                     <a:stretch>
                       <a:fillRect/>
                     </a:stretch>
@@ -6022,7 +5968,7 @@
         <w:t xml:space="preserve">confirms sample mode and explains the fallback path.</w:t>
       </w:r>
     </w:p>
-    <w:bookmarkStart w:id="56" w:name="score-request-flow"/>
+    <w:bookmarkStart w:id="53" w:name="score-request-flow"/>
     <w:p>
       <w:pPr>
         <w:pStyle w:val="Heading2"/>
@@ -6042,18 +5988,18 @@
           <wp:inline>
             <wp:extent cx="5334000" cy="1540933"/>
             <wp:effectExtent b="0" l="0" r="0" t="0"/>
-            <wp:docPr descr="Score request flow" title="" id="54" name="Picture"/>
+            <wp:docPr descr="Score request flow" title="" id="51" name="Picture"/>
             <a:graphic>
               <a:graphicData uri="http://schemas.openxmlformats.org/drawingml/2006/picture">
                 <pic:pic>
                   <pic:nvPicPr>
-                    <pic:cNvPr descr="docs/assets/rebuild-guide/diagram-score-request.png" id="55" name="Picture"/>
+                    <pic:cNvPr descr="docs/assets/rebuild-guide/diagram-score-request.png" id="52" name="Picture"/>
                     <pic:cNvPicPr>
                       <a:picLocks noChangeArrowheads="1" noChangeAspect="1"/>
                     </pic:cNvPicPr>
                   </pic:nvPicPr>
                   <pic:blipFill>
-                    <a:blip r:embed="rId53"/>
+                    <a:blip r:embed="rId50"/>
                     <a:stretch>
                       <a:fillRect/>
                     </a:stretch>
@@ -6124,9 +6070,9 @@
         <w:t xml:space="preserve">Keep this formula easy to explain. Teams can later replace the weights or add new inputs such as parking, walkability, public services, heat, or event density.</w:t>
       </w:r>
     </w:p>
-    <w:bookmarkEnd w:id="56"/>
-    <w:bookmarkEnd w:id="57"/>
-    <w:bookmarkStart w:id="64" w:name="frontend-walkthrough"/>
+    <w:bookmarkEnd w:id="53"/>
+    <w:bookmarkEnd w:id="54"/>
+    <w:bookmarkStart w:id="61" w:name="frontend-walkthrough"/>
     <w:p>
       <w:pPr>
         <w:pStyle w:val="Heading1"/>
@@ -7085,18 +7031,18 @@
           <wp:inline>
             <wp:extent cx="5334000" cy="600757"/>
             <wp:effectExtent b="0" l="0" r="0" t="0"/>
-            <wp:docPr descr="District selector screenshot" title="" id="59" name="Picture"/>
+            <wp:docPr descr="District selector screenshot" title="" id="56" name="Picture"/>
             <a:graphic>
               <a:graphicData uri="http://schemas.openxmlformats.org/drawingml/2006/picture">
                 <pic:pic>
                   <pic:nvPicPr>
-                    <pic:cNvPr descr="docs/assets/rebuild-guide/district-selector.png" id="60" name="Picture"/>
+                    <pic:cNvPr descr="docs/assets/rebuild-guide/district-selector.png" id="57" name="Picture"/>
                     <pic:cNvPicPr>
                       <a:picLocks noChangeArrowheads="1" noChangeAspect="1"/>
                     </pic:cNvPicPr>
                   </pic:nvPicPr>
                   <pic:blipFill>
-                    <a:blip r:embed="rId58"/>
+                    <a:blip r:embed="rId55"/>
                     <a:stretch>
                       <a:fillRect/>
                     </a:stretch>
@@ -7260,18 +7206,18 @@
           <wp:inline>
             <wp:extent cx="5334000" cy="4533900"/>
             <wp:effectExtent b="0" l="0" r="0" t="0"/>
-            <wp:docPr descr="District score panel screenshot" title="" id="62" name="Picture"/>
+            <wp:docPr descr="District score panel screenshot" title="" id="59" name="Picture"/>
             <a:graphic>
               <a:graphicData uri="http://schemas.openxmlformats.org/drawingml/2006/picture">
                 <pic:pic>
                   <pic:nvPicPr>
-                    <pic:cNvPr descr="docs/assets/rebuild-guide/district-score-panel.png" id="63" name="Picture"/>
+                    <pic:cNvPr descr="docs/assets/rebuild-guide/district-score-panel.png" id="60" name="Picture"/>
                     <pic:cNvPicPr>
                       <a:picLocks noChangeArrowheads="1" noChangeAspect="1"/>
                     </pic:cNvPicPr>
                   </pic:nvPicPr>
                   <pic:blipFill>
-                    <a:blip r:embed="rId61"/>
+                    <a:blip r:embed="rId58"/>
                     <a:stretch>
                       <a:fillRect/>
                     </a:stretch>
@@ -7325,8 +7271,8 @@
         <w:t xml:space="preserve">Figure: district score panel after selecting a Riyadh district.</w:t>
       </w:r>
     </w:p>
-    <w:bookmarkEnd w:id="64"/>
-    <w:bookmarkStart w:id="67" w:name="cloud-live-deployment"/>
+    <w:bookmarkEnd w:id="61"/>
+    <w:bookmarkStart w:id="64" w:name="cloud-live-deployment"/>
     <w:p>
       <w:pPr>
         <w:pStyle w:val="Heading1"/>
@@ -7346,7 +7292,7 @@
         <w:t xml:space="preserve">The cloud-live path is the deployable version of the same starter kit. It is useful when a team needs to show that the app can move beyond a laptop and into a credible Azure environment.</w:t>
       </w:r>
     </w:p>
-    <w:bookmarkStart w:id="65" w:name="prerequisites"/>
+    <w:bookmarkStart w:id="62" w:name="prerequisites"/>
     <w:p>
       <w:pPr>
         <w:pStyle w:val="Heading2"/>
@@ -7563,8 +7509,8 @@
         <w:t xml:space="preserve">The helper prints active environment values, then runs the Azure Developer CLI deployment workflow.</w:t>
       </w:r>
     </w:p>
-    <w:bookmarkEnd w:id="65"/>
-    <w:bookmarkStart w:id="66" w:name="what-deployment-creates"/>
+    <w:bookmarkEnd w:id="62"/>
+    <w:bookmarkStart w:id="63" w:name="what-deployment-creates"/>
     <w:p>
       <w:pPr>
         <w:pStyle w:val="Heading2"/>
@@ -8293,9 +8239,9 @@
         <w:t xml:space="preserve">.</w:t>
       </w:r>
     </w:p>
-    <w:bookmarkEnd w:id="66"/>
-    <w:bookmarkEnd w:id="67"/>
-    <w:bookmarkStart w:id="72" w:name="starter-kit-adaptation-routes"/>
+    <w:bookmarkEnd w:id="63"/>
+    <w:bookmarkEnd w:id="64"/>
+    <w:bookmarkStart w:id="69" w:name="starter-kit-adaptation-routes"/>
     <w:p>
       <w:pPr>
         <w:pStyle w:val="Heading1"/>
@@ -8315,7 +8261,7 @@
         <w:t xml:space="preserve">Treat this codebase as a scaffold. Teams should keep the working shell, replace the domain data, and adapt the score or map layers toward the track they are pursuing.</w:t>
       </w:r>
     </w:p>
-    <w:bookmarkStart w:id="68" w:name="route-1-mobility-command-view"/>
+    <w:bookmarkStart w:id="65" w:name="route-1-mobility-command-view"/>
     <w:p>
       <w:pPr>
         <w:pStyle w:val="Heading2"/>
@@ -8478,8 +8424,8 @@
         <w:t xml:space="preserve">Likely Azure services: Azure Maps, Container Apps, Event Hubs, Stream Analytics, Cosmos DB, Application Insights.</w:t>
       </w:r>
     </w:p>
-    <w:bookmarkEnd w:id="68"/>
-    <w:bookmarkStart w:id="69" w:name="route-2-district-intelligence"/>
+    <w:bookmarkEnd w:id="65"/>
+    <w:bookmarkStart w:id="66" w:name="route-2-district-intelligence"/>
     <w:p>
       <w:pPr>
         <w:pStyle w:val="Heading2"/>
@@ -8629,8 +8575,8 @@
         <w:t xml:space="preserve">Likely Azure services: Azure Maps, Blob Storage, Cosmos DB, Container Apps, optional Azure OpenAI for plain-language score explanations.</w:t>
       </w:r>
     </w:p>
-    <w:bookmarkEnd w:id="69"/>
-    <w:bookmarkStart w:id="70" w:name="route-3-sustainable-mobility-overlay"/>
+    <w:bookmarkEnd w:id="66"/>
+    <w:bookmarkStart w:id="67" w:name="route-3-sustainable-mobility-overlay"/>
     <w:p>
       <w:pPr>
         <w:pStyle w:val="Heading2"/>
@@ -8793,8 +8739,8 @@
         <w:t xml:space="preserve">Likely Azure services: Azure Maps, Blob Storage, Cosmos DB, Power BI, Application Insights.</w:t>
       </w:r>
     </w:p>
-    <w:bookmarkEnd w:id="70"/>
-    <w:bookmarkStart w:id="71" w:name="route-4-culture-and-visitor-movement"/>
+    <w:bookmarkEnd w:id="67"/>
+    <w:bookmarkStart w:id="68" w:name="route-4-culture-and-visitor-movement"/>
     <w:p>
       <w:pPr>
         <w:pStyle w:val="Heading2"/>
@@ -8944,9 +8890,9 @@
         <w:t xml:space="preserve">Likely Azure services: Azure Maps, Cosmos DB, Blob Storage, Container Apps, optional translation services.</w:t>
       </w:r>
     </w:p>
-    <w:bookmarkEnd w:id="71"/>
-    <w:bookmarkEnd w:id="72"/>
-    <w:bookmarkStart w:id="73" w:name="demo-flow"/>
+    <w:bookmarkEnd w:id="68"/>
+    <w:bookmarkEnd w:id="69"/>
+    <w:bookmarkStart w:id="70" w:name="demo-flow"/>
     <w:p>
       <w:pPr>
         <w:pStyle w:val="Heading1"/>
@@ -9656,8 +9602,8 @@
         <w:t xml:space="preserve">checks.</w:t>
       </w:r>
     </w:p>
-    <w:bookmarkEnd w:id="73"/>
-    <w:bookmarkStart w:id="79" w:name="appendix"/>
+    <w:bookmarkEnd w:id="70"/>
+    <w:bookmarkStart w:id="82" w:name="appendix"/>
     <w:p>
       <w:pPr>
         <w:pStyle w:val="Heading1"/>
@@ -9668,7 +9614,7 @@
         <w:t xml:space="preserve">Appendix</w:t>
       </w:r>
     </w:p>
-    <w:bookmarkStart w:id="74" w:name="common-commands"/>
+    <w:bookmarkStart w:id="71" w:name="common-commands"/>
     <w:p>
       <w:pPr>
         <w:pStyle w:val="Heading2"/>
@@ -9876,8 +9822,8 @@
         <w:t xml:space="preserve">--yes</w:t>
       </w:r>
     </w:p>
-    <w:bookmarkEnd w:id="74"/>
-    <w:bookmarkStart w:id="75" w:name="debugging-checklist"/>
+    <w:bookmarkEnd w:id="71"/>
+    <w:bookmarkStart w:id="72" w:name="debugging-checklist"/>
     <w:p>
       <w:pPr>
         <w:pStyle w:val="Heading2"/>
@@ -10033,8 +9979,8 @@
         <w:t xml:space="preserve">, Container App logs, and Application Insights.</w:t>
       </w:r>
     </w:p>
-    <w:bookmarkEnd w:id="75"/>
-    <w:bookmarkStart w:id="76" w:name="visual-asset-checklist"/>
+    <w:bookmarkEnd w:id="72"/>
+    <w:bookmarkStart w:id="73" w:name="visual-asset-checklist"/>
     <w:p>
       <w:pPr>
         <w:pStyle w:val="Heading2"/>
@@ -10701,15 +10647,24 @@
         </w:tc>
       </w:tr>
     </w:tbl>
-    <w:bookmarkEnd w:id="76"/>
-    <w:bookmarkStart w:id="77" w:name="reference-links"/>
+    <w:bookmarkEnd w:id="73"/>
+    <w:bookmarkStart w:id="80" w:name="resource-index"/>
     <w:p>
       <w:pPr>
         <w:pStyle w:val="Heading2"/>
         <w:spacing w:line="259" w:lineRule="auto" w:before="240" w:after="100"/>
       </w:pPr>
       <w:r>
-        <w:t xml:space="preserve">Reference Links</w:t>
+        <w:t xml:space="preserve">Resource Index</w:t>
+      </w:r>
+    </w:p>
+    <w:p>
+      <w:pPr>
+        <w:pStyle w:val="FirstParagraph"/>
+        <w:spacing w:line="259" w:lineRule="auto" w:before="0" w:after="140"/>
+      </w:pPr>
+      <w:r>
+        <w:t xml:space="preserve">Use this page as the resource hub instead of repeating links in the footer. Keep the cover page focused on the repo, local app, and deployed app URL; keep this appendix focused on build, deployment, and Azure references.</w:t>
       </w:r>
     </w:p>
     <w:tbl>
@@ -10933,7 +10888,7 @@
               <w:pStyle w:val="Compact"/>
               <w:spacing w:after="40"/>
             </w:pPr>
-            <w:hyperlink r:id="rId11">
+            <w:hyperlink r:id="rId74">
               <w:r>
                 <w:rPr>
                   <w:rStyle w:val="Hyperlink"/>
@@ -10986,7 +10941,7 @@
               <w:pStyle w:val="Compact"/>
               <w:spacing w:after="40"/>
             </w:pPr>
-            <w:hyperlink r:id="rId12">
+            <w:hyperlink r:id="rId75">
               <w:r>
                 <w:rPr>
                   <w:rStyle w:val="Hyperlink"/>
@@ -11016,10 +10971,25 @@
             </w:pPr>
             <w:r>
               <w:rPr>
-                <w:rFonts w:ascii="Aptos" w:hAnsi="Aptos"/>
-                <w:sz w:val="19"/>
-              </w:rPr>
-              <w:t xml:space="preserve">Azure Maps docs</w:t>
+                <w:rStyle w:val="VerbatimChar"/>
+                <w:rFonts w:ascii="Aptos" w:hAnsi="Aptos"/>
+                <w:sz w:val="19"/>
+              </w:rPr>
+              <w:t xml:space="preserve">azd up</w:t>
+            </w:r>
+            <w:r>
+              <w:rPr>
+                <w:rFonts w:ascii="Aptos" w:hAnsi="Aptos"/>
+                <w:sz w:val="19"/>
+              </w:rPr>
+              <w:t xml:space="preserve"> </w:t>
+            </w:r>
+            <w:r>
+              <w:rPr>
+                <w:rFonts w:ascii="Aptos" w:hAnsi="Aptos"/>
+                <w:sz w:val="19"/>
+              </w:rPr>
+              <w:t xml:space="preserve">workflow</w:t>
             </w:r>
           </w:p>
         </w:tc>
@@ -11039,7 +11009,7 @@
               <w:pStyle w:val="Compact"/>
               <w:spacing w:after="40"/>
             </w:pPr>
-            <w:hyperlink r:id="rId13">
+            <w:hyperlink r:id="rId76">
               <w:r>
                 <w:rPr>
                   <w:rStyle w:val="Hyperlink"/>
@@ -11072,7 +11042,7 @@
                 <w:rFonts w:ascii="Aptos" w:hAnsi="Aptos"/>
                 <w:sz w:val="19"/>
               </w:rPr>
-              <w:t xml:space="preserve">Student quickstart</w:t>
+              <w:t xml:space="preserve">Azure Container Apps docs</w:t>
             </w:r>
           </w:p>
         </w:tc>
@@ -11092,14 +11062,14 @@
               <w:pStyle w:val="Compact"/>
               <w:spacing w:after="40"/>
             </w:pPr>
-            <w:r>
-              <w:rPr>
-                <w:rStyle w:val="VerbatimChar"/>
-                <w:rFonts w:ascii="Aptos" w:hAnsi="Aptos"/>
-                <w:sz w:val="19"/>
-              </w:rPr>
-              <w:t xml:space="preserve">README.md</w:t>
-            </w:r>
+            <w:hyperlink r:id="rId77">
+              <w:r>
+                <w:rPr>
+                  <w:rStyle w:val="Hyperlink"/>
+                </w:rPr>
+                <w:t xml:space="preserve">Microsoft Learn</w:t>
+              </w:r>
+            </w:hyperlink>
           </w:p>
         </w:tc>
       </w:tr>
@@ -11125,7 +11095,7 @@
                 <w:rFonts w:ascii="Aptos" w:hAnsi="Aptos"/>
                 <w:sz w:val="19"/>
               </w:rPr>
-              <w:t xml:space="preserve">Architecture notes</w:t>
+              <w:t xml:space="preserve">Azure Maps docs</w:t>
             </w:r>
           </w:p>
         </w:tc>
@@ -11145,14 +11115,14 @@
               <w:pStyle w:val="Compact"/>
               <w:spacing w:after="40"/>
             </w:pPr>
-            <w:r>
-              <w:rPr>
-                <w:rStyle w:val="VerbatimChar"/>
-                <w:rFonts w:ascii="Aptos" w:hAnsi="Aptos"/>
-                <w:sz w:val="19"/>
-              </w:rPr>
-              <w:t xml:space="preserve">docs/architecture.md</w:t>
-            </w:r>
+            <w:hyperlink r:id="rId78">
+              <w:r>
+                <w:rPr>
+                  <w:rStyle w:val="Hyperlink"/>
+                </w:rPr>
+                <w:t xml:space="preserve">Microsoft Learn</w:t>
+              </w:r>
+            </w:hyperlink>
           </w:p>
         </w:tc>
       </w:tr>
@@ -11178,7 +11148,7 @@
                 <w:rFonts w:ascii="Aptos" w:hAnsi="Aptos"/>
                 <w:sz w:val="19"/>
               </w:rPr>
-              <w:t xml:space="preserve">Azure deployment notes</w:t>
+              <w:t xml:space="preserve">Azure Cosmos DB docs</w:t>
             </w:r>
           </w:p>
         </w:tc>
@@ -11198,14 +11168,14 @@
               <w:pStyle w:val="Compact"/>
               <w:spacing w:after="40"/>
             </w:pPr>
-            <w:r>
-              <w:rPr>
-                <w:rStyle w:val="VerbatimChar"/>
-                <w:rFonts w:ascii="Aptos" w:hAnsi="Aptos"/>
-                <w:sz w:val="19"/>
-              </w:rPr>
-              <w:t xml:space="preserve">docs/azure_deployment.md</w:t>
-            </w:r>
+            <w:hyperlink r:id="rId79">
+              <w:r>
+                <w:rPr>
+                  <w:rStyle w:val="Hyperlink"/>
+                </w:rPr>
+                <w:t xml:space="preserve">Microsoft Learn</w:t>
+              </w:r>
+            </w:hyperlink>
           </w:p>
         </w:tc>
       </w:tr>
@@ -11231,7 +11201,7 @@
                 <w:rFonts w:ascii="Aptos" w:hAnsi="Aptos"/>
                 <w:sz w:val="19"/>
               </w:rPr>
-              <w:t xml:space="preserve">Data source notes</w:t>
+              <w:t xml:space="preserve">Student quickstart</w:t>
             </w:r>
           </w:p>
         </w:tc>
@@ -11257,7 +11227,7 @@
                 <w:rFonts w:ascii="Aptos" w:hAnsi="Aptos"/>
                 <w:sz w:val="19"/>
               </w:rPr>
-              <w:t xml:space="preserve">docs/data_sources.md</w:t>
+              <w:t xml:space="preserve">README.md</w:t>
             </w:r>
           </w:p>
         </w:tc>
@@ -11284,7 +11254,7 @@
                 <w:rFonts w:ascii="Aptos" w:hAnsi="Aptos"/>
                 <w:sz w:val="19"/>
               </w:rPr>
-              <w:t xml:space="preserve">Troubleshooting</w:t>
+              <w:t xml:space="preserve">Architecture notes</w:t>
             </w:r>
           </w:p>
         </w:tc>
@@ -11310,7 +11280,7 @@
                 <w:rFonts w:ascii="Aptos" w:hAnsi="Aptos"/>
                 <w:sz w:val="19"/>
               </w:rPr>
-              <w:t xml:space="preserve">docs/troubleshooting.md</w:t>
+              <w:t xml:space="preserve">docs/architecture.md</w:t>
             </w:r>
           </w:p>
         </w:tc>
@@ -11337,6 +11307,165 @@
                 <w:rFonts w:ascii="Aptos" w:hAnsi="Aptos"/>
                 <w:sz w:val="19"/>
               </w:rPr>
+              <w:t xml:space="preserve">Azure deployment notes</w:t>
+            </w:r>
+          </w:p>
+        </w:tc>
+        <w:tc>
+          <w:tcPr>
+            <w:tcW w:type="dxa" w:w="6696"/>
+            <w:vAlign w:val="center"/>
+            <w:tcMar>
+              <w:top w:w="90" w:type="dxa"/>
+              <w:start w:w="120" w:type="dxa"/>
+              <w:bottom w:w="90" w:type="dxa"/>
+              <w:end w:w="120" w:type="dxa"/>
+            </w:tcMar>
+          </w:tcPr>
+          <w:p>
+            <w:pPr>
+              <w:pStyle w:val="Compact"/>
+              <w:spacing w:after="40"/>
+            </w:pPr>
+            <w:r>
+              <w:rPr>
+                <w:rStyle w:val="VerbatimChar"/>
+                <w:rFonts w:ascii="Aptos" w:hAnsi="Aptos"/>
+                <w:sz w:val="19"/>
+              </w:rPr>
+              <w:t xml:space="preserve">docs/azure_deployment.md</w:t>
+            </w:r>
+          </w:p>
+        </w:tc>
+      </w:tr>
+      <w:tr>
+        <w:tc>
+          <w:tcPr>
+            <w:tcW w:type="dxa" w:w="2952"/>
+            <w:vAlign w:val="center"/>
+            <w:tcMar>
+              <w:top w:w="90" w:type="dxa"/>
+              <w:start w:w="120" w:type="dxa"/>
+              <w:bottom w:w="90" w:type="dxa"/>
+              <w:end w:w="120" w:type="dxa"/>
+            </w:tcMar>
+          </w:tcPr>
+          <w:p>
+            <w:pPr>
+              <w:pStyle w:val="Compact"/>
+              <w:spacing w:after="40"/>
+            </w:pPr>
+            <w:r>
+              <w:rPr>
+                <w:rFonts w:ascii="Aptos" w:hAnsi="Aptos"/>
+                <w:sz w:val="19"/>
+              </w:rPr>
+              <w:t xml:space="preserve">Data source notes</w:t>
+            </w:r>
+          </w:p>
+        </w:tc>
+        <w:tc>
+          <w:tcPr>
+            <w:tcW w:type="dxa" w:w="6696"/>
+            <w:vAlign w:val="center"/>
+            <w:tcMar>
+              <w:top w:w="90" w:type="dxa"/>
+              <w:start w:w="120" w:type="dxa"/>
+              <w:bottom w:w="90" w:type="dxa"/>
+              <w:end w:w="120" w:type="dxa"/>
+            </w:tcMar>
+          </w:tcPr>
+          <w:p>
+            <w:pPr>
+              <w:pStyle w:val="Compact"/>
+              <w:spacing w:after="40"/>
+            </w:pPr>
+            <w:r>
+              <w:rPr>
+                <w:rStyle w:val="VerbatimChar"/>
+                <w:rFonts w:ascii="Aptos" w:hAnsi="Aptos"/>
+                <w:sz w:val="19"/>
+              </w:rPr>
+              <w:t xml:space="preserve">docs/data_sources.md</w:t>
+            </w:r>
+          </w:p>
+        </w:tc>
+      </w:tr>
+      <w:tr>
+        <w:tc>
+          <w:tcPr>
+            <w:tcW w:type="dxa" w:w="2952"/>
+            <w:vAlign w:val="center"/>
+            <w:tcMar>
+              <w:top w:w="90" w:type="dxa"/>
+              <w:start w:w="120" w:type="dxa"/>
+              <w:bottom w:w="90" w:type="dxa"/>
+              <w:end w:w="120" w:type="dxa"/>
+            </w:tcMar>
+          </w:tcPr>
+          <w:p>
+            <w:pPr>
+              <w:pStyle w:val="Compact"/>
+              <w:spacing w:after="40"/>
+            </w:pPr>
+            <w:r>
+              <w:rPr>
+                <w:rFonts w:ascii="Aptos" w:hAnsi="Aptos"/>
+                <w:sz w:val="19"/>
+              </w:rPr>
+              <w:t xml:space="preserve">Troubleshooting</w:t>
+            </w:r>
+          </w:p>
+        </w:tc>
+        <w:tc>
+          <w:tcPr>
+            <w:tcW w:type="dxa" w:w="6696"/>
+            <w:vAlign w:val="center"/>
+            <w:tcMar>
+              <w:top w:w="90" w:type="dxa"/>
+              <w:start w:w="120" w:type="dxa"/>
+              <w:bottom w:w="90" w:type="dxa"/>
+              <w:end w:w="120" w:type="dxa"/>
+            </w:tcMar>
+          </w:tcPr>
+          <w:p>
+            <w:pPr>
+              <w:pStyle w:val="Compact"/>
+              <w:spacing w:after="40"/>
+            </w:pPr>
+            <w:r>
+              <w:rPr>
+                <w:rStyle w:val="VerbatimChar"/>
+                <w:rFonts w:ascii="Aptos" w:hAnsi="Aptos"/>
+                <w:sz w:val="19"/>
+              </w:rPr>
+              <w:t xml:space="preserve">docs/troubleshooting.md</w:t>
+            </w:r>
+          </w:p>
+        </w:tc>
+      </w:tr>
+      <w:tr>
+        <w:tc>
+          <w:tcPr>
+            <w:tcW w:type="dxa" w:w="2952"/>
+            <w:vAlign w:val="center"/>
+            <w:tcMar>
+              <w:top w:w="90" w:type="dxa"/>
+              <w:start w:w="120" w:type="dxa"/>
+              <w:bottom w:w="90" w:type="dxa"/>
+              <w:end w:w="120" w:type="dxa"/>
+            </w:tcMar>
+          </w:tcPr>
+          <w:p>
+            <w:pPr>
+              <w:pStyle w:val="Compact"/>
+              <w:spacing w:after="40"/>
+            </w:pPr>
+            <w:r>
+              <w:rPr>
+                <w:rFonts w:ascii="Aptos" w:hAnsi="Aptos"/>
+                <w:sz w:val="19"/>
+              </w:rPr>
               <w:t xml:space="preserve">Demo script</w:t>
             </w:r>
           </w:p>
@@ -11369,8 +11498,8 @@
         </w:tc>
       </w:tr>
     </w:tbl>
-    <w:bookmarkEnd w:id="77"/>
-    <w:bookmarkStart w:id="78" w:name="glossary"/>
+    <w:bookmarkEnd w:id="80"/>
+    <w:bookmarkStart w:id="81" w:name="glossary"/>
     <w:p>
       <w:pPr>
         <w:pStyle w:val="Heading2"/>
@@ -11532,9 +11661,9 @@
         <w:t xml:space="preserve">The current frontend shape: one main web page that loads data and updates panels dynamically.</w:t>
       </w:r>
     </w:p>
-    <w:bookmarkEnd w:id="78"/>
-    <w:bookmarkEnd w:id="79"/>
-    <w:bookmarkStart w:id="80" w:name="closing-note"/>
+    <w:bookmarkEnd w:id="81"/>
+    <w:bookmarkEnd w:id="82"/>
+    <w:bookmarkStart w:id="83" w:name="closing-note"/>
     <w:p>
       <w:pPr>
         <w:pStyle w:val="Heading1"/>
@@ -11554,9 +11683,9 @@
         <w:t xml:space="preserve">The starter kit is strongest when it stays practical: one useful local screen, clear route layers, transparent scoring, and a cloud-live path that is credible without becoming heavy. Build the smallest version that can be explained well, then extend it toward the hackathon track that matters most.</w:t>
       </w:r>
     </w:p>
-    <w:bookmarkEnd w:id="80"/>
+    <w:bookmarkEnd w:id="83"/>
     <w:sectPr>
-      <w:footerReference w:type="default" r:id="rId14"/>
+      <w:footerReference w:type="default" r:id="rId11"/>
       <w:footnotePr>
         <w:numRestart w:val="eachSect"/>
       </w:footnotePr>
@@ -11583,7 +11712,7 @@
         <w:color w:val="64748B"/>
         <w:sz w:val="16"/>
       </w:rPr>
-      <w:t xml:space="preserve">Riyadh Mobility Starter Kit | GitHub: Esturban/microsoft-hackathon-riyadh-mobility | Page </w:t>
+      <w:t xml:space="preserve">Riyadh Mobility Intelligence Starter Kit | August Hackathon Working Document | Page </w:t>
     </w:r>
     <w:r>
       <w:rPr>

</xml_diff>

<commit_message>
Add premium workbook cover polish
</commit_message>
<xml_diff>
--- a/docs/rebuild_guide.docx
+++ b/docs/rebuild_guide.docx
@@ -5,7 +5,7 @@
     <w:p>
       <w:pPr>
         <w:pStyle w:val="Title"/>
-        <w:spacing w:line="259" w:lineRule="auto" w:before="0" w:after="240"/>
+        <w:spacing w:line="259" w:lineRule="auto" w:before="0" w:after="200"/>
         <w:jc w:val="center"/>
       </w:pPr>
       <w:r>
@@ -15,7 +15,7 @@
     <w:p>
       <w:pPr>
         <w:pStyle w:val="Subtitle"/>
-        <w:spacing w:line="259" w:lineRule="auto" w:before="0" w:after="160"/>
+        <w:spacing w:line="259" w:lineRule="auto" w:before="0" w:after="140"/>
         <w:jc w:val="center"/>
       </w:pPr>
       <w:r>
@@ -25,7 +25,7 @@
     <w:p>
       <w:pPr>
         <w:pStyle w:val="Author"/>
-        <w:spacing w:line="259" w:lineRule="auto" w:before="0" w:after="160"/>
+        <w:spacing w:line="259" w:lineRule="auto" w:before="0" w:after="140"/>
         <w:jc w:val="center"/>
       </w:pPr>
       <w:r>
@@ -35,15 +35,15 @@
     <w:p>
       <w:pPr>
         <w:pStyle w:val="Date"/>
-        <w:spacing w:line="259" w:lineRule="auto" w:before="0" w:after="160"/>
+        <w:spacing w:line="259" w:lineRule="auto" w:before="0" w:after="140"/>
         <w:jc w:val="center"/>
       </w:pPr>
       <w:r>
         <w:t xml:space="preserve">2026-06-03</w:t>
       </w:r>
     </w:p>
-    <w:bookmarkStart w:id="12" w:name="riyadh-mobility-intelligence-starter-kit"/>
-    <w:bookmarkStart w:id="11" w:name="build-and-deployment-workbook"/>
+    <w:bookmarkStart w:id="15" w:name="riyadh-mobility-intelligence-starter-kit"/>
+    <w:bookmarkStart w:id="14" w:name="build-and-deployment-workbook"/>
     <w:p>
       <w:pPr>
         <w:pStyle w:val="FirstParagraph"/>
@@ -56,21 +56,21 @@
     <w:p>
       <w:pPr>
         <w:pStyle w:val="BodyText"/>
-        <w:spacing w:line="259" w:lineRule="auto" w:before="200" w:after="200"/>
-        <w:ind w:left="792" w:right="792"/>
+        <w:spacing w:line="259" w:lineRule="auto" w:before="160" w:after="160"/>
+        <w:ind w:left="720" w:right="720"/>
         <w:jc w:val="left"/>
       </w:pPr>
       <w:r>
         <w:rPr>
           <w:b/>
           <w:bCs/>
-          <w:sz w:val="21"/>
+          <w:sz w:val="20"/>
         </w:rPr>
         <w:t xml:space="preserve">Repository:</w:t>
       </w:r>
       <w:r>
         <w:rPr>
-          <w:sz w:val="21"/>
+          <w:sz w:val="20"/>
         </w:rPr>
         <w:t xml:space="preserve"> </w:t>
       </w:r>
@@ -84,7 +84,7 @@
       </w:hyperlink>
       <w:r>
         <w:rPr>
-          <w:sz w:val="21"/>
+          <w:sz w:val="20"/>
         </w:rPr>
         <w:br/>
       </w:r>
@@ -92,13 +92,13 @@
         <w:rPr>
           <w:b/>
           <w:bCs/>
-          <w:sz w:val="21"/>
+          <w:sz w:val="20"/>
         </w:rPr>
         <w:t xml:space="preserve">Local app:</w:t>
       </w:r>
       <w:r>
         <w:rPr>
-          <w:sz w:val="21"/>
+          <w:sz w:val="20"/>
         </w:rPr>
         <w:t xml:space="preserve"> </w:t>
       </w:r>
@@ -112,7 +112,7 @@
       </w:hyperlink>
       <w:r>
         <w:rPr>
-          <w:sz w:val="21"/>
+          <w:sz w:val="20"/>
         </w:rPr>
         <w:br/>
       </w:r>
@@ -120,75 +120,75 @@
         <w:rPr>
           <w:b/>
           <w:bCs/>
-          <w:sz w:val="21"/>
+          <w:sz w:val="20"/>
         </w:rPr>
         <w:t xml:space="preserve">Deployed app:</w:t>
       </w:r>
       <w:r>
         <w:rPr>
-          <w:sz w:val="21"/>
+          <w:sz w:val="20"/>
         </w:rPr>
         <w:t xml:space="preserve"> </w:t>
       </w:r>
       <w:r>
         <w:rPr>
-          <w:sz w:val="21"/>
+          <w:sz w:val="20"/>
         </w:rPr>
         <w:t xml:space="preserve">Paste</w:t>
       </w:r>
       <w:r>
         <w:rPr>
-          <w:sz w:val="21"/>
+          <w:sz w:val="20"/>
         </w:rPr>
         <w:t xml:space="preserve"> </w:t>
       </w:r>
       <w:r>
         <w:rPr>
           <w:rStyle w:val="VerbatimChar"/>
-          <w:sz w:val="21"/>
+          <w:sz w:val="20"/>
         </w:rPr>
         <w:t xml:space="preserve">WEB_APP_URL</w:t>
       </w:r>
       <w:r>
         <w:rPr>
-          <w:sz w:val="21"/>
+          <w:sz w:val="20"/>
         </w:rPr>
         <w:t xml:space="preserve"> </w:t>
       </w:r>
       <w:r>
         <w:rPr>
-          <w:sz w:val="21"/>
+          <w:sz w:val="20"/>
         </w:rPr>
         <w:t xml:space="preserve">from</w:t>
       </w:r>
       <w:r>
         <w:rPr>
-          <w:sz w:val="21"/>
+          <w:sz w:val="20"/>
         </w:rPr>
         <w:t xml:space="preserve"> </w:t>
       </w:r>
       <w:r>
         <w:rPr>
           <w:rStyle w:val="VerbatimChar"/>
-          <w:sz w:val="21"/>
+          <w:sz w:val="20"/>
         </w:rPr>
         <w:t xml:space="preserve">azd up</w:t>
       </w:r>
       <w:r>
         <w:rPr>
-          <w:sz w:val="21"/>
+          <w:sz w:val="20"/>
         </w:rPr>
         <w:t xml:space="preserve"> </w:t>
       </w:r>
       <w:r>
         <w:rPr>
-          <w:sz w:val="21"/>
+          <w:sz w:val="20"/>
         </w:rPr>
         <w:t xml:space="preserve">output here</w:t>
       </w:r>
       <w:r>
         <w:rPr>
-          <w:sz w:val="21"/>
+          <w:sz w:val="20"/>
         </w:rPr>
         <w:br/>
       </w:r>
@@ -196,19 +196,19 @@
         <w:rPr>
           <w:b/>
           <w:bCs/>
-          <w:sz w:val="21"/>
+          <w:sz w:val="20"/>
         </w:rPr>
         <w:t xml:space="preserve">Resource index:</w:t>
       </w:r>
       <w:r>
         <w:rPr>
-          <w:sz w:val="21"/>
+          <w:sz w:val="20"/>
         </w:rPr>
         <w:t xml:space="preserve"> </w:t>
       </w:r>
       <w:r>
         <w:rPr>
-          <w:sz w:val="21"/>
+          <w:sz w:val="20"/>
         </w:rPr>
         <w:t xml:space="preserve">see the appendix for Azure, deployment, and project references.</w:t>
       </w:r>
@@ -216,8 +216,8 @@
     <w:p>
       <w:pPr>
         <w:pStyle w:val="BodyText"/>
-        <w:spacing w:line="259" w:lineRule="auto" w:before="0" w:after="140"/>
-        <w:ind w:left="792" w:right="792"/>
+        <w:spacing w:line="259" w:lineRule="auto" w:before="0" w:after="200"/>
+        <w:ind w:left="720" w:right="720"/>
       </w:pPr>
       <w:r>
         <w:rPr>
@@ -226,7 +226,7 @@
           <w:color w:val="64748B"/>
           <w:sz w:val="20"/>
         </w:rPr>
-        <w:t xml:space="preserve">Partner/program mark row:</w:t>
+        <w:t xml:space="preserve">Program context:</w:t>
       </w:r>
       <w:r>
         <w:rPr>
@@ -240,12 +240,60 @@
           <w:color w:val="64748B"/>
           <w:sz w:val="20"/>
         </w:rPr>
-        <w:t xml:space="preserve">add approved atomcamp Arabia, Microsoft, Riyadh Urban Intelligence Lab, and strategic partner logos here when final brand assets are available.</w:t>
-      </w:r>
-    </w:p>
-    <w:bookmarkEnd w:id="11"/>
-    <w:bookmarkEnd w:id="12"/>
-    <w:bookmarkStart w:id="16" w:name="how-to-use-this-guide"/>
+        <w:t xml:space="preserve">atomcamp Arabia, Microsoft collaboration, Riyadh Urban Development Hackathon, August builder workbook.</w:t>
+      </w:r>
+    </w:p>
+    <w:p>
+      <w:pPr>
+        <w:pStyle w:val="BodyText"/>
+        <w:spacing w:line="259" w:lineRule="auto" w:before="0" w:after="140"/>
+      </w:pPr>
+      <w:r>
+        <w:drawing>
+          <wp:inline>
+            <wp:extent cx="5334000" cy="2252133"/>
+            <wp:effectExtent b="0" l="0" r="0" t="0"/>
+            <wp:docPr descr="" title="" id="12" name="Picture"/>
+            <a:graphic>
+              <a:graphicData uri="http://schemas.openxmlformats.org/drawingml/2006/picture">
+                <pic:pic>
+                  <pic:nvPicPr>
+                    <pic:cNvPr descr="docs/assets/rebuild-guide/cover-workbook-snapshot.png" id="13" name="Picture"/>
+                    <pic:cNvPicPr>
+                      <a:picLocks noChangeArrowheads="1" noChangeAspect="1"/>
+                    </pic:cNvPicPr>
+                  </pic:nvPicPr>
+                  <pic:blipFill>
+                    <a:blip r:embed="rId11"/>
+                    <a:stretch>
+                      <a:fillRect/>
+                    </a:stretch>
+                  </pic:blipFill>
+                  <pic:spPr bwMode="auto">
+                    <a:xfrm>
+                      <a:off x="0" y="0"/>
+                      <a:ext cx="5334000" cy="2252133"/>
+                    </a:xfrm>
+                    <a:prstGeom prst="rect">
+                      <a:avLst/>
+                    </a:prstGeom>
+                    <a:noFill/>
+                    <a:ln w="9525">
+                      <a:noFill/>
+                      <a:headEnd/>
+                      <a:tailEnd/>
+                    </a:ln>
+                  </pic:spPr>
+                </pic:pic>
+              </a:graphicData>
+            </a:graphic>
+          </wp:inline>
+        </w:drawing>
+      </w:r>
+    </w:p>
+    <w:bookmarkEnd w:id="14"/>
+    <w:bookmarkEnd w:id="15"/>
+    <w:bookmarkStart w:id="19" w:name="how-to-use-this-guide"/>
     <w:p>
       <w:pPr>
         <w:pStyle w:val="Heading1"/>
@@ -384,18 +432,18 @@
           <wp:inline>
             <wp:extent cx="5334000" cy="1274233"/>
             <wp:effectExtent b="0" l="0" r="0" t="0"/>
-            <wp:docPr descr="App layers" title="" id="14" name="Picture"/>
+            <wp:docPr descr="App layers" title="" id="17" name="Picture"/>
             <a:graphic>
               <a:graphicData uri="http://schemas.openxmlformats.org/drawingml/2006/picture">
                 <pic:pic>
                   <pic:nvPicPr>
-                    <pic:cNvPr descr="docs/assets/rebuild-guide/icon-row-app-layers.png" id="15" name="Picture"/>
+                    <pic:cNvPr descr="docs/assets/rebuild-guide/icon-row-app-layers.png" id="18" name="Picture"/>
                     <pic:cNvPicPr>
                       <a:picLocks noChangeArrowheads="1" noChangeAspect="1"/>
                     </pic:cNvPicPr>
                   </pic:nvPicPr>
                   <pic:blipFill>
-                    <a:blip r:embed="rId13"/>
+                    <a:blip r:embed="rId16"/>
                     <a:stretch>
                       <a:fillRect/>
                     </a:stretch>
@@ -449,8 +497,8 @@
         <w:t xml:space="preserve">Figure: the starter kit is easiest to explain as five layers: backend, data, map, scoring, and cloud-live deployment.</w:t>
       </w:r>
     </w:p>
-    <w:bookmarkEnd w:id="16"/>
-    <w:bookmarkStart w:id="20" w:name="what-you-are-building"/>
+    <w:bookmarkEnd w:id="19"/>
+    <w:bookmarkStart w:id="23" w:name="what-you-are-building"/>
     <w:p>
       <w:pPr>
         <w:pStyle w:val="Heading1"/>
@@ -631,18 +679,18 @@
           <wp:inline>
             <wp:extent cx="5334000" cy="4741333"/>
             <wp:effectExtent b="0" l="0" r="0" t="0"/>
-            <wp:docPr descr="Local dashboard screenshot" title="" id="18" name="Picture"/>
+            <wp:docPr descr="Local dashboard screenshot" title="" id="21" name="Picture"/>
             <a:graphic>
               <a:graphicData uri="http://schemas.openxmlformats.org/drawingml/2006/picture">
                 <pic:pic>
                   <pic:nvPicPr>
-                    <pic:cNvPr descr="docs/assets/rebuild-guide/local-dashboard-overview.png" id="19" name="Picture"/>
+                    <pic:cNvPr descr="docs/assets/rebuild-guide/local-dashboard-overview.png" id="22" name="Picture"/>
                     <pic:cNvPicPr>
                       <a:picLocks noChangeArrowheads="1" noChangeAspect="1"/>
                     </pic:cNvPicPr>
                   </pic:nvPicPr>
                   <pic:blipFill>
-                    <a:blip r:embed="rId17"/>
+                    <a:blip r:embed="rId20"/>
                     <a:stretch>
                       <a:fillRect/>
                     </a:stretch>
@@ -696,8 +744,8 @@
         <w:t xml:space="preserve">Figure: local dashboard running from bundled sample data with metro lines, bus routes, district selector, score panel, and Azure service explainer visible.</w:t>
       </w:r>
     </w:p>
-    <w:bookmarkEnd w:id="20"/>
-    <w:bookmarkStart w:id="24" w:name="urban-challenge-track-mapping"/>
+    <w:bookmarkEnd w:id="23"/>
+    <w:bookmarkStart w:id="27" w:name="urban-challenge-track-mapping"/>
     <w:p>
       <w:pPr>
         <w:pStyle w:val="Heading1"/>
@@ -768,18 +816,18 @@
           <wp:inline>
             <wp:extent cx="5334000" cy="1274233"/>
             <wp:effectExtent b="0" l="0" r="0" t="0"/>
-            <wp:docPr descr="Urban challenge routes" title="" id="22" name="Picture"/>
+            <wp:docPr descr="Urban challenge routes" title="" id="25" name="Picture"/>
             <a:graphic>
               <a:graphicData uri="http://schemas.openxmlformats.org/drawingml/2006/picture">
                 <pic:pic>
                   <pic:nvPicPr>
-                    <pic:cNvPr descr="docs/assets/rebuild-guide/icon-row-tracks.png" id="23" name="Picture"/>
+                    <pic:cNvPr descr="docs/assets/rebuild-guide/icon-row-tracks.png" id="26" name="Picture"/>
                     <pic:cNvPicPr>
                       <a:picLocks noChangeArrowheads="1" noChangeAspect="1"/>
                     </pic:cNvPicPr>
                   </pic:nvPicPr>
                   <pic:blipFill>
-                    <a:blip r:embed="rId21"/>
+                    <a:blip r:embed="rId24"/>
                     <a:stretch>
                       <a:fillRect/>
                     </a:stretch>
@@ -1381,8 +1429,8 @@
         <w:t xml:space="preserve">Build a Riyadh mobility intelligence prototype with public route data, district scoring, Azure Maps, and an Azure-backed live path. Use it directly for Transformational Technology, or extend the same scaffold into Prosperous People, Sustainable Solutions, or Culture use cases.</w:t>
       </w:r>
     </w:p>
-    <w:bookmarkEnd w:id="24"/>
-    <w:bookmarkStart w:id="25" w:name="services-and-tools-map"/>
+    <w:bookmarkEnd w:id="27"/>
+    <w:bookmarkStart w:id="28" w:name="services-and-tools-map"/>
     <w:p>
       <w:pPr>
         <w:pStyle w:val="Heading1"/>
@@ -2544,8 +2592,8 @@
         </w:tc>
       </w:tr>
     </w:tbl>
-    <w:bookmarkEnd w:id="25"/>
-    <w:bookmarkStart w:id="38" w:name="architecture-and-build-path"/>
+    <w:bookmarkEnd w:id="28"/>
+    <w:bookmarkStart w:id="41" w:name="architecture-and-build-path"/>
     <w:p>
       <w:pPr>
         <w:pStyle w:val="Heading1"/>
@@ -2575,7 +2623,7 @@
         <w:t xml:space="preserve">the app must remain useful even when Azure credentials, remote services, or live data are unavailable.</w:t>
       </w:r>
     </w:p>
-    <w:bookmarkStart w:id="29" w:name="local-first-workflow"/>
+    <w:bookmarkStart w:id="32" w:name="local-first-workflow"/>
     <w:p>
       <w:pPr>
         <w:pStyle w:val="Heading2"/>
@@ -2604,18 +2652,18 @@
           <wp:inline>
             <wp:extent cx="5334000" cy="1540933"/>
             <wp:effectExtent b="0" l="0" r="0" t="0"/>
-            <wp:docPr descr="Local-first workflow" title="" id="27" name="Picture"/>
+            <wp:docPr descr="Local-first workflow" title="" id="30" name="Picture"/>
             <a:graphic>
               <a:graphicData uri="http://schemas.openxmlformats.org/drawingml/2006/picture">
                 <pic:pic>
                   <pic:nvPicPr>
-                    <pic:cNvPr descr="docs/assets/rebuild-guide/diagram-local-first.png" id="28" name="Picture"/>
+                    <pic:cNvPr descr="docs/assets/rebuild-guide/diagram-local-first.png" id="31" name="Picture"/>
                     <pic:cNvPicPr>
                       <a:picLocks noChangeArrowheads="1" noChangeAspect="1"/>
                     </pic:cNvPicPr>
                   </pic:nvPicPr>
                   <pic:blipFill>
-                    <a:blip r:embed="rId26"/>
+                    <a:blip r:embed="rId29"/>
                     <a:stretch>
                       <a:fillRect/>
                     </a:stretch>
@@ -2665,8 +2713,8 @@
         <w:t xml:space="preserve">Local mode uses the same UI and API shape that the cloud deployment uses. The difference is the data source: bundled sample files replace cloud-backed records.</w:t>
       </w:r>
     </w:p>
-    <w:bookmarkEnd w:id="29"/>
-    <w:bookmarkStart w:id="33" w:name="azure-backed-workflow"/>
+    <w:bookmarkEnd w:id="32"/>
+    <w:bookmarkStart w:id="36" w:name="azure-backed-workflow"/>
     <w:p>
       <w:pPr>
         <w:pStyle w:val="Heading2"/>
@@ -2695,18 +2743,18 @@
           <wp:inline>
             <wp:extent cx="5334000" cy="1540933"/>
             <wp:effectExtent b="0" l="0" r="0" t="0"/>
-            <wp:docPr descr="Azure-backed workflow" title="" id="31" name="Picture"/>
+            <wp:docPr descr="Azure-backed workflow" title="" id="34" name="Picture"/>
             <a:graphic>
               <a:graphicData uri="http://schemas.openxmlformats.org/drawingml/2006/picture">
                 <pic:pic>
                   <pic:nvPicPr>
-                    <pic:cNvPr descr="docs/assets/rebuild-guide/diagram-azure-backed.png" id="32" name="Picture"/>
+                    <pic:cNvPr descr="docs/assets/rebuild-guide/diagram-azure-backed.png" id="35" name="Picture"/>
                     <pic:cNvPicPr>
                       <a:picLocks noChangeArrowheads="1" noChangeAspect="1"/>
                     </pic:cNvPicPr>
                   </pic:nvPicPr>
                   <pic:blipFill>
-                    <a:blip r:embed="rId30"/>
+                    <a:blip r:embed="rId33"/>
                     <a:stretch>
                       <a:fillRect/>
                     </a:stretch>
@@ -2756,8 +2804,8 @@
         <w:t xml:space="preserve">Use this path when the team is ready to show a credible cloud deployment or run post-deploy smoke tests.</w:t>
       </w:r>
     </w:p>
-    <w:bookmarkEnd w:id="33"/>
-    <w:bookmarkStart w:id="37" w:name="data-fallback-chain"/>
+    <w:bookmarkEnd w:id="36"/>
+    <w:bookmarkStart w:id="40" w:name="data-fallback-chain"/>
     <w:p>
       <w:pPr>
         <w:pStyle w:val="Heading2"/>
@@ -2786,18 +2834,18 @@
           <wp:inline>
             <wp:extent cx="5334000" cy="1540933"/>
             <wp:effectExtent b="0" l="0" r="0" t="0"/>
-            <wp:docPr descr="Data fallback chain" title="" id="35" name="Picture"/>
+            <wp:docPr descr="Data fallback chain" title="" id="38" name="Picture"/>
             <a:graphic>
               <a:graphicData uri="http://schemas.openxmlformats.org/drawingml/2006/picture">
                 <pic:pic>
                   <pic:nvPicPr>
-                    <pic:cNvPr descr="docs/assets/rebuild-guide/diagram-data-fallback.png" id="36" name="Picture"/>
+                    <pic:cNvPr descr="docs/assets/rebuild-guide/diagram-data-fallback.png" id="39" name="Picture"/>
                     <pic:cNvPicPr>
                       <a:picLocks noChangeArrowheads="1" noChangeAspect="1"/>
                     </pic:cNvPicPr>
                   </pic:nvPicPr>
                   <pic:blipFill>
-                    <a:blip r:embed="rId34"/>
+                    <a:blip r:embed="rId37"/>
                     <a:stretch>
                       <a:fillRect/>
                     </a:stretch>
@@ -2859,9 +2907,9 @@
         <w:t xml:space="preserve">, then move to Blob or Cosmos only after the local app is working.</w:t>
       </w:r>
     </w:p>
-    <w:bookmarkEnd w:id="37"/>
-    <w:bookmarkEnd w:id="38"/>
-    <w:bookmarkStart w:id="40" w:name="project-structure"/>
+    <w:bookmarkEnd w:id="40"/>
+    <w:bookmarkEnd w:id="41"/>
+    <w:bookmarkStart w:id="43" w:name="project-structure"/>
     <w:p>
       <w:pPr>
         <w:pStyle w:val="Heading1"/>
@@ -3836,7 +3884,7 @@
         </w:tc>
       </w:tr>
     </w:tbl>
-    <w:bookmarkStart w:id="39" w:name="where-the-data-comes-from"/>
+    <w:bookmarkStart w:id="42" w:name="where-the-data-comes-from"/>
     <w:p>
       <w:pPr>
         <w:pStyle w:val="Heading2"/>
@@ -4407,9 +4455,9 @@
         <w:t xml:space="preserve"># optional cloud step</w:t>
       </w:r>
     </w:p>
-    <w:bookmarkEnd w:id="39"/>
-    <w:bookmarkEnd w:id="40"/>
-    <w:bookmarkStart w:id="46" w:name="run-locally"/>
+    <w:bookmarkEnd w:id="42"/>
+    <w:bookmarkEnd w:id="43"/>
+    <w:bookmarkStart w:id="49" w:name="run-locally"/>
     <w:p>
       <w:pPr>
         <w:pStyle w:val="Heading1"/>
@@ -4429,7 +4477,7 @@
         <w:t xml:space="preserve">Local setup is deliberately direct. The goal is to get one useful screen running before adding cloud services.</w:t>
       </w:r>
     </w:p>
-    <w:bookmarkStart w:id="44" w:name="play-by-play"/>
+    <w:bookmarkStart w:id="47" w:name="play-by-play"/>
     <w:p>
       <w:pPr>
         <w:pStyle w:val="Heading2"/>
@@ -4683,18 +4731,18 @@
           <wp:inline>
             <wp:extent cx="5334000" cy="3669145"/>
             <wp:effectExtent b="0" l="0" r="0" t="0"/>
-            <wp:docPr descr="Map layers screenshot" title="" id="42" name="Picture"/>
+            <wp:docPr descr="Map layers screenshot" title="" id="45" name="Picture"/>
             <a:graphic>
               <a:graphicData uri="http://schemas.openxmlformats.org/drawingml/2006/picture">
                 <pic:pic>
                   <pic:nvPicPr>
-                    <pic:cNvPr descr="docs/assets/rebuild-guide/map-layers.png" id="43" name="Picture"/>
+                    <pic:cNvPr descr="docs/assets/rebuild-guide/map-layers.png" id="46" name="Picture"/>
                     <pic:cNvPicPr>
                       <a:picLocks noChangeArrowheads="1" noChangeAspect="1"/>
                     </pic:cNvPicPr>
                   </pic:nvPicPr>
                   <pic:blipFill>
-                    <a:blip r:embed="rId41"/>
+                    <a:blip r:embed="rId44"/>
                     <a:stretch>
                       <a:fillRect/>
                     </a:stretch>
@@ -4748,8 +4796,8 @@
         <w:t xml:space="preserve">Figure: metro and bus layers rendered locally with OpenStreetMap fallback tiles.</w:t>
       </w:r>
     </w:p>
-    <w:bookmarkEnd w:id="44"/>
-    <w:bookmarkStart w:id="45" w:name="local-verification-checklist"/>
+    <w:bookmarkEnd w:id="47"/>
+    <w:bookmarkStart w:id="48" w:name="local-verification-checklist"/>
     <w:p>
       <w:pPr>
         <w:pStyle w:val="Heading2"/>
@@ -5036,9 +5084,9 @@
         <w:t xml:space="preserve"> scripts/validate_data.py</w:t>
       </w:r>
     </w:p>
-    <w:bookmarkEnd w:id="45"/>
-    <w:bookmarkEnd w:id="46"/>
-    <w:bookmarkStart w:id="54" w:name="backend-walkthrough"/>
+    <w:bookmarkEnd w:id="48"/>
+    <w:bookmarkEnd w:id="49"/>
+    <w:bookmarkStart w:id="57" w:name="backend-walkthrough"/>
     <w:p>
       <w:pPr>
         <w:pStyle w:val="Heading1"/>
@@ -5874,18 +5922,18 @@
           <wp:inline>
             <wp:extent cx="5334000" cy="2927032"/>
             <wp:effectExtent b="0" l="0" r="0" t="0"/>
-            <wp:docPr descr="API data status screenshot" title="" id="48" name="Picture"/>
+            <wp:docPr descr="API data status screenshot" title="" id="51" name="Picture"/>
             <a:graphic>
               <a:graphicData uri="http://schemas.openxmlformats.org/drawingml/2006/picture">
                 <pic:pic>
                   <pic:nvPicPr>
-                    <pic:cNvPr descr="docs/assets/rebuild-guide/api-data-status.png" id="49" name="Picture"/>
+                    <pic:cNvPr descr="docs/assets/rebuild-guide/api-data-status.png" id="52" name="Picture"/>
                     <pic:cNvPicPr>
                       <a:picLocks noChangeArrowheads="1" noChangeAspect="1"/>
                     </pic:cNvPicPr>
                   </pic:nvPicPr>
                   <pic:blipFill>
-                    <a:blip r:embed="rId47"/>
+                    <a:blip r:embed="rId50"/>
                     <a:stretch>
                       <a:fillRect/>
                     </a:stretch>
@@ -5968,7 +6016,7 @@
         <w:t xml:space="preserve">confirms sample mode and explains the fallback path.</w:t>
       </w:r>
     </w:p>
-    <w:bookmarkStart w:id="53" w:name="score-request-flow"/>
+    <w:bookmarkStart w:id="56" w:name="score-request-flow"/>
     <w:p>
       <w:pPr>
         <w:pStyle w:val="Heading2"/>
@@ -5988,18 +6036,18 @@
           <wp:inline>
             <wp:extent cx="5334000" cy="1540933"/>
             <wp:effectExtent b="0" l="0" r="0" t="0"/>
-            <wp:docPr descr="Score request flow" title="" id="51" name="Picture"/>
+            <wp:docPr descr="Score request flow" title="" id="54" name="Picture"/>
             <a:graphic>
               <a:graphicData uri="http://schemas.openxmlformats.org/drawingml/2006/picture">
                 <pic:pic>
                   <pic:nvPicPr>
-                    <pic:cNvPr descr="docs/assets/rebuild-guide/diagram-score-request.png" id="52" name="Picture"/>
+                    <pic:cNvPr descr="docs/assets/rebuild-guide/diagram-score-request.png" id="55" name="Picture"/>
                     <pic:cNvPicPr>
                       <a:picLocks noChangeArrowheads="1" noChangeAspect="1"/>
                     </pic:cNvPicPr>
                   </pic:nvPicPr>
                   <pic:blipFill>
-                    <a:blip r:embed="rId50"/>
+                    <a:blip r:embed="rId53"/>
                     <a:stretch>
                       <a:fillRect/>
                     </a:stretch>
@@ -6070,9 +6118,9 @@
         <w:t xml:space="preserve">Keep this formula easy to explain. Teams can later replace the weights or add new inputs such as parking, walkability, public services, heat, or event density.</w:t>
       </w:r>
     </w:p>
-    <w:bookmarkEnd w:id="53"/>
-    <w:bookmarkEnd w:id="54"/>
-    <w:bookmarkStart w:id="61" w:name="frontend-walkthrough"/>
+    <w:bookmarkEnd w:id="56"/>
+    <w:bookmarkEnd w:id="57"/>
+    <w:bookmarkStart w:id="64" w:name="frontend-walkthrough"/>
     <w:p>
       <w:pPr>
         <w:pStyle w:val="Heading1"/>
@@ -7031,18 +7079,18 @@
           <wp:inline>
             <wp:extent cx="5334000" cy="600757"/>
             <wp:effectExtent b="0" l="0" r="0" t="0"/>
-            <wp:docPr descr="District selector screenshot" title="" id="56" name="Picture"/>
+            <wp:docPr descr="District selector screenshot" title="" id="59" name="Picture"/>
             <a:graphic>
               <a:graphicData uri="http://schemas.openxmlformats.org/drawingml/2006/picture">
                 <pic:pic>
                   <pic:nvPicPr>
-                    <pic:cNvPr descr="docs/assets/rebuild-guide/district-selector.png" id="57" name="Picture"/>
+                    <pic:cNvPr descr="docs/assets/rebuild-guide/district-selector.png" id="60" name="Picture"/>
                     <pic:cNvPicPr>
                       <a:picLocks noChangeArrowheads="1" noChangeAspect="1"/>
                     </pic:cNvPicPr>
                   </pic:nvPicPr>
                   <pic:blipFill>
-                    <a:blip r:embed="rId55"/>
+                    <a:blip r:embed="rId58"/>
                     <a:stretch>
                       <a:fillRect/>
                     </a:stretch>
@@ -7206,18 +7254,18 @@
           <wp:inline>
             <wp:extent cx="5334000" cy="4533900"/>
             <wp:effectExtent b="0" l="0" r="0" t="0"/>
-            <wp:docPr descr="District score panel screenshot" title="" id="59" name="Picture"/>
+            <wp:docPr descr="District score panel screenshot" title="" id="62" name="Picture"/>
             <a:graphic>
               <a:graphicData uri="http://schemas.openxmlformats.org/drawingml/2006/picture">
                 <pic:pic>
                   <pic:nvPicPr>
-                    <pic:cNvPr descr="docs/assets/rebuild-guide/district-score-panel.png" id="60" name="Picture"/>
+                    <pic:cNvPr descr="docs/assets/rebuild-guide/district-score-panel.png" id="63" name="Picture"/>
                     <pic:cNvPicPr>
                       <a:picLocks noChangeArrowheads="1" noChangeAspect="1"/>
                     </pic:cNvPicPr>
                   </pic:nvPicPr>
                   <pic:blipFill>
-                    <a:blip r:embed="rId58"/>
+                    <a:blip r:embed="rId61"/>
                     <a:stretch>
                       <a:fillRect/>
                     </a:stretch>
@@ -7271,8 +7319,8 @@
         <w:t xml:space="preserve">Figure: district score panel after selecting a Riyadh district.</w:t>
       </w:r>
     </w:p>
-    <w:bookmarkEnd w:id="61"/>
-    <w:bookmarkStart w:id="64" w:name="cloud-live-deployment"/>
+    <w:bookmarkEnd w:id="64"/>
+    <w:bookmarkStart w:id="67" w:name="cloud-live-deployment"/>
     <w:p>
       <w:pPr>
         <w:pStyle w:val="Heading1"/>
@@ -7292,7 +7340,7 @@
         <w:t xml:space="preserve">The cloud-live path is the deployable version of the same starter kit. It is useful when a team needs to show that the app can move beyond a laptop and into a credible Azure environment.</w:t>
       </w:r>
     </w:p>
-    <w:bookmarkStart w:id="62" w:name="prerequisites"/>
+    <w:bookmarkStart w:id="65" w:name="prerequisites"/>
     <w:p>
       <w:pPr>
         <w:pStyle w:val="Heading2"/>
@@ -7509,8 +7557,8 @@
         <w:t xml:space="preserve">The helper prints active environment values, then runs the Azure Developer CLI deployment workflow.</w:t>
       </w:r>
     </w:p>
-    <w:bookmarkEnd w:id="62"/>
-    <w:bookmarkStart w:id="63" w:name="what-deployment-creates"/>
+    <w:bookmarkEnd w:id="65"/>
+    <w:bookmarkStart w:id="66" w:name="what-deployment-creates"/>
     <w:p>
       <w:pPr>
         <w:pStyle w:val="Heading2"/>
@@ -8239,9 +8287,9 @@
         <w:t xml:space="preserve">.</w:t>
       </w:r>
     </w:p>
-    <w:bookmarkEnd w:id="63"/>
-    <w:bookmarkEnd w:id="64"/>
-    <w:bookmarkStart w:id="69" w:name="starter-kit-adaptation-routes"/>
+    <w:bookmarkEnd w:id="66"/>
+    <w:bookmarkEnd w:id="67"/>
+    <w:bookmarkStart w:id="72" w:name="starter-kit-adaptation-routes"/>
     <w:p>
       <w:pPr>
         <w:pStyle w:val="Heading1"/>
@@ -8261,7 +8309,7 @@
         <w:t xml:space="preserve">Treat this codebase as a scaffold. Teams should keep the working shell, replace the domain data, and adapt the score or map layers toward the track they are pursuing.</w:t>
       </w:r>
     </w:p>
-    <w:bookmarkStart w:id="65" w:name="route-1-mobility-command-view"/>
+    <w:bookmarkStart w:id="68" w:name="route-1-mobility-command-view"/>
     <w:p>
       <w:pPr>
         <w:pStyle w:val="Heading2"/>
@@ -8424,8 +8472,8 @@
         <w:t xml:space="preserve">Likely Azure services: Azure Maps, Container Apps, Event Hubs, Stream Analytics, Cosmos DB, Application Insights.</w:t>
       </w:r>
     </w:p>
-    <w:bookmarkEnd w:id="65"/>
-    <w:bookmarkStart w:id="66" w:name="route-2-district-intelligence"/>
+    <w:bookmarkEnd w:id="68"/>
+    <w:bookmarkStart w:id="69" w:name="route-2-district-intelligence"/>
     <w:p>
       <w:pPr>
         <w:pStyle w:val="Heading2"/>
@@ -8575,8 +8623,8 @@
         <w:t xml:space="preserve">Likely Azure services: Azure Maps, Blob Storage, Cosmos DB, Container Apps, optional Azure OpenAI for plain-language score explanations.</w:t>
       </w:r>
     </w:p>
-    <w:bookmarkEnd w:id="66"/>
-    <w:bookmarkStart w:id="67" w:name="route-3-sustainable-mobility-overlay"/>
+    <w:bookmarkEnd w:id="69"/>
+    <w:bookmarkStart w:id="70" w:name="route-3-sustainable-mobility-overlay"/>
     <w:p>
       <w:pPr>
         <w:pStyle w:val="Heading2"/>
@@ -8739,8 +8787,8 @@
         <w:t xml:space="preserve">Likely Azure services: Azure Maps, Blob Storage, Cosmos DB, Power BI, Application Insights.</w:t>
       </w:r>
     </w:p>
-    <w:bookmarkEnd w:id="67"/>
-    <w:bookmarkStart w:id="68" w:name="route-4-culture-and-visitor-movement"/>
+    <w:bookmarkEnd w:id="70"/>
+    <w:bookmarkStart w:id="71" w:name="route-4-culture-and-visitor-movement"/>
     <w:p>
       <w:pPr>
         <w:pStyle w:val="Heading2"/>
@@ -8890,9 +8938,9 @@
         <w:t xml:space="preserve">Likely Azure services: Azure Maps, Cosmos DB, Blob Storage, Container Apps, optional translation services.</w:t>
       </w:r>
     </w:p>
-    <w:bookmarkEnd w:id="68"/>
-    <w:bookmarkEnd w:id="69"/>
-    <w:bookmarkStart w:id="70" w:name="demo-flow"/>
+    <w:bookmarkEnd w:id="71"/>
+    <w:bookmarkEnd w:id="72"/>
+    <w:bookmarkStart w:id="73" w:name="demo-flow"/>
     <w:p>
       <w:pPr>
         <w:pStyle w:val="Heading1"/>
@@ -9602,8 +9650,8 @@
         <w:t xml:space="preserve">checks.</w:t>
       </w:r>
     </w:p>
-    <w:bookmarkEnd w:id="70"/>
-    <w:bookmarkStart w:id="82" w:name="appendix"/>
+    <w:bookmarkEnd w:id="73"/>
+    <w:bookmarkStart w:id="85" w:name="appendix"/>
     <w:p>
       <w:pPr>
         <w:pStyle w:val="Heading1"/>
@@ -9614,7 +9662,7 @@
         <w:t xml:space="preserve">Appendix</w:t>
       </w:r>
     </w:p>
-    <w:bookmarkStart w:id="71" w:name="common-commands"/>
+    <w:bookmarkStart w:id="74" w:name="common-commands"/>
     <w:p>
       <w:pPr>
         <w:pStyle w:val="Heading2"/>
@@ -9822,8 +9870,8 @@
         <w:t xml:space="preserve">--yes</w:t>
       </w:r>
     </w:p>
-    <w:bookmarkEnd w:id="71"/>
-    <w:bookmarkStart w:id="72" w:name="debugging-checklist"/>
+    <w:bookmarkEnd w:id="74"/>
+    <w:bookmarkStart w:id="75" w:name="debugging-checklist"/>
     <w:p>
       <w:pPr>
         <w:pStyle w:val="Heading2"/>
@@ -9979,8 +10027,8 @@
         <w:t xml:space="preserve">, Container App logs, and Application Insights.</w:t>
       </w:r>
     </w:p>
-    <w:bookmarkEnd w:id="72"/>
-    <w:bookmarkStart w:id="73" w:name="visual-asset-checklist"/>
+    <w:bookmarkEnd w:id="75"/>
+    <w:bookmarkStart w:id="76" w:name="visual-asset-checklist"/>
     <w:p>
       <w:pPr>
         <w:pStyle w:val="Heading2"/>
@@ -10647,8 +10695,8 @@
         </w:tc>
       </w:tr>
     </w:tbl>
-    <w:bookmarkEnd w:id="73"/>
-    <w:bookmarkStart w:id="80" w:name="resource-index"/>
+    <w:bookmarkEnd w:id="76"/>
+    <w:bookmarkStart w:id="83" w:name="resource-index"/>
     <w:p>
       <w:pPr>
         <w:pStyle w:val="Heading2"/>
@@ -10888,7 +10936,7 @@
               <w:pStyle w:val="Compact"/>
               <w:spacing w:after="40"/>
             </w:pPr>
-            <w:hyperlink r:id="rId74">
+            <w:hyperlink r:id="rId77">
               <w:r>
                 <w:rPr>
                   <w:rStyle w:val="Hyperlink"/>
@@ -10922,180 +10970,6 @@
                 <w:sz w:val="19"/>
               </w:rPr>
               <w:t xml:space="preserve">Azure Developer CLI docs</w:t>
-            </w:r>
-          </w:p>
-        </w:tc>
-        <w:tc>
-          <w:tcPr>
-            <w:tcW w:type="dxa" w:w="6696"/>
-            <w:vAlign w:val="center"/>
-            <w:tcMar>
-              <w:top w:w="90" w:type="dxa"/>
-              <w:start w:w="120" w:type="dxa"/>
-              <w:bottom w:w="90" w:type="dxa"/>
-              <w:end w:w="120" w:type="dxa"/>
-            </w:tcMar>
-          </w:tcPr>
-          <w:p>
-            <w:pPr>
-              <w:pStyle w:val="Compact"/>
-              <w:spacing w:after="40"/>
-            </w:pPr>
-            <w:hyperlink r:id="rId75">
-              <w:r>
-                <w:rPr>
-                  <w:rStyle w:val="Hyperlink"/>
-                </w:rPr>
-                <w:t xml:space="preserve">Microsoft Learn</w:t>
-              </w:r>
-            </w:hyperlink>
-          </w:p>
-        </w:tc>
-      </w:tr>
-      <w:tr>
-        <w:tc>
-          <w:tcPr>
-            <w:tcW w:type="dxa" w:w="2952"/>
-            <w:vAlign w:val="center"/>
-            <w:tcMar>
-              <w:top w:w="90" w:type="dxa"/>
-              <w:start w:w="120" w:type="dxa"/>
-              <w:bottom w:w="90" w:type="dxa"/>
-              <w:end w:w="120" w:type="dxa"/>
-            </w:tcMar>
-          </w:tcPr>
-          <w:p>
-            <w:pPr>
-              <w:pStyle w:val="Compact"/>
-              <w:spacing w:after="40"/>
-            </w:pPr>
-            <w:r>
-              <w:rPr>
-                <w:rStyle w:val="VerbatimChar"/>
-                <w:rFonts w:ascii="Aptos" w:hAnsi="Aptos"/>
-                <w:sz w:val="19"/>
-              </w:rPr>
-              <w:t xml:space="preserve">azd up</w:t>
-            </w:r>
-            <w:r>
-              <w:rPr>
-                <w:rFonts w:ascii="Aptos" w:hAnsi="Aptos"/>
-                <w:sz w:val="19"/>
-              </w:rPr>
-              <w:t xml:space="preserve"> </w:t>
-            </w:r>
-            <w:r>
-              <w:rPr>
-                <w:rFonts w:ascii="Aptos" w:hAnsi="Aptos"/>
-                <w:sz w:val="19"/>
-              </w:rPr>
-              <w:t xml:space="preserve">workflow</w:t>
-            </w:r>
-          </w:p>
-        </w:tc>
-        <w:tc>
-          <w:tcPr>
-            <w:tcW w:type="dxa" w:w="6696"/>
-            <w:vAlign w:val="center"/>
-            <w:tcMar>
-              <w:top w:w="90" w:type="dxa"/>
-              <w:start w:w="120" w:type="dxa"/>
-              <w:bottom w:w="90" w:type="dxa"/>
-              <w:end w:w="120" w:type="dxa"/>
-            </w:tcMar>
-          </w:tcPr>
-          <w:p>
-            <w:pPr>
-              <w:pStyle w:val="Compact"/>
-              <w:spacing w:after="40"/>
-            </w:pPr>
-            <w:hyperlink r:id="rId76">
-              <w:r>
-                <w:rPr>
-                  <w:rStyle w:val="Hyperlink"/>
-                </w:rPr>
-                <w:t xml:space="preserve">Microsoft Learn</w:t>
-              </w:r>
-            </w:hyperlink>
-          </w:p>
-        </w:tc>
-      </w:tr>
-      <w:tr>
-        <w:tc>
-          <w:tcPr>
-            <w:tcW w:type="dxa" w:w="2952"/>
-            <w:vAlign w:val="center"/>
-            <w:tcMar>
-              <w:top w:w="90" w:type="dxa"/>
-              <w:start w:w="120" w:type="dxa"/>
-              <w:bottom w:w="90" w:type="dxa"/>
-              <w:end w:w="120" w:type="dxa"/>
-            </w:tcMar>
-          </w:tcPr>
-          <w:p>
-            <w:pPr>
-              <w:pStyle w:val="Compact"/>
-              <w:spacing w:after="40"/>
-            </w:pPr>
-            <w:r>
-              <w:rPr>
-                <w:rFonts w:ascii="Aptos" w:hAnsi="Aptos"/>
-                <w:sz w:val="19"/>
-              </w:rPr>
-              <w:t xml:space="preserve">Azure Container Apps docs</w:t>
-            </w:r>
-          </w:p>
-        </w:tc>
-        <w:tc>
-          <w:tcPr>
-            <w:tcW w:type="dxa" w:w="6696"/>
-            <w:vAlign w:val="center"/>
-            <w:tcMar>
-              <w:top w:w="90" w:type="dxa"/>
-              <w:start w:w="120" w:type="dxa"/>
-              <w:bottom w:w="90" w:type="dxa"/>
-              <w:end w:w="120" w:type="dxa"/>
-            </w:tcMar>
-          </w:tcPr>
-          <w:p>
-            <w:pPr>
-              <w:pStyle w:val="Compact"/>
-              <w:spacing w:after="40"/>
-            </w:pPr>
-            <w:hyperlink r:id="rId77">
-              <w:r>
-                <w:rPr>
-                  <w:rStyle w:val="Hyperlink"/>
-                </w:rPr>
-                <w:t xml:space="preserve">Microsoft Learn</w:t>
-              </w:r>
-            </w:hyperlink>
-          </w:p>
-        </w:tc>
-      </w:tr>
-      <w:tr>
-        <w:tc>
-          <w:tcPr>
-            <w:tcW w:type="dxa" w:w="2952"/>
-            <w:vAlign w:val="center"/>
-            <w:tcMar>
-              <w:top w:w="90" w:type="dxa"/>
-              <w:start w:w="120" w:type="dxa"/>
-              <w:bottom w:w="90" w:type="dxa"/>
-              <w:end w:w="120" w:type="dxa"/>
-            </w:tcMar>
-          </w:tcPr>
-          <w:p>
-            <w:pPr>
-              <w:pStyle w:val="Compact"/>
-              <w:spacing w:after="40"/>
-            </w:pPr>
-            <w:r>
-              <w:rPr>
-                <w:rFonts w:ascii="Aptos" w:hAnsi="Aptos"/>
-                <w:sz w:val="19"/>
-              </w:rPr>
-              <w:t xml:space="preserve">Azure Maps docs</w:t>
             </w:r>
           </w:p>
         </w:tc>
@@ -11145,10 +11019,25 @@
             </w:pPr>
             <w:r>
               <w:rPr>
-                <w:rFonts w:ascii="Aptos" w:hAnsi="Aptos"/>
-                <w:sz w:val="19"/>
-              </w:rPr>
-              <w:t xml:space="preserve">Azure Cosmos DB docs</w:t>
+                <w:rStyle w:val="VerbatimChar"/>
+                <w:rFonts w:ascii="Aptos" w:hAnsi="Aptos"/>
+                <w:sz w:val="19"/>
+              </w:rPr>
+              <w:t xml:space="preserve">azd up</w:t>
+            </w:r>
+            <w:r>
+              <w:rPr>
+                <w:rFonts w:ascii="Aptos" w:hAnsi="Aptos"/>
+                <w:sz w:val="19"/>
+              </w:rPr>
+              <w:t xml:space="preserve"> </w:t>
+            </w:r>
+            <w:r>
+              <w:rPr>
+                <w:rFonts w:ascii="Aptos" w:hAnsi="Aptos"/>
+                <w:sz w:val="19"/>
+              </w:rPr>
+              <w:t xml:space="preserve">workflow</w:t>
             </w:r>
           </w:p>
         </w:tc>
@@ -11201,7 +11090,7 @@
                 <w:rFonts w:ascii="Aptos" w:hAnsi="Aptos"/>
                 <w:sz w:val="19"/>
               </w:rPr>
-              <w:t xml:space="preserve">Student quickstart</w:t>
+              <w:t xml:space="preserve">Azure Container Apps docs</w:t>
             </w:r>
           </w:p>
         </w:tc>
@@ -11221,14 +11110,14 @@
               <w:pStyle w:val="Compact"/>
               <w:spacing w:after="40"/>
             </w:pPr>
-            <w:r>
-              <w:rPr>
-                <w:rStyle w:val="VerbatimChar"/>
-                <w:rFonts w:ascii="Aptos" w:hAnsi="Aptos"/>
-                <w:sz w:val="19"/>
-              </w:rPr>
-              <w:t xml:space="preserve">README.md</w:t>
-            </w:r>
+            <w:hyperlink r:id="rId80">
+              <w:r>
+                <w:rPr>
+                  <w:rStyle w:val="Hyperlink"/>
+                </w:rPr>
+                <w:t xml:space="preserve">Microsoft Learn</w:t>
+              </w:r>
+            </w:hyperlink>
           </w:p>
         </w:tc>
       </w:tr>
@@ -11254,7 +11143,7 @@
                 <w:rFonts w:ascii="Aptos" w:hAnsi="Aptos"/>
                 <w:sz w:val="19"/>
               </w:rPr>
-              <w:t xml:space="preserve">Architecture notes</w:t>
+              <w:t xml:space="preserve">Azure Maps docs</w:t>
             </w:r>
           </w:p>
         </w:tc>
@@ -11274,14 +11163,14 @@
               <w:pStyle w:val="Compact"/>
               <w:spacing w:after="40"/>
             </w:pPr>
-            <w:r>
-              <w:rPr>
-                <w:rStyle w:val="VerbatimChar"/>
-                <w:rFonts w:ascii="Aptos" w:hAnsi="Aptos"/>
-                <w:sz w:val="19"/>
-              </w:rPr>
-              <w:t xml:space="preserve">docs/architecture.md</w:t>
-            </w:r>
+            <w:hyperlink r:id="rId81">
+              <w:r>
+                <w:rPr>
+                  <w:rStyle w:val="Hyperlink"/>
+                </w:rPr>
+                <w:t xml:space="preserve">Microsoft Learn</w:t>
+              </w:r>
+            </w:hyperlink>
           </w:p>
         </w:tc>
       </w:tr>
@@ -11307,7 +11196,7 @@
                 <w:rFonts w:ascii="Aptos" w:hAnsi="Aptos"/>
                 <w:sz w:val="19"/>
               </w:rPr>
-              <w:t xml:space="preserve">Azure deployment notes</w:t>
+              <w:t xml:space="preserve">Azure Cosmos DB docs</w:t>
             </w:r>
           </w:p>
         </w:tc>
@@ -11327,14 +11216,14 @@
               <w:pStyle w:val="Compact"/>
               <w:spacing w:after="40"/>
             </w:pPr>
-            <w:r>
-              <w:rPr>
-                <w:rStyle w:val="VerbatimChar"/>
-                <w:rFonts w:ascii="Aptos" w:hAnsi="Aptos"/>
-                <w:sz w:val="19"/>
-              </w:rPr>
-              <w:t xml:space="preserve">docs/azure_deployment.md</w:t>
-            </w:r>
+            <w:hyperlink r:id="rId82">
+              <w:r>
+                <w:rPr>
+                  <w:rStyle w:val="Hyperlink"/>
+                </w:rPr>
+                <w:t xml:space="preserve">Microsoft Learn</w:t>
+              </w:r>
+            </w:hyperlink>
           </w:p>
         </w:tc>
       </w:tr>
@@ -11360,7 +11249,7 @@
                 <w:rFonts w:ascii="Aptos" w:hAnsi="Aptos"/>
                 <w:sz w:val="19"/>
               </w:rPr>
-              <w:t xml:space="preserve">Data source notes</w:t>
+              <w:t xml:space="preserve">Student quickstart</w:t>
             </w:r>
           </w:p>
         </w:tc>
@@ -11386,7 +11275,7 @@
                 <w:rFonts w:ascii="Aptos" w:hAnsi="Aptos"/>
                 <w:sz w:val="19"/>
               </w:rPr>
-              <w:t xml:space="preserve">docs/data_sources.md</w:t>
+              <w:t xml:space="preserve">README.md</w:t>
             </w:r>
           </w:p>
         </w:tc>
@@ -11413,7 +11302,7 @@
                 <w:rFonts w:ascii="Aptos" w:hAnsi="Aptos"/>
                 <w:sz w:val="19"/>
               </w:rPr>
-              <w:t xml:space="preserve">Troubleshooting</w:t>
+              <w:t xml:space="preserve">Architecture notes</w:t>
             </w:r>
           </w:p>
         </w:tc>
@@ -11439,7 +11328,7 @@
                 <w:rFonts w:ascii="Aptos" w:hAnsi="Aptos"/>
                 <w:sz w:val="19"/>
               </w:rPr>
-              <w:t xml:space="preserve">docs/troubleshooting.md</w:t>
+              <w:t xml:space="preserve">docs/architecture.md</w:t>
             </w:r>
           </w:p>
         </w:tc>
@@ -11466,6 +11355,165 @@
                 <w:rFonts w:ascii="Aptos" w:hAnsi="Aptos"/>
                 <w:sz w:val="19"/>
               </w:rPr>
+              <w:t xml:space="preserve">Azure deployment notes</w:t>
+            </w:r>
+          </w:p>
+        </w:tc>
+        <w:tc>
+          <w:tcPr>
+            <w:tcW w:type="dxa" w:w="6696"/>
+            <w:vAlign w:val="center"/>
+            <w:tcMar>
+              <w:top w:w="90" w:type="dxa"/>
+              <w:start w:w="120" w:type="dxa"/>
+              <w:bottom w:w="90" w:type="dxa"/>
+              <w:end w:w="120" w:type="dxa"/>
+            </w:tcMar>
+          </w:tcPr>
+          <w:p>
+            <w:pPr>
+              <w:pStyle w:val="Compact"/>
+              <w:spacing w:after="40"/>
+            </w:pPr>
+            <w:r>
+              <w:rPr>
+                <w:rStyle w:val="VerbatimChar"/>
+                <w:rFonts w:ascii="Aptos" w:hAnsi="Aptos"/>
+                <w:sz w:val="19"/>
+              </w:rPr>
+              <w:t xml:space="preserve">docs/azure_deployment.md</w:t>
+            </w:r>
+          </w:p>
+        </w:tc>
+      </w:tr>
+      <w:tr>
+        <w:tc>
+          <w:tcPr>
+            <w:tcW w:type="dxa" w:w="2952"/>
+            <w:vAlign w:val="center"/>
+            <w:tcMar>
+              <w:top w:w="90" w:type="dxa"/>
+              <w:start w:w="120" w:type="dxa"/>
+              <w:bottom w:w="90" w:type="dxa"/>
+              <w:end w:w="120" w:type="dxa"/>
+            </w:tcMar>
+          </w:tcPr>
+          <w:p>
+            <w:pPr>
+              <w:pStyle w:val="Compact"/>
+              <w:spacing w:after="40"/>
+            </w:pPr>
+            <w:r>
+              <w:rPr>
+                <w:rFonts w:ascii="Aptos" w:hAnsi="Aptos"/>
+                <w:sz w:val="19"/>
+              </w:rPr>
+              <w:t xml:space="preserve">Data source notes</w:t>
+            </w:r>
+          </w:p>
+        </w:tc>
+        <w:tc>
+          <w:tcPr>
+            <w:tcW w:type="dxa" w:w="6696"/>
+            <w:vAlign w:val="center"/>
+            <w:tcMar>
+              <w:top w:w="90" w:type="dxa"/>
+              <w:start w:w="120" w:type="dxa"/>
+              <w:bottom w:w="90" w:type="dxa"/>
+              <w:end w:w="120" w:type="dxa"/>
+            </w:tcMar>
+          </w:tcPr>
+          <w:p>
+            <w:pPr>
+              <w:pStyle w:val="Compact"/>
+              <w:spacing w:after="40"/>
+            </w:pPr>
+            <w:r>
+              <w:rPr>
+                <w:rStyle w:val="VerbatimChar"/>
+                <w:rFonts w:ascii="Aptos" w:hAnsi="Aptos"/>
+                <w:sz w:val="19"/>
+              </w:rPr>
+              <w:t xml:space="preserve">docs/data_sources.md</w:t>
+            </w:r>
+          </w:p>
+        </w:tc>
+      </w:tr>
+      <w:tr>
+        <w:tc>
+          <w:tcPr>
+            <w:tcW w:type="dxa" w:w="2952"/>
+            <w:vAlign w:val="center"/>
+            <w:tcMar>
+              <w:top w:w="90" w:type="dxa"/>
+              <w:start w:w="120" w:type="dxa"/>
+              <w:bottom w:w="90" w:type="dxa"/>
+              <w:end w:w="120" w:type="dxa"/>
+            </w:tcMar>
+          </w:tcPr>
+          <w:p>
+            <w:pPr>
+              <w:pStyle w:val="Compact"/>
+              <w:spacing w:after="40"/>
+            </w:pPr>
+            <w:r>
+              <w:rPr>
+                <w:rFonts w:ascii="Aptos" w:hAnsi="Aptos"/>
+                <w:sz w:val="19"/>
+              </w:rPr>
+              <w:t xml:space="preserve">Troubleshooting</w:t>
+            </w:r>
+          </w:p>
+        </w:tc>
+        <w:tc>
+          <w:tcPr>
+            <w:tcW w:type="dxa" w:w="6696"/>
+            <w:vAlign w:val="center"/>
+            <w:tcMar>
+              <w:top w:w="90" w:type="dxa"/>
+              <w:start w:w="120" w:type="dxa"/>
+              <w:bottom w:w="90" w:type="dxa"/>
+              <w:end w:w="120" w:type="dxa"/>
+            </w:tcMar>
+          </w:tcPr>
+          <w:p>
+            <w:pPr>
+              <w:pStyle w:val="Compact"/>
+              <w:spacing w:after="40"/>
+            </w:pPr>
+            <w:r>
+              <w:rPr>
+                <w:rStyle w:val="VerbatimChar"/>
+                <w:rFonts w:ascii="Aptos" w:hAnsi="Aptos"/>
+                <w:sz w:val="19"/>
+              </w:rPr>
+              <w:t xml:space="preserve">docs/troubleshooting.md</w:t>
+            </w:r>
+          </w:p>
+        </w:tc>
+      </w:tr>
+      <w:tr>
+        <w:tc>
+          <w:tcPr>
+            <w:tcW w:type="dxa" w:w="2952"/>
+            <w:vAlign w:val="center"/>
+            <w:tcMar>
+              <w:top w:w="90" w:type="dxa"/>
+              <w:start w:w="120" w:type="dxa"/>
+              <w:bottom w:w="90" w:type="dxa"/>
+              <w:end w:w="120" w:type="dxa"/>
+            </w:tcMar>
+          </w:tcPr>
+          <w:p>
+            <w:pPr>
+              <w:pStyle w:val="Compact"/>
+              <w:spacing w:after="40"/>
+            </w:pPr>
+            <w:r>
+              <w:rPr>
+                <w:rFonts w:ascii="Aptos" w:hAnsi="Aptos"/>
+                <w:sz w:val="19"/>
+              </w:rPr>
               <w:t xml:space="preserve">Demo script</w:t>
             </w:r>
           </w:p>
@@ -11498,8 +11546,8 @@
         </w:tc>
       </w:tr>
     </w:tbl>
-    <w:bookmarkEnd w:id="80"/>
-    <w:bookmarkStart w:id="81" w:name="glossary"/>
+    <w:bookmarkEnd w:id="83"/>
+    <w:bookmarkStart w:id="84" w:name="glossary"/>
     <w:p>
       <w:pPr>
         <w:pStyle w:val="Heading2"/>
@@ -11661,9 +11709,9 @@
         <w:t xml:space="preserve">The current frontend shape: one main web page that loads data and updates panels dynamically.</w:t>
       </w:r>
     </w:p>
-    <w:bookmarkEnd w:id="81"/>
-    <w:bookmarkEnd w:id="82"/>
-    <w:bookmarkStart w:id="83" w:name="closing-note"/>
+    <w:bookmarkEnd w:id="84"/>
+    <w:bookmarkEnd w:id="85"/>
+    <w:bookmarkStart w:id="86" w:name="closing-note"/>
     <w:p>
       <w:pPr>
         <w:pStyle w:val="Heading1"/>
@@ -11683,13 +11731,13 @@
         <w:t xml:space="preserve">The starter kit is strongest when it stays practical: one useful local screen, clear route layers, transparent scoring, and a cloud-live path that is credible without becoming heavy. Build the smallest version that can be explained well, then extend it toward the hackathon track that matters most.</w:t>
       </w:r>
     </w:p>
-    <w:bookmarkEnd w:id="83"/>
+    <w:bookmarkEnd w:id="86"/>
     <w:sectPr>
-      <w:footerReference w:type="default" r:id="rId11"/>
+      <w:footerReference w:type="default" r:id="rId12"/>
       <w:footnotePr>
         <w:numRestart w:val="eachSect"/>
       </w:footnotePr>
-      <w:pgMar w:top="1037" w:bottom="1037" w:left="1037" w:right="1037"/>
+      <w:pgMar w:top="893" w:bottom="979" w:left="1037" w:right="1037"/>
     </w:sectPr>
   </w:body>
 </w:document>
@@ -12205,7 +12253,7 @@
       <w:rFonts w:asciiTheme="majorHAnsi" w:cstheme="majorBidi" w:eastAsiaTheme="majorEastAsia" w:hAnsiTheme="majorHAnsi" w:ascii="Aptos Display" w:hAnsi="Aptos Display"/>
       <w:b/>
       <w:color w:val="0F172A"/>
-      <w:sz w:val="76"/>
+      <w:sz w:val="72"/>
       <w:szCs w:val="56"/>
     </w:rPr>
   </w:style>

</xml_diff>

<commit_message>
Increase rebuild guide body text size
</commit_message>
<xml_diff>
--- a/docs/rebuild_guide.docx
+++ b/docs/rebuild_guide.docx
@@ -143,7 +143,7 @@
                 <w:b/>
                 <w:i w:val="0"/>
                 <w:color w:val="0F172A"/>
-                <w:sz w:val="20"/>
+                <w:sz w:val="22"/>
               </w:rPr>
               <w:t>Run locally</w:t>
             </w:r>
@@ -158,7 +158,7 @@
                 <w:b w:val="0"/>
                 <w:i w:val="0"/>
                 <w:color w:val="526178"/>
-                <w:sz w:val="16"/>
+                <w:sz w:val="20"/>
               </w:rPr>
               <w:t>Sample data, map fallback, district selector, score panel</w:t>
             </w:r>
@@ -174,7 +174,7 @@
                 <w:b w:val="0"/>
                 <w:i w:val="0"/>
                 <w:color w:val="526178"/>
-                <w:sz w:val="14"/>
+                <w:sz w:val="17"/>
               </w:rPr>
               <w:t>local</w:t>
             </w:r>
@@ -208,7 +208,7 @@
                 <w:b/>
                 <w:i w:val="0"/>
                 <w:color w:val="0F172A"/>
-                <w:sz w:val="20"/>
+                <w:sz w:val="22"/>
               </w:rPr>
               <w:t>Explain the system</w:t>
             </w:r>
@@ -223,7 +223,7 @@
                 <w:b w:val="0"/>
                 <w:i w:val="0"/>
                 <w:color w:val="526178"/>
-                <w:sz w:val="16"/>
+                <w:sz w:val="20"/>
               </w:rPr>
               <w:t>FastAPI, JavaScript, data fallback, Azure services</w:t>
             </w:r>
@@ -239,7 +239,7 @@
                 <w:b w:val="0"/>
                 <w:i w:val="0"/>
                 <w:color w:val="526178"/>
-                <w:sz w:val="14"/>
+                <w:sz w:val="17"/>
               </w:rPr>
               <w:t>system</w:t>
             </w:r>
@@ -275,7 +275,7 @@
                 <w:b/>
                 <w:i w:val="0"/>
                 <w:color w:val="0F172A"/>
-                <w:sz w:val="20"/>
+                <w:sz w:val="22"/>
               </w:rPr>
               <w:t>Deploy credibly</w:t>
             </w:r>
@@ -290,7 +290,7 @@
                 <w:b w:val="0"/>
                 <w:i w:val="0"/>
                 <w:color w:val="526178"/>
-                <w:sz w:val="16"/>
+                <w:sz w:val="20"/>
               </w:rPr>
               <w:t>Container Apps, Maps, Blob, Cosmos, App Insights</w:t>
             </w:r>
@@ -306,7 +306,7 @@
                 <w:b w:val="0"/>
                 <w:i w:val="0"/>
                 <w:color w:val="526178"/>
-                <w:sz w:val="14"/>
+                <w:sz w:val="17"/>
               </w:rPr>
               <w:t>cloud</w:t>
             </w:r>
@@ -340,7 +340,7 @@
                 <w:b/>
                 <w:i w:val="0"/>
                 <w:color w:val="0F172A"/>
-                <w:sz w:val="20"/>
+                <w:sz w:val="22"/>
               </w:rPr>
               <w:t>Adapt by track</w:t>
             </w:r>
@@ -355,7 +355,7 @@
                 <w:b w:val="0"/>
                 <w:i w:val="0"/>
                 <w:color w:val="526178"/>
-                <w:sz w:val="16"/>
+                <w:sz w:val="20"/>
               </w:rPr>
               <w:t>Technology, People, Sustainability, Culture</w:t>
             </w:r>
@@ -371,7 +371,7 @@
                 <w:b w:val="0"/>
                 <w:i w:val="0"/>
                 <w:color w:val="526178"/>
-                <w:sz w:val="14"/>
+                <w:sz w:val="17"/>
               </w:rPr>
               <w:t>reuse</w:t>
             </w:r>
@@ -459,7 +459,7 @@
                 <w:b w:val="0"/>
                 <w:i w:val="0"/>
                 <w:color w:val="FFFFFF"/>
-                <w:sz w:val="18"/>
+                <w:sz w:val="20"/>
               </w:rPr>
               <w:t>Transformational Technology | Prosperous People | Azure-backed path | Sample-first fallback</w:t>
             </w:r>
@@ -640,7 +640,7 @@
                 <w:b/>
                 <w:i w:val="0"/>
                 <w:color w:val="08182F"/>
-                <w:sz w:val="18"/>
+                <w:sz w:val="21"/>
               </w:rPr>
               <w:t>Quick access</w:t>
             </w:r>
@@ -671,7 +671,7 @@
                 <w:b/>
                 <w:i w:val="0"/>
                 <w:color w:val="08182F"/>
-                <w:sz w:val="18"/>
+                <w:sz w:val="21"/>
               </w:rPr>
               <w:t>Link / location</w:t>
             </w:r>
@@ -703,7 +703,7 @@
                 <w:b w:val="0"/>
                 <w:i w:val="0"/>
                 <w:color w:val="0F172A"/>
-                <w:sz w:val="17"/>
+                <w:sz w:val="20"/>
               </w:rPr>
               <w:t>GitHub repo</w:t>
             </w:r>
@@ -733,7 +733,7 @@
                 <w:b w:val="0"/>
                 <w:i w:val="0"/>
                 <w:color w:val="0F172A"/>
-                <w:sz w:val="17"/>
+                <w:sz w:val="20"/>
               </w:rPr>
               <w:t>https://github.com/Esturban/microsoft-hackathon-riyadh-mobility</w:t>
             </w:r>
@@ -765,7 +765,7 @@
                 <w:b w:val="0"/>
                 <w:i w:val="0"/>
                 <w:color w:val="0F172A"/>
-                <w:sz w:val="17"/>
+                <w:sz w:val="20"/>
               </w:rPr>
               <w:t>Local app</w:t>
             </w:r>
@@ -795,7 +795,7 @@
                 <w:b w:val="0"/>
                 <w:i w:val="0"/>
                 <w:color w:val="0F172A"/>
-                <w:sz w:val="17"/>
+                <w:sz w:val="20"/>
               </w:rPr>
               <w:t>http://127.0.0.1:8000</w:t>
             </w:r>
@@ -827,7 +827,7 @@
                 <w:b w:val="0"/>
                 <w:i w:val="0"/>
                 <w:color w:val="0F172A"/>
-                <w:sz w:val="17"/>
+                <w:sz w:val="20"/>
               </w:rPr>
               <w:t>Deployed app</w:t>
             </w:r>
@@ -857,7 +857,7 @@
                 <w:b w:val="0"/>
                 <w:i w:val="0"/>
                 <w:color w:val="0F172A"/>
-                <w:sz w:val="17"/>
+                <w:sz w:val="20"/>
               </w:rPr>
               <w:t>Paste WEB_APP_URL from azd output here</w:t>
             </w:r>
@@ -889,7 +889,7 @@
                 <w:b w:val="0"/>
                 <w:i w:val="0"/>
                 <w:color w:val="0F172A"/>
-                <w:sz w:val="17"/>
+                <w:sz w:val="20"/>
               </w:rPr>
               <w:t>Resource index</w:t>
             </w:r>
@@ -919,7 +919,7 @@
                 <w:b w:val="0"/>
                 <w:i w:val="0"/>
                 <w:color w:val="0F172A"/>
-                <w:sz w:val="17"/>
+                <w:sz w:val="20"/>
               </w:rPr>
               <w:t>Appendix: Azure docs, deployment notes, project references</w:t>
             </w:r>
@@ -987,7 +987,7 @@
                 <w:b/>
                 <w:i w:val="0"/>
                 <w:color w:val="0F172A"/>
-                <w:sz w:val="20"/>
+                <w:sz w:val="22"/>
               </w:rPr>
               <w:t>01 Understand app</w:t>
             </w:r>
@@ -1002,7 +1002,7 @@
                 <w:b w:val="0"/>
                 <w:i w:val="0"/>
                 <w:color w:val="526178"/>
-                <w:sz w:val="16"/>
+                <w:sz w:val="20"/>
               </w:rPr>
               <w:t>Read what the dashboard, layers, score panel, and fallback chain are doing.</w:t>
             </w:r>
@@ -1036,7 +1036,7 @@
                 <w:b/>
                 <w:i w:val="0"/>
                 <w:color w:val="0F172A"/>
-                <w:sz w:val="20"/>
+                <w:sz w:val="22"/>
               </w:rPr>
               <w:t>02 Run locally</w:t>
             </w:r>
@@ -1051,7 +1051,7 @@
                 <w:b w:val="0"/>
                 <w:i w:val="0"/>
                 <w:color w:val="526178"/>
-                <w:sz w:val="16"/>
+                <w:sz w:val="20"/>
               </w:rPr>
               <w:t>Create the Python environment, start FastAPI, and wait for the slow initial load.</w:t>
             </w:r>
@@ -1087,7 +1087,7 @@
                 <w:b/>
                 <w:i w:val="0"/>
                 <w:color w:val="0F172A"/>
-                <w:sz w:val="20"/>
+                <w:sz w:val="22"/>
               </w:rPr>
               <w:t>03 Inspect API</w:t>
             </w:r>
@@ -1102,7 +1102,7 @@
                 <w:b w:val="0"/>
                 <w:i w:val="0"/>
                 <w:color w:val="526178"/>
-                <w:sz w:val="16"/>
+                <w:sz w:val="20"/>
               </w:rPr>
               <w:t>Check /health, /api/data-status, routes, districts, and score responses.</w:t>
             </w:r>
@@ -1136,7 +1136,7 @@
                 <w:b/>
                 <w:i w:val="0"/>
                 <w:color w:val="0F172A"/>
-                <w:sz w:val="20"/>
+                <w:sz w:val="22"/>
               </w:rPr>
               <w:t>04 Select district</w:t>
             </w:r>
@@ -1151,7 +1151,7 @@
                 <w:b w:val="0"/>
                 <w:i w:val="0"/>
                 <w:color w:val="526178"/>
-                <w:sz w:val="16"/>
+                <w:sz w:val="20"/>
               </w:rPr>
               <w:t>Use Riyadh North or Al Olaya and confirm the score panel updates.</w:t>
             </w:r>
@@ -1187,7 +1187,7 @@
                 <w:b/>
                 <w:i w:val="0"/>
                 <w:color w:val="0F172A"/>
-                <w:sz w:val="20"/>
+                <w:sz w:val="22"/>
               </w:rPr>
               <w:t>05 Deploy Azure</w:t>
             </w:r>
@@ -1202,7 +1202,7 @@
                 <w:b w:val="0"/>
                 <w:i w:val="0"/>
                 <w:color w:val="526178"/>
-                <w:sz w:val="16"/>
+                <w:sz w:val="20"/>
               </w:rPr>
               <w:t>Use az login, azd auth login, and scripts/deploy_azure.sh when ready.</w:t>
             </w:r>
@@ -1236,7 +1236,7 @@
                 <w:b/>
                 <w:i w:val="0"/>
                 <w:color w:val="0F172A"/>
-                <w:sz w:val="20"/>
+                <w:sz w:val="22"/>
               </w:rPr>
               <w:t>06 Adapt track</w:t>
             </w:r>
@@ -1251,7 +1251,7 @@
                 <w:b w:val="0"/>
                 <w:i w:val="0"/>
                 <w:color w:val="526178"/>
-                <w:sz w:val="16"/>
+                <w:sz w:val="20"/>
               </w:rPr>
               <w:t>Keep the scaffold; replace data, scoring, layers, and Azure services by track.</w:t>
             </w:r>
@@ -1300,17 +1300,17 @@
                 <w:b/>
                 <w:i w:val="0"/>
                 <w:color w:val="0F172A"/>
+                <w:sz w:val="22"/>
+              </w:rPr>
+              <w:t xml:space="preserve">Local-first principle: </w:t>
+            </w:r>
+            <w:r>
+              <w:rPr>
+                <w:rFonts w:ascii="Aptos" w:hAnsi="Aptos"/>
+                <w:b w:val="0"/>
+                <w:i w:val="0"/>
+                <w:color w:val="0F172A"/>
                 <w:sz w:val="20"/>
-              </w:rPr>
-              <w:t xml:space="preserve">Local-first principle: </w:t>
-            </w:r>
-            <w:r>
-              <w:rPr>
-                <w:rFonts w:ascii="Aptos" w:hAnsi="Aptos"/>
-                <w:b w:val="0"/>
-                <w:i w:val="0"/>
-                <w:color w:val="0F172A"/>
-                <w:sz w:val="18"/>
               </w:rPr>
               <w:t>Get the dashboard working from bundled sample data before adding cloud credentials, Blob Storage, Cosmos DB, or a deployed app URL.</w:t>
             </w:r>
@@ -1499,7 +1499,7 @@
                 <w:b/>
                 <w:i w:val="0"/>
                 <w:color w:val="0F172A"/>
-                <w:sz w:val="20"/>
+                <w:sz w:val="22"/>
               </w:rPr>
               <w:t>106</w:t>
             </w:r>
@@ -1514,7 +1514,7 @@
                 <w:b w:val="0"/>
                 <w:i w:val="0"/>
                 <w:color w:val="526178"/>
-                <w:sz w:val="16"/>
+                <w:sz w:val="20"/>
               </w:rPr>
               <w:t>route records across metro and bus sample layers</w:t>
             </w:r>
@@ -1530,7 +1530,7 @@
                 <w:b w:val="0"/>
                 <w:i w:val="0"/>
                 <w:color w:val="526178"/>
-                <w:sz w:val="14"/>
+                <w:sz w:val="17"/>
               </w:rPr>
               <w:t>sample data</w:t>
             </w:r>
@@ -1564,7 +1564,7 @@
                 <w:b/>
                 <w:i w:val="0"/>
                 <w:color w:val="0F172A"/>
-                <w:sz w:val="20"/>
+                <w:sz w:val="22"/>
               </w:rPr>
               <w:t>10</w:t>
             </w:r>
@@ -1579,7 +1579,7 @@
                 <w:b w:val="0"/>
                 <w:i w:val="0"/>
                 <w:color w:val="526178"/>
-                <w:sz w:val="16"/>
+                <w:sz w:val="20"/>
               </w:rPr>
               <w:t>district records available for scoring and demos</w:t>
             </w:r>
@@ -1595,7 +1595,7 @@
                 <w:b w:val="0"/>
                 <w:i w:val="0"/>
                 <w:color w:val="526178"/>
-                <w:sz w:val="14"/>
+                <w:sz w:val="17"/>
               </w:rPr>
               <w:t>districts</w:t>
             </w:r>
@@ -1629,7 +1629,7 @@
                 <w:b/>
                 <w:i w:val="0"/>
                 <w:color w:val="0F172A"/>
-                <w:sz w:val="20"/>
+                <w:sz w:val="22"/>
               </w:rPr>
               <w:t>9</w:t>
             </w:r>
@@ -1644,7 +1644,7 @@
                 <w:b w:val="0"/>
                 <w:i w:val="0"/>
                 <w:color w:val="526178"/>
-                <w:sz w:val="16"/>
+                <w:sz w:val="20"/>
               </w:rPr>
               <w:t>API endpoints to inspect, extend, and deploy</w:t>
             </w:r>
@@ -1660,7 +1660,7 @@
                 <w:b w:val="0"/>
                 <w:i w:val="0"/>
                 <w:color w:val="526178"/>
-                <w:sz w:val="14"/>
+                <w:sz w:val="17"/>
               </w:rPr>
               <w:t>contracts</w:t>
             </w:r>
@@ -1694,7 +1694,7 @@
                 <w:b/>
                 <w:i w:val="0"/>
                 <w:color w:val="0F172A"/>
-                <w:sz w:val="20"/>
+                <w:sz w:val="22"/>
               </w:rPr>
               <w:t>7+</w:t>
             </w:r>
@@ -1709,7 +1709,7 @@
                 <w:b w:val="0"/>
                 <w:i w:val="0"/>
                 <w:color w:val="526178"/>
-                <w:sz w:val="16"/>
+                <w:sz w:val="20"/>
               </w:rPr>
               <w:t>Azure services mapped to clear runtime jobs</w:t>
             </w:r>
@@ -1725,7 +1725,7 @@
                 <w:b w:val="0"/>
                 <w:i w:val="0"/>
                 <w:color w:val="526178"/>
-                <w:sz w:val="14"/>
+                <w:sz w:val="17"/>
               </w:rPr>
               <w:t>cloud</w:t>
             </w:r>
@@ -1793,7 +1793,7 @@
                 <w:b/>
                 <w:i w:val="0"/>
                 <w:color w:val="0F172A"/>
-                <w:sz w:val="20"/>
+                <w:sz w:val="22"/>
               </w:rPr>
               <w:t>Working dashboard</w:t>
             </w:r>
@@ -1808,7 +1808,7 @@
                 <w:b w:val="0"/>
                 <w:i w:val="0"/>
                 <w:color w:val="526178"/>
-                <w:sz w:val="16"/>
+                <w:sz w:val="20"/>
               </w:rPr>
               <w:t>A connected map, district context, explainable score, and data fallback.</w:t>
             </w:r>
@@ -1842,7 +1842,7 @@
                 <w:b/>
                 <w:i w:val="0"/>
                 <w:color w:val="0F172A"/>
-                <w:sz w:val="20"/>
+                <w:sz w:val="22"/>
               </w:rPr>
               <w:t>Starter kit, not final model</w:t>
             </w:r>
@@ -1857,7 +1857,7 @@
                 <w:b w:val="0"/>
                 <w:i w:val="0"/>
                 <w:color w:val="526178"/>
-                <w:sz w:val="16"/>
+                <w:sz w:val="20"/>
               </w:rPr>
               <w:t>The score is deliberately simple; the value is the transparent scaffold.</w:t>
             </w:r>
@@ -1925,7 +1925,7 @@
                 <w:b/>
                 <w:i w:val="0"/>
                 <w:color w:val="0F172A"/>
-                <w:sz w:val="20"/>
+                <w:sz w:val="22"/>
               </w:rPr>
               <w:t>Run sample mode</w:t>
             </w:r>
@@ -1940,7 +1940,7 @@
                 <w:b w:val="0"/>
                 <w:i w:val="0"/>
                 <w:color w:val="526178"/>
-                <w:sz w:val="16"/>
+                <w:sz w:val="20"/>
               </w:rPr>
               <w:t>Confirm local app, fallback, route layers, selector, and panel.</w:t>
             </w:r>
@@ -1974,7 +1974,7 @@
                 <w:b/>
                 <w:i w:val="0"/>
                 <w:color w:val="0F172A"/>
-                <w:sz w:val="20"/>
+                <w:sz w:val="22"/>
               </w:rPr>
               <w:t>Inspect contracts</w:t>
             </w:r>
@@ -1989,7 +1989,7 @@
                 <w:b w:val="0"/>
                 <w:i w:val="0"/>
                 <w:color w:val="526178"/>
-                <w:sz w:val="16"/>
+                <w:sz w:val="20"/>
               </w:rPr>
               <w:t>Review health, data-status, routes, districts, and score.</w:t>
             </w:r>
@@ -2025,7 +2025,7 @@
                 <w:b/>
                 <w:i w:val="0"/>
                 <w:color w:val="0F172A"/>
-                <w:sz w:val="20"/>
+                <w:sz w:val="22"/>
               </w:rPr>
               <w:t>Connect Azure</w:t>
             </w:r>
@@ -2040,7 +2040,7 @@
                 <w:b w:val="0"/>
                 <w:i w:val="0"/>
                 <w:color w:val="526178"/>
-                <w:sz w:val="16"/>
+                <w:sz w:val="20"/>
               </w:rPr>
               <w:t>Deploy hosting, maps, files, records, monitoring, and diagnostics.</w:t>
             </w:r>
@@ -2074,7 +2074,7 @@
                 <w:b/>
                 <w:i w:val="0"/>
                 <w:color w:val="0F172A"/>
-                <w:sz w:val="20"/>
+                <w:sz w:val="22"/>
               </w:rPr>
               <w:t>Adapt for track</w:t>
             </w:r>
@@ -2089,7 +2089,7 @@
                 <w:b w:val="0"/>
                 <w:i w:val="0"/>
                 <w:color w:val="526178"/>
-                <w:sz w:val="16"/>
+                <w:sz w:val="20"/>
               </w:rPr>
               <w:t>Replace data and scoring while keeping the shell and deployment path.</w:t>
             </w:r>
@@ -2138,17 +2138,17 @@
                 <w:b/>
                 <w:i w:val="0"/>
                 <w:color w:val="FFFFFF"/>
+                <w:sz w:val="22"/>
+              </w:rPr>
+              <w:t xml:space="preserve">Design principle: </w:t>
+            </w:r>
+            <w:r>
+              <w:rPr>
+                <w:rFonts w:ascii="Aptos" w:hAnsi="Aptos"/>
+                <w:b w:val="0"/>
+                <w:i w:val="0"/>
+                <w:color w:val="FFFFFF"/>
                 <w:sz w:val="20"/>
-              </w:rPr>
-              <w:t xml:space="preserve">Design principle: </w:t>
-            </w:r>
-            <w:r>
-              <w:rPr>
-                <w:rFonts w:ascii="Aptos" w:hAnsi="Aptos"/>
-                <w:b w:val="0"/>
-                <w:i w:val="0"/>
-                <w:color w:val="FFFFFF"/>
-                <w:sz w:val="18"/>
               </w:rPr>
               <w:t>Keep the first successful path simple: sample data locally, transparent API behavior, then Azure services only when the team is ready to make the prototype cloud-live.</w:t>
             </w:r>
@@ -2336,7 +2336,7 @@
                 <w:b/>
                 <w:i w:val="0"/>
                 <w:color w:val="0F172A"/>
-                <w:sz w:val="20"/>
+                <w:sz w:val="22"/>
               </w:rPr>
               <w:t>Map the network</w:t>
             </w:r>
@@ -2351,7 +2351,7 @@
                 <w:b w:val="0"/>
                 <w:i w:val="0"/>
                 <w:color w:val="526178"/>
-                <w:sz w:val="16"/>
+                <w:sz w:val="20"/>
               </w:rPr>
               <w:t>Show metro and bus layers with fallback tiles when Azure Maps is not configured.</w:t>
             </w:r>
@@ -2367,7 +2367,7 @@
                 <w:b w:val="0"/>
                 <w:i w:val="0"/>
                 <w:color w:val="526178"/>
-                <w:sz w:val="14"/>
+                <w:sz w:val="17"/>
               </w:rPr>
               <w:t>app/static/src/map.js</w:t>
             </w:r>
@@ -2401,7 +2401,7 @@
                 <w:b/>
                 <w:i w:val="0"/>
                 <w:color w:val="0F172A"/>
-                <w:sz w:val="20"/>
+                <w:sz w:val="22"/>
               </w:rPr>
               <w:t>Select a district</w:t>
             </w:r>
@@ -2416,7 +2416,7 @@
                 <w:b w:val="0"/>
                 <w:i w:val="0"/>
                 <w:color w:val="526178"/>
-                <w:sz w:val="16"/>
+                <w:sz w:val="20"/>
               </w:rPr>
               <w:t>Anchor every demo around Riyadh district records.</w:t>
             </w:r>
@@ -2432,7 +2432,7 @@
                 <w:b w:val="0"/>
                 <w:i w:val="0"/>
                 <w:color w:val="526178"/>
-                <w:sz w:val="14"/>
+                <w:sz w:val="17"/>
               </w:rPr>
               <w:t>/api/districts</w:t>
             </w:r>
@@ -2466,7 +2466,7 @@
                 <w:b/>
                 <w:i w:val="0"/>
                 <w:color w:val="0F172A"/>
-                <w:sz w:val="20"/>
+                <w:sz w:val="22"/>
               </w:rPr>
               <w:t>Explain the score</w:t>
             </w:r>
@@ -2481,7 +2481,7 @@
                 <w:b w:val="0"/>
                 <w:i w:val="0"/>
                 <w:color w:val="526178"/>
-                <w:sz w:val="16"/>
+                <w:sz w:val="20"/>
               </w:rPr>
               <w:t>Turn nearby metro, bus, and event inputs into a replaceable score.</w:t>
             </w:r>
@@ -2497,7 +2497,7 @@
                 <w:b w:val="0"/>
                 <w:i w:val="0"/>
                 <w:color w:val="526178"/>
-                <w:sz w:val="14"/>
+                <w:sz w:val="17"/>
               </w:rPr>
               <w:t>app/scoring.py</w:t>
             </w:r>
@@ -2566,7 +2566,7 @@
                 <w:b/>
                 <w:i w:val="0"/>
                 <w:color w:val="0F172A"/>
-                <w:sz w:val="20"/>
+                <w:sz w:val="22"/>
               </w:rPr>
               <w:t>Run without cloud</w:t>
             </w:r>
@@ -2581,7 +2581,7 @@
                 <w:b w:val="0"/>
                 <w:i w:val="0"/>
                 <w:color w:val="526178"/>
-                <w:sz w:val="16"/>
+                <w:sz w:val="20"/>
               </w:rPr>
               <w:t>Bundled sample data keeps the app useful before Azure is ready.</w:t>
             </w:r>
@@ -2597,7 +2597,7 @@
                 <w:b w:val="0"/>
                 <w:i w:val="0"/>
                 <w:color w:val="526178"/>
-                <w:sz w:val="14"/>
+                <w:sz w:val="17"/>
               </w:rPr>
               <w:t>DATA_MODE=sample</w:t>
             </w:r>
@@ -2631,7 +2631,7 @@
                 <w:b/>
                 <w:i w:val="0"/>
                 <w:color w:val="0F172A"/>
-                <w:sz w:val="20"/>
+                <w:sz w:val="22"/>
               </w:rPr>
               <w:t>Keep contracts stable</w:t>
             </w:r>
@@ -2646,7 +2646,7 @@
                 <w:b w:val="0"/>
                 <w:i w:val="0"/>
                 <w:color w:val="526178"/>
-                <w:sz w:val="16"/>
+                <w:sz w:val="20"/>
               </w:rPr>
               <w:t>The frontend and API use the same contract locally and in Azure.</w:t>
             </w:r>
@@ -2662,7 +2662,7 @@
                 <w:b w:val="0"/>
                 <w:i w:val="0"/>
                 <w:color w:val="526178"/>
-                <w:sz w:val="14"/>
+                <w:sz w:val="17"/>
               </w:rPr>
               <w:t>FastAPI + static frontend</w:t>
             </w:r>
@@ -2696,7 +2696,7 @@
                 <w:b/>
                 <w:i w:val="0"/>
                 <w:color w:val="0F172A"/>
-                <w:sz w:val="20"/>
+                <w:sz w:val="22"/>
               </w:rPr>
               <w:t>Swap the domain</w:t>
             </w:r>
@@ -2711,7 +2711,7 @@
                 <w:b w:val="0"/>
                 <w:i w:val="0"/>
                 <w:color w:val="526178"/>
-                <w:sz w:val="16"/>
+                <w:sz w:val="20"/>
               </w:rPr>
               <w:t>Replace data, scoring, or overlays while keeping the app shell.</w:t>
             </w:r>
@@ -2727,7 +2727,7 @@
                 <w:b w:val="0"/>
                 <w:i w:val="0"/>
                 <w:color w:val="526178"/>
-                <w:sz w:val="14"/>
+                <w:sz w:val="17"/>
               </w:rPr>
               <w:t>track adaptation</w:t>
             </w:r>
@@ -2796,7 +2796,7 @@
                 <w:b/>
                 <w:i w:val="0"/>
                 <w:color w:val="0F172A"/>
-                <w:sz w:val="20"/>
+                <w:sz w:val="22"/>
               </w:rPr>
               <w:t>Visible data layers</w:t>
             </w:r>
@@ -2811,7 +2811,7 @@
                 <w:b w:val="0"/>
                 <w:i w:val="0"/>
                 <w:color w:val="526178"/>
-                <w:sz w:val="16"/>
+                <w:sz w:val="20"/>
               </w:rPr>
               <w:t>Show transit coverage, district context, and live event markers.</w:t>
             </w:r>
@@ -2827,7 +2827,7 @@
                 <w:b w:val="0"/>
                 <w:i w:val="0"/>
                 <w:color w:val="526178"/>
-                <w:sz w:val="14"/>
+                <w:sz w:val="17"/>
               </w:rPr>
               <w:t>dashboard</w:t>
             </w:r>
@@ -2861,7 +2861,7 @@
                 <w:b/>
                 <w:i w:val="0"/>
                 <w:color w:val="0F172A"/>
-                <w:sz w:val="20"/>
+                <w:sz w:val="22"/>
               </w:rPr>
               <w:t>Transparent logic</w:t>
             </w:r>
@@ -2876,7 +2876,7 @@
                 <w:b w:val="0"/>
                 <w:i w:val="0"/>
                 <w:color w:val="526178"/>
-                <w:sz w:val="16"/>
+                <w:sz w:val="20"/>
               </w:rPr>
               <w:t>The score formula is simple enough to explain live.</w:t>
             </w:r>
@@ -2892,7 +2892,7 @@
                 <w:b w:val="0"/>
                 <w:i w:val="0"/>
                 <w:color w:val="526178"/>
-                <w:sz w:val="14"/>
+                <w:sz w:val="17"/>
               </w:rPr>
               <w:t>/api/score</w:t>
             </w:r>
@@ -2926,7 +2926,7 @@
                 <w:b/>
                 <w:i w:val="0"/>
                 <w:color w:val="0F172A"/>
-                <w:sz w:val="20"/>
+                <w:sz w:val="22"/>
               </w:rPr>
               <w:t>Azure-ready path</w:t>
             </w:r>
@@ -2941,7 +2941,7 @@
                 <w:b w:val="0"/>
                 <w:i w:val="0"/>
                 <w:color w:val="526178"/>
-                <w:sz w:val="16"/>
+                <w:sz w:val="20"/>
               </w:rPr>
               <w:t>The same containerized app can move to Azure when ready.</w:t>
             </w:r>
@@ -2957,7 +2957,7 @@
                 <w:b w:val="0"/>
                 <w:i w:val="0"/>
                 <w:color w:val="526178"/>
-                <w:sz w:val="14"/>
+                <w:sz w:val="17"/>
               </w:rPr>
               <w:t>azure.yaml + infra/</w:t>
             </w:r>
@@ -3006,17 +3006,17 @@
                 <w:b/>
                 <w:i w:val="0"/>
                 <w:color w:val="FFFFFF"/>
+                <w:sz w:val="22"/>
+              </w:rPr>
+              <w:t xml:space="preserve">Product thesis: </w:t>
+            </w:r>
+            <w:r>
+              <w:rPr>
+                <w:rFonts w:ascii="Aptos" w:hAnsi="Aptos"/>
+                <w:b w:val="0"/>
+                <w:i w:val="0"/>
+                <w:color w:val="FFFFFF"/>
                 <w:sz w:val="20"/>
-              </w:rPr>
-              <w:t xml:space="preserve">Product thesis: </w:t>
-            </w:r>
-            <w:r>
-              <w:rPr>
-                <w:rFonts w:ascii="Aptos" w:hAnsi="Aptos"/>
-                <w:b w:val="0"/>
-                <w:i w:val="0"/>
-                <w:color w:val="FFFFFF"/>
-                <w:sz w:val="18"/>
               </w:rPr>
               <w:t>Prove the end-to-end build path first, then let teams make the domain model more ambitious.</w:t>
             </w:r>
@@ -3204,7 +3204,7 @@
                 <w:b/>
                 <w:i w:val="0"/>
                 <w:color w:val="0F172A"/>
-                <w:sz w:val="20"/>
+                <w:sz w:val="22"/>
               </w:rPr>
               <w:t>Transformational Technology</w:t>
             </w:r>
@@ -3219,7 +3219,7 @@
                 <w:b w:val="0"/>
                 <w:i w:val="0"/>
                 <w:color w:val="526178"/>
-                <w:sz w:val="16"/>
+                <w:sz w:val="20"/>
               </w:rPr>
               <w:t>Use mobility layers, route visibility, fallback-aware data, APIs, and Azure deployment to prove a working urban intelligence path.</w:t>
             </w:r>
@@ -3235,7 +3235,7 @@
                 <w:b w:val="0"/>
                 <w:i w:val="0"/>
                 <w:color w:val="526178"/>
-                <w:sz w:val="14"/>
+                <w:sz w:val="17"/>
               </w:rPr>
               <w:t>primary fit</w:t>
             </w:r>
@@ -3269,7 +3269,7 @@
                 <w:b/>
                 <w:i w:val="0"/>
                 <w:color w:val="0F172A"/>
-                <w:sz w:val="20"/>
+                <w:sz w:val="22"/>
               </w:rPr>
               <w:t>Prosperous People</w:t>
             </w:r>
@@ -3284,7 +3284,7 @@
                 <w:b w:val="0"/>
                 <w:i w:val="0"/>
                 <w:color w:val="526178"/>
-                <w:sz w:val="16"/>
+                <w:sz w:val="20"/>
               </w:rPr>
               <w:t>Convert the district score into service access, walkability, 15-minute city coverage, or quality-of-life comparison.</w:t>
             </w:r>
@@ -3300,7 +3300,7 @@
                 <w:b w:val="0"/>
                 <w:i w:val="0"/>
                 <w:color w:val="526178"/>
-                <w:sz w:val="14"/>
+                <w:sz w:val="17"/>
               </w:rPr>
               <w:t>strong secondary</w:t>
             </w:r>
@@ -3334,7 +3334,7 @@
                 <w:b/>
                 <w:i w:val="0"/>
                 <w:color w:val="0F172A"/>
-                <w:sz w:val="20"/>
+                <w:sz w:val="22"/>
               </w:rPr>
               <w:t>Builder pitch</w:t>
             </w:r>
@@ -3349,7 +3349,7 @@
                 <w:b w:val="0"/>
                 <w:i w:val="0"/>
                 <w:color w:val="526178"/>
-                <w:sz w:val="16"/>
+                <w:sz w:val="20"/>
               </w:rPr>
               <w:t>Show a credible local app first, then explain how the same scaffold can support richer district intelligence.</w:t>
             </w:r>
@@ -3365,7 +3365,7 @@
                 <w:b w:val="0"/>
                 <w:i w:val="0"/>
                 <w:color w:val="526178"/>
-                <w:sz w:val="14"/>
+                <w:sz w:val="17"/>
               </w:rPr>
               <w:t>demo narrative</w:t>
             </w:r>
@@ -3434,7 +3434,7 @@
                 <w:b/>
                 <w:i w:val="0"/>
                 <w:color w:val="0F172A"/>
-                <w:sz w:val="20"/>
+                <w:sz w:val="22"/>
               </w:rPr>
               <w:t>Sustainable Solutions</w:t>
             </w:r>
@@ -3449,7 +3449,7 @@
                 <w:b w:val="0"/>
                 <w:i w:val="0"/>
                 <w:color w:val="526178"/>
-                <w:sz w:val="16"/>
+                <w:sz w:val="20"/>
               </w:rPr>
               <w:t>Add AQI, heat, emissions, low-carbon route scoring, and clean-corridor recommendations after the core map works.</w:t>
             </w:r>
@@ -3465,7 +3465,7 @@
                 <w:b w:val="0"/>
                 <w:i w:val="0"/>
                 <w:color w:val="526178"/>
-                <w:sz w:val="14"/>
+                <w:sz w:val="17"/>
               </w:rPr>
               <w:t>extension</w:t>
             </w:r>
@@ -3499,7 +3499,7 @@
                 <w:b/>
                 <w:i w:val="0"/>
                 <w:color w:val="0F172A"/>
-                <w:sz w:val="20"/>
+                <w:sz w:val="22"/>
               </w:rPr>
               <w:t>Culture</w:t>
             </w:r>
@@ -3514,7 +3514,7 @@
                 <w:b w:val="0"/>
                 <w:i w:val="0"/>
                 <w:color w:val="526178"/>
-                <w:sz w:val="16"/>
+                <w:sz w:val="20"/>
               </w:rPr>
               <w:t>Add heritage sites, event-day routing, visitor flows, multilingual notes, and crowd-sensitive access planning.</w:t>
             </w:r>
@@ -3530,7 +3530,7 @@
                 <w:b w:val="0"/>
                 <w:i w:val="0"/>
                 <w:color w:val="526178"/>
-                <w:sz w:val="14"/>
+                <w:sz w:val="17"/>
               </w:rPr>
               <w:t>extension</w:t>
             </w:r>
@@ -3564,7 +3564,7 @@
                 <w:b/>
                 <w:i w:val="0"/>
                 <w:color w:val="0F172A"/>
-                <w:sz w:val="20"/>
+                <w:sz w:val="22"/>
               </w:rPr>
               <w:t>What to keep</w:t>
             </w:r>
@@ -3579,7 +3579,7 @@
                 <w:b w:val="0"/>
                 <w:i w:val="0"/>
                 <w:color w:val="526178"/>
-                <w:sz w:val="16"/>
+                <w:sz w:val="20"/>
               </w:rPr>
               <w:t>Keep the frontend shell, FastAPI contracts, sample fallback, score panel, and Azure deployment shape.</w:t>
             </w:r>
@@ -3595,7 +3595,7 @@
                 <w:b w:val="0"/>
                 <w:i w:val="0"/>
                 <w:color w:val="526178"/>
-                <w:sz w:val="14"/>
+                <w:sz w:val="17"/>
               </w:rPr>
               <w:t>reuse</w:t>
             </w:r>
@@ -3664,7 +3664,7 @@
                 <w:b/>
                 <w:i w:val="0"/>
                 <w:color w:val="0F172A"/>
-                <w:sz w:val="20"/>
+                <w:sz w:val="22"/>
               </w:rPr>
               <w:t>Maps</w:t>
             </w:r>
@@ -3679,7 +3679,7 @@
                 <w:b w:val="0"/>
                 <w:i w:val="0"/>
                 <w:color w:val="526178"/>
-                <w:sz w:val="16"/>
+                <w:sz w:val="20"/>
               </w:rPr>
               <w:t>Azure Maps supports the cloud map path once keys are configured.</w:t>
             </w:r>
@@ -3695,7 +3695,7 @@
                 <w:b w:val="0"/>
                 <w:i w:val="0"/>
                 <w:color w:val="526178"/>
-                <w:sz w:val="14"/>
+                <w:sz w:val="17"/>
               </w:rPr>
               <w:t>AZURE_MAPS_KEY</w:t>
             </w:r>
@@ -3729,7 +3729,7 @@
                 <w:b/>
                 <w:i w:val="0"/>
                 <w:color w:val="0F172A"/>
-                <w:sz w:val="20"/>
+                <w:sz w:val="22"/>
               </w:rPr>
               <w:t>Data</w:t>
             </w:r>
@@ -3744,7 +3744,7 @@
                 <w:b w:val="0"/>
                 <w:i w:val="0"/>
                 <w:color w:val="526178"/>
-                <w:sz w:val="16"/>
+                <w:sz w:val="20"/>
               </w:rPr>
               <w:t>Blob Storage and Cosmos DB support processed files and app-shaped records.</w:t>
             </w:r>
@@ -3760,7 +3760,7 @@
                 <w:b w:val="0"/>
                 <w:i w:val="0"/>
                 <w:color w:val="526178"/>
-                <w:sz w:val="14"/>
+                <w:sz w:val="17"/>
               </w:rPr>
               <w:t>Blob + Cosmos</w:t>
             </w:r>
@@ -3794,7 +3794,7 @@
                 <w:b/>
                 <w:i w:val="0"/>
                 <w:color w:val="0F172A"/>
-                <w:sz w:val="20"/>
+                <w:sz w:val="22"/>
               </w:rPr>
               <w:t>Runtime</w:t>
             </w:r>
@@ -3809,7 +3809,7 @@
                 <w:b w:val="0"/>
                 <w:i w:val="0"/>
                 <w:color w:val="526178"/>
-                <w:sz w:val="16"/>
+                <w:sz w:val="20"/>
               </w:rPr>
               <w:t>Container Apps, App Insights, and Log Analytics make the prototype deployable and observable.</w:t>
             </w:r>
@@ -3825,7 +3825,7 @@
                 <w:b w:val="0"/>
                 <w:i w:val="0"/>
                 <w:color w:val="526178"/>
-                <w:sz w:val="14"/>
+                <w:sz w:val="17"/>
               </w:rPr>
               <w:t>cloud-live</w:t>
             </w:r>
@@ -3874,17 +3874,17 @@
                 <w:b/>
                 <w:i w:val="0"/>
                 <w:color w:val="FFFFFF"/>
+                <w:sz w:val="22"/>
+              </w:rPr>
+              <w:t xml:space="preserve">Positioning rule: </w:t>
+            </w:r>
+            <w:r>
+              <w:rPr>
+                <w:rFonts w:ascii="Aptos" w:hAnsi="Aptos"/>
+                <w:b w:val="0"/>
+                <w:i w:val="0"/>
+                <w:color w:val="FFFFFF"/>
                 <w:sz w:val="20"/>
-              </w:rPr>
-              <w:t xml:space="preserve">Positioning rule: </w:t>
-            </w:r>
-            <w:r>
-              <w:rPr>
-                <w:rFonts w:ascii="Aptos" w:hAnsi="Aptos"/>
-                <w:b w:val="0"/>
-                <w:i w:val="0"/>
-                <w:color w:val="FFFFFF"/>
-                <w:sz w:val="18"/>
               </w:rPr>
               <w:t>Do not sell this as a final transport model. Sell it as a credible build path for urban intelligence prototypes.</w:t>
             </w:r>
@@ -4072,7 +4072,7 @@
                 <w:b/>
                 <w:i w:val="0"/>
                 <w:color w:val="0F172A"/>
-                <w:sz w:val="20"/>
+                <w:sz w:val="22"/>
               </w:rPr>
               <w:t>FastAPI</w:t>
             </w:r>
@@ -4087,7 +4087,7 @@
                 <w:b w:val="0"/>
                 <w:i w:val="0"/>
                 <w:color w:val="526178"/>
-                <w:sz w:val="16"/>
+                <w:sz w:val="20"/>
               </w:rPr>
               <w:t>Backend API plus static frontend serving.</w:t>
             </w:r>
@@ -4103,7 +4103,7 @@
                 <w:b w:val="0"/>
                 <w:i w:val="0"/>
                 <w:color w:val="526178"/>
-                <w:sz w:val="14"/>
+                <w:sz w:val="17"/>
               </w:rPr>
               <w:t>app/main.py, app/routes.py</w:t>
             </w:r>
@@ -4137,7 +4137,7 @@
                 <w:b/>
                 <w:i w:val="0"/>
                 <w:color w:val="0F172A"/>
-                <w:sz w:val="20"/>
+                <w:sz w:val="22"/>
               </w:rPr>
               <w:t>Vanilla JavaScript</w:t>
             </w:r>
@@ -4152,7 +4152,7 @@
                 <w:b w:val="0"/>
                 <w:i w:val="0"/>
                 <w:color w:val="526178"/>
-                <w:sz w:val="16"/>
+                <w:sz w:val="20"/>
               </w:rPr>
               <w:t>Dashboard boot, map controls, panels, and API calls.</w:t>
             </w:r>
@@ -4168,7 +4168,7 @@
                 <w:b w:val="0"/>
                 <w:i w:val="0"/>
                 <w:color w:val="526178"/>
-                <w:sz w:val="14"/>
+                <w:sz w:val="17"/>
               </w:rPr>
               <w:t>app/static/src/</w:t>
             </w:r>
@@ -4202,7 +4202,7 @@
                 <w:b/>
                 <w:i w:val="0"/>
                 <w:color w:val="0F172A"/>
-                <w:sz w:val="20"/>
+                <w:sz w:val="22"/>
               </w:rPr>
               <w:t>Sample files</w:t>
             </w:r>
@@ -4217,7 +4217,7 @@
                 <w:b w:val="0"/>
                 <w:i w:val="0"/>
                 <w:color w:val="526178"/>
-                <w:sz w:val="16"/>
+                <w:sz w:val="20"/>
               </w:rPr>
               <w:t>Guaranteed fallback so teams can demo without Azure.</w:t>
             </w:r>
@@ -4233,7 +4233,7 @@
                 <w:b w:val="0"/>
                 <w:i w:val="0"/>
                 <w:color w:val="526178"/>
-                <w:sz w:val="14"/>
+                <w:sz w:val="17"/>
               </w:rPr>
               <w:t>app/static/sample-data/</w:t>
             </w:r>
@@ -4302,7 +4302,7 @@
                 <w:b/>
                 <w:i w:val="0"/>
                 <w:color w:val="0F172A"/>
-                <w:sz w:val="20"/>
+                <w:sz w:val="22"/>
               </w:rPr>
               <w:t>Azure Maps</w:t>
             </w:r>
@@ -4317,7 +4317,7 @@
                 <w:b w:val="0"/>
                 <w:i w:val="0"/>
                 <w:color w:val="526178"/>
-                <w:sz w:val="16"/>
+                <w:sz w:val="20"/>
               </w:rPr>
               <w:t>Cloud map SDK and services when a key is configured.</w:t>
             </w:r>
@@ -4333,7 +4333,7 @@
                 <w:b w:val="0"/>
                 <w:i w:val="0"/>
                 <w:color w:val="526178"/>
-                <w:sz w:val="14"/>
+                <w:sz w:val="17"/>
               </w:rPr>
               <w:t>AZURE_MAPS_KEY</w:t>
             </w:r>
@@ -4367,7 +4367,7 @@
                 <w:b/>
                 <w:i w:val="0"/>
                 <w:color w:val="0F172A"/>
-                <w:sz w:val="20"/>
+                <w:sz w:val="22"/>
               </w:rPr>
               <w:t>Blob Storage</w:t>
             </w:r>
@@ -4382,7 +4382,7 @@
                 <w:b w:val="0"/>
                 <w:i w:val="0"/>
                 <w:color w:val="526178"/>
-                <w:sz w:val="16"/>
+                <w:sz w:val="20"/>
               </w:rPr>
               <w:t>Processed GeoJSON and JSON files for cloud data mode.</w:t>
             </w:r>
@@ -4398,7 +4398,7 @@
                 <w:b w:val="0"/>
                 <w:i w:val="0"/>
                 <w:color w:val="526178"/>
-                <w:sz w:val="14"/>
+                <w:sz w:val="17"/>
               </w:rPr>
               <w:t>upload_to_blob.py</w:t>
             </w:r>
@@ -4432,7 +4432,7 @@
                 <w:b/>
                 <w:i w:val="0"/>
                 <w:color w:val="0F172A"/>
-                <w:sz w:val="20"/>
+                <w:sz w:val="22"/>
               </w:rPr>
               <w:t>Cosmos DB</w:t>
             </w:r>
@@ -4447,7 +4447,7 @@
                 <w:b w:val="0"/>
                 <w:i w:val="0"/>
                 <w:color w:val="526178"/>
-                <w:sz w:val="16"/>
+                <w:sz w:val="20"/>
               </w:rPr>
               <w:t>Route, district, and event records for app-shaped data.</w:t>
             </w:r>
@@ -4463,7 +4463,7 @@
                 <w:b w:val="0"/>
                 <w:i w:val="0"/>
                 <w:color w:val="526178"/>
-                <w:sz w:val="14"/>
+                <w:sz w:val="17"/>
               </w:rPr>
               <w:t>seed_cosmos.py</w:t>
             </w:r>
@@ -4532,7 +4532,7 @@
                 <w:b/>
                 <w:i w:val="0"/>
                 <w:color w:val="0F172A"/>
-                <w:sz w:val="20"/>
+                <w:sz w:val="22"/>
               </w:rPr>
               <w:t>Container Apps</w:t>
             </w:r>
@@ -4547,7 +4547,7 @@
                 <w:b w:val="0"/>
                 <w:i w:val="0"/>
                 <w:color w:val="526178"/>
-                <w:sz w:val="16"/>
+                <w:sz w:val="20"/>
               </w:rPr>
               <w:t>Hosted FastAPI/frontend runtime.</w:t>
             </w:r>
@@ -4563,7 +4563,7 @@
                 <w:b w:val="0"/>
                 <w:i w:val="0"/>
                 <w:color w:val="526178"/>
-                <w:sz w:val="14"/>
+                <w:sz w:val="17"/>
               </w:rPr>
               <w:t>azure.yaml, infra/main.bicep</w:t>
             </w:r>
@@ -4597,7 +4597,7 @@
                 <w:b/>
                 <w:i w:val="0"/>
                 <w:color w:val="0F172A"/>
-                <w:sz w:val="20"/>
+                <w:sz w:val="22"/>
               </w:rPr>
               <w:t>Container Registry</w:t>
             </w:r>
@@ -4612,7 +4612,7 @@
                 <w:b w:val="0"/>
                 <w:i w:val="0"/>
                 <w:color w:val="526178"/>
-                <w:sz w:val="16"/>
+                <w:sz w:val="20"/>
               </w:rPr>
               <w:t>Container image storage for the deployed app.</w:t>
             </w:r>
@@ -4628,7 +4628,7 @@
                 <w:b w:val="0"/>
                 <w:i w:val="0"/>
                 <w:color w:val="526178"/>
-                <w:sz w:val="14"/>
+                <w:sz w:val="17"/>
               </w:rPr>
               <w:t>infra/modules/</w:t>
             </w:r>
@@ -4662,7 +4662,7 @@
                 <w:b/>
                 <w:i w:val="0"/>
                 <w:color w:val="0F172A"/>
-                <w:sz w:val="20"/>
+                <w:sz w:val="22"/>
               </w:rPr>
               <w:t>App Insights + Logs</w:t>
             </w:r>
@@ -4677,7 +4677,7 @@
                 <w:b w:val="0"/>
                 <w:i w:val="0"/>
                 <w:color w:val="526178"/>
-                <w:sz w:val="16"/>
+                <w:sz w:val="20"/>
               </w:rPr>
               <w:t>Health, failures, latency, requests, and diagnostics.</w:t>
             </w:r>
@@ -4693,7 +4693,7 @@
                 <w:b w:val="0"/>
                 <w:i w:val="0"/>
                 <w:color w:val="526178"/>
-                <w:sz w:val="14"/>
+                <w:sz w:val="17"/>
               </w:rPr>
               <w:t>Azure portal</w:t>
             </w:r>
@@ -4762,7 +4762,7 @@
                 <w:b/>
                 <w:i w:val="0"/>
                 <w:color w:val="0F172A"/>
-                <w:sz w:val="20"/>
+                <w:sz w:val="22"/>
               </w:rPr>
               <w:t>Bicep</w:t>
             </w:r>
@@ -4777,7 +4777,7 @@
                 <w:b w:val="0"/>
                 <w:i w:val="0"/>
                 <w:color w:val="526178"/>
-                <w:sz w:val="16"/>
+                <w:sz w:val="20"/>
               </w:rPr>
               <w:t>Infrastructure-as-code for reproducible Azure resources.</w:t>
             </w:r>
@@ -4793,7 +4793,7 @@
                 <w:b w:val="0"/>
                 <w:i w:val="0"/>
                 <w:color w:val="526178"/>
-                <w:sz w:val="14"/>
+                <w:sz w:val="17"/>
               </w:rPr>
               <w:t>infra/main.bicep</w:t>
             </w:r>
@@ -4827,7 +4827,7 @@
                 <w:b/>
                 <w:i w:val="0"/>
                 <w:color w:val="0F172A"/>
-                <w:sz w:val="20"/>
+                <w:sz w:val="22"/>
               </w:rPr>
               <w:t>Azure Developer CLI</w:t>
             </w:r>
@@ -4842,7 +4842,7 @@
                 <w:b w:val="0"/>
                 <w:i w:val="0"/>
                 <w:color w:val="526178"/>
-                <w:sz w:val="16"/>
+                <w:sz w:val="20"/>
               </w:rPr>
               <w:t>Environment provisioning and deploy workflow.</w:t>
             </w:r>
@@ -4858,7 +4858,7 @@
                 <w:b w:val="0"/>
                 <w:i w:val="0"/>
                 <w:color w:val="526178"/>
-                <w:sz w:val="14"/>
+                <w:sz w:val="17"/>
               </w:rPr>
               <w:t>azd / deploy script</w:t>
             </w:r>
@@ -4892,7 +4892,7 @@
                 <w:b/>
                 <w:i w:val="0"/>
                 <w:color w:val="0F172A"/>
-                <w:sz w:val="20"/>
+                <w:sz w:val="22"/>
               </w:rPr>
               <w:t>Tests</w:t>
             </w:r>
@@ -4907,7 +4907,7 @@
                 <w:b w:val="0"/>
                 <w:i w:val="0"/>
                 <w:color w:val="526178"/>
-                <w:sz w:val="16"/>
+                <w:sz w:val="20"/>
               </w:rPr>
               <w:t>API, data-shape, health, and scoring checks.</w:t>
             </w:r>
@@ -4923,7 +4923,7 @@
                 <w:b w:val="0"/>
                 <w:i w:val="0"/>
                 <w:color w:val="526178"/>
-                <w:sz w:val="14"/>
+                <w:sz w:val="17"/>
               </w:rPr>
               <w:t>tests/</w:t>
             </w:r>
@@ -5110,7 +5110,7 @@
                 <w:b/>
                 <w:i w:val="0"/>
                 <w:color w:val="0F172A"/>
-                <w:sz w:val="20"/>
+                <w:sz w:val="22"/>
               </w:rPr>
               <w:t>Local-first path</w:t>
             </w:r>
@@ -5125,7 +5125,7 @@
                 <w:b w:val="0"/>
                 <w:i w:val="0"/>
                 <w:color w:val="526178"/>
-                <w:sz w:val="16"/>
+                <w:sz w:val="20"/>
               </w:rPr>
               <w:t>Browser -&gt; FastAPI -&gt; static frontend/API -&gt; bundled sample data -&gt; score panel.</w:t>
             </w:r>
@@ -5141,7 +5141,7 @@
                 <w:b w:val="0"/>
                 <w:i w:val="0"/>
                 <w:color w:val="526178"/>
-                <w:sz w:val="14"/>
+                <w:sz w:val="17"/>
               </w:rPr>
               <w:t>no Azure required</w:t>
             </w:r>
@@ -5175,7 +5175,7 @@
                 <w:b/>
                 <w:i w:val="0"/>
                 <w:color w:val="0F172A"/>
-                <w:sz w:val="20"/>
+                <w:sz w:val="22"/>
               </w:rPr>
               <w:t>Azure-backed path</w:t>
             </w:r>
@@ -5190,7 +5190,7 @@
                 <w:b w:val="0"/>
                 <w:i w:val="0"/>
                 <w:color w:val="526178"/>
-                <w:sz w:val="16"/>
+                <w:sz w:val="20"/>
               </w:rPr>
               <w:t>Browser -&gt; Container Apps -&gt; FastAPI -&gt; Azure Maps / Blob / Cosmos / App Insights.</w:t>
             </w:r>
@@ -5206,7 +5206,7 @@
                 <w:b w:val="0"/>
                 <w:i w:val="0"/>
                 <w:color w:val="526178"/>
-                <w:sz w:val="14"/>
+                <w:sz w:val="17"/>
               </w:rPr>
               <w:t>cloud-live</w:t>
             </w:r>
@@ -5242,7 +5242,7 @@
                 <w:b/>
                 <w:i w:val="0"/>
                 <w:color w:val="0F172A"/>
-                <w:sz w:val="20"/>
+                <w:sz w:val="22"/>
               </w:rPr>
               <w:t>Fallback chain</w:t>
             </w:r>
@@ -5257,7 +5257,7 @@
                 <w:b w:val="0"/>
                 <w:i w:val="0"/>
                 <w:color w:val="526178"/>
-                <w:sz w:val="16"/>
+                <w:sz w:val="20"/>
               </w:rPr>
               <w:t>Cosmos when configured -&gt; Blob when configured -&gt; bundled sample files always.</w:t>
             </w:r>
@@ -5273,7 +5273,7 @@
                 <w:b w:val="0"/>
                 <w:i w:val="0"/>
                 <w:color w:val="526178"/>
-                <w:sz w:val="14"/>
+                <w:sz w:val="17"/>
               </w:rPr>
               <w:t>resilient data</w:t>
             </w:r>
@@ -5307,7 +5307,7 @@
                 <w:b/>
                 <w:i w:val="0"/>
                 <w:color w:val="0F172A"/>
-                <w:sz w:val="20"/>
+                <w:sz w:val="22"/>
               </w:rPr>
               <w:t>Score request flow</w:t>
             </w:r>
@@ -5322,7 +5322,7 @@
                 <w:b w:val="0"/>
                 <w:i w:val="0"/>
                 <w:color w:val="526178"/>
-                <w:sz w:val="16"/>
+                <w:sz w:val="20"/>
               </w:rPr>
               <w:t>User selects district -&gt; frontend calls /api/score -&gt; backend loads data -&gt; panel renders result.</w:t>
             </w:r>
@@ -5338,7 +5338,7 @@
                 <w:b w:val="0"/>
                 <w:i w:val="0"/>
                 <w:color w:val="526178"/>
-                <w:sz w:val="14"/>
+                <w:sz w:val="17"/>
               </w:rPr>
               <w:t>explainable</w:t>
             </w:r>
@@ -5406,7 +5406,7 @@
                 <w:b/>
                 <w:i w:val="0"/>
                 <w:color w:val="0F172A"/>
-                <w:sz w:val="20"/>
+                <w:sz w:val="22"/>
               </w:rPr>
               <w:t>Browser to backend</w:t>
             </w:r>
@@ -5421,7 +5421,7 @@
                 <w:b w:val="0"/>
                 <w:i w:val="0"/>
                 <w:color w:val="526178"/>
-                <w:sz w:val="16"/>
+                <w:sz w:val="20"/>
               </w:rPr>
               <w:t>Browser opens the static dashboard served by FastAPI.</w:t>
             </w:r>
@@ -5437,7 +5437,7 @@
                 <w:b w:val="0"/>
                 <w:i w:val="0"/>
                 <w:color w:val="526178"/>
-                <w:sz w:val="14"/>
+                <w:sz w:val="17"/>
               </w:rPr>
               <w:t>Browser -&gt; FastAPI</w:t>
             </w:r>
@@ -5471,7 +5471,7 @@
                 <w:b/>
                 <w:i w:val="0"/>
                 <w:color w:val="0F172A"/>
-                <w:sz w:val="20"/>
+                <w:sz w:val="22"/>
               </w:rPr>
               <w:t>Backend to data</w:t>
             </w:r>
@@ -5486,7 +5486,7 @@
                 <w:b w:val="0"/>
                 <w:i w:val="0"/>
                 <w:color w:val="526178"/>
-                <w:sz w:val="16"/>
+                <w:sz w:val="20"/>
               </w:rPr>
               <w:t>FastAPI loads Cosmos, Blob, or bundled sample files through one data-access layer.</w:t>
             </w:r>
@@ -5502,7 +5502,7 @@
                 <w:b w:val="0"/>
                 <w:i w:val="0"/>
                 <w:color w:val="526178"/>
-                <w:sz w:val="14"/>
+                <w:sz w:val="17"/>
               </w:rPr>
               <w:t>API -&gt; data</w:t>
             </w:r>
@@ -5538,7 +5538,7 @@
                 <w:b/>
                 <w:i w:val="0"/>
                 <w:color w:val="0F172A"/>
-                <w:sz w:val="20"/>
+                <w:sz w:val="22"/>
               </w:rPr>
               <w:t>Data to interface</w:t>
             </w:r>
@@ -5553,7 +5553,7 @@
                 <w:b w:val="0"/>
                 <w:i w:val="0"/>
                 <w:color w:val="526178"/>
-                <w:sz w:val="16"/>
+                <w:sz w:val="20"/>
               </w:rPr>
               <w:t>GeoJSON, route records, events, and score components return to the dashboard.</w:t>
             </w:r>
@@ -5569,7 +5569,7 @@
                 <w:b w:val="0"/>
                 <w:i w:val="0"/>
                 <w:color w:val="526178"/>
-                <w:sz w:val="14"/>
+                <w:sz w:val="17"/>
               </w:rPr>
               <w:t>data -&gt; UI</w:t>
             </w:r>
@@ -5603,7 +5603,7 @@
                 <w:b/>
                 <w:i w:val="0"/>
                 <w:color w:val="0F172A"/>
-                <w:sz w:val="20"/>
+                <w:sz w:val="22"/>
               </w:rPr>
               <w:t>Fallback order</w:t>
             </w:r>
@@ -5618,7 +5618,7 @@
                 <w:b w:val="0"/>
                 <w:i w:val="0"/>
                 <w:color w:val="526178"/>
-                <w:sz w:val="16"/>
+                <w:sz w:val="20"/>
               </w:rPr>
               <w:t>Use Cosmos when configured, Blob when configured, and sample files always.</w:t>
             </w:r>
@@ -5634,7 +5634,7 @@
                 <w:b w:val="0"/>
                 <w:i w:val="0"/>
                 <w:color w:val="526178"/>
-                <w:sz w:val="14"/>
+                <w:sz w:val="17"/>
               </w:rPr>
               <w:t>Cosmos -&gt; Blob -&gt; sample</w:t>
             </w:r>
@@ -5683,17 +5683,17 @@
                 <w:b/>
                 <w:i w:val="0"/>
                 <w:color w:val="FFFFFF"/>
+                <w:sz w:val="22"/>
+              </w:rPr>
+              <w:t xml:space="preserve">Builder move: </w:t>
+            </w:r>
+            <w:r>
+              <w:rPr>
+                <w:rFonts w:ascii="Aptos" w:hAnsi="Aptos"/>
+                <w:b w:val="0"/>
+                <w:i w:val="0"/>
+                <w:color w:val="FFFFFF"/>
                 <w:sz w:val="20"/>
-              </w:rPr>
-              <w:t xml:space="preserve">Builder move: </w:t>
-            </w:r>
-            <w:r>
-              <w:rPr>
-                <w:rFonts w:ascii="Aptos" w:hAnsi="Aptos"/>
-                <w:b w:val="0"/>
-                <w:i w:val="0"/>
-                <w:color w:val="FFFFFF"/>
-                <w:sz w:val="18"/>
               </w:rPr>
               <w:t>Start with DATA_MODE=sample, then move to Blob or Cosmos only after the local app is working.</w:t>
             </w:r>
@@ -5775,7 +5775,7 @@
                 <w:b w:val="0"/>
                 <w:i w:val="0"/>
                 <w:color w:val="0F172A"/>
-                <w:sz w:val="17"/>
+                <w:sz w:val="19"/>
               </w:rPr>
               <w:t>riyadh-mobility-intelligence-dashboard/</w:t>
               <w:br/>
@@ -5842,7 +5842,7 @@
                 <w:b/>
                 <w:i w:val="0"/>
                 <w:color w:val="08182F"/>
-                <w:sz w:val="18"/>
+                <w:sz w:val="21"/>
               </w:rPr>
               <w:t>Area</w:t>
             </w:r>
@@ -5873,7 +5873,7 @@
                 <w:b/>
                 <w:i w:val="0"/>
                 <w:color w:val="08182F"/>
-                <w:sz w:val="18"/>
+                <w:sz w:val="21"/>
               </w:rPr>
               <w:t>Start here</w:t>
             </w:r>
@@ -5904,7 +5904,7 @@
                 <w:b/>
                 <w:i w:val="0"/>
                 <w:color w:val="08182F"/>
-                <w:sz w:val="18"/>
+                <w:sz w:val="21"/>
               </w:rPr>
               <w:t>Why it matters</w:t>
             </w:r>
@@ -5936,7 +5936,7 @@
                 <w:b w:val="0"/>
                 <w:i w:val="0"/>
                 <w:color w:val="0F172A"/>
-                <w:sz w:val="17"/>
+                <w:sz w:val="20"/>
               </w:rPr>
               <w:t>Backend entrypoints</w:t>
             </w:r>
@@ -5966,7 +5966,7 @@
                 <w:b w:val="0"/>
                 <w:i w:val="0"/>
                 <w:color w:val="0F172A"/>
-                <w:sz w:val="17"/>
+                <w:sz w:val="20"/>
               </w:rPr>
               <w:t>app/main.py, app/routes.py</w:t>
             </w:r>
@@ -5996,7 +5996,7 @@
                 <w:b w:val="0"/>
                 <w:i w:val="0"/>
                 <w:color w:val="0F172A"/>
-                <w:sz w:val="17"/>
+                <w:sz w:val="20"/>
               </w:rPr>
               <w:t>FastAPI app shell, static serving, API contract</w:t>
             </w:r>
@@ -6028,7 +6028,7 @@
                 <w:b w:val="0"/>
                 <w:i w:val="0"/>
                 <w:color w:val="0F172A"/>
-                <w:sz w:val="17"/>
+                <w:sz w:val="20"/>
               </w:rPr>
               <w:t>Data loading</w:t>
             </w:r>
@@ -6058,7 +6058,7 @@
                 <w:b w:val="0"/>
                 <w:i w:val="0"/>
                 <w:color w:val="0F172A"/>
-                <w:sz w:val="17"/>
+                <w:sz w:val="20"/>
               </w:rPr>
               <w:t>app/data_access.py, app/static/sample-data/</w:t>
             </w:r>
@@ -6088,7 +6088,7 @@
                 <w:b w:val="0"/>
                 <w:i w:val="0"/>
                 <w:color w:val="0F172A"/>
-                <w:sz w:val="17"/>
+                <w:sz w:val="20"/>
               </w:rPr>
               <w:t>sample, Blob, and Cosmos fallback behavior</w:t>
             </w:r>
@@ -6120,7 +6120,7 @@
                 <w:b w:val="0"/>
                 <w:i w:val="0"/>
                 <w:color w:val="0F172A"/>
-                <w:sz w:val="17"/>
+                <w:sz w:val="20"/>
               </w:rPr>
               <w:t>Score formula</w:t>
             </w:r>
@@ -6150,7 +6150,7 @@
                 <w:b w:val="0"/>
                 <w:i w:val="0"/>
                 <w:color w:val="0F172A"/>
-                <w:sz w:val="17"/>
+                <w:sz w:val="20"/>
               </w:rPr>
               <w:t>app/scoring.py</w:t>
             </w:r>
@@ -6180,7 +6180,7 @@
                 <w:b w:val="0"/>
                 <w:i w:val="0"/>
                 <w:color w:val="0F172A"/>
-                <w:sz w:val="17"/>
+                <w:sz w:val="20"/>
               </w:rPr>
               <w:t>transparent scoring logic that teams can adapt</w:t>
             </w:r>
@@ -6212,7 +6212,7 @@
                 <w:b w:val="0"/>
                 <w:i w:val="0"/>
                 <w:color w:val="0F172A"/>
-                <w:sz w:val="17"/>
+                <w:sz w:val="20"/>
               </w:rPr>
               <w:t>Frontend</w:t>
             </w:r>
@@ -6242,7 +6242,7 @@
                 <w:b w:val="0"/>
                 <w:i w:val="0"/>
                 <w:color w:val="0F172A"/>
-                <w:sz w:val="17"/>
+                <w:sz w:val="20"/>
               </w:rPr>
               <w:t>app/static/index.html, app/static/src/main.js</w:t>
             </w:r>
@@ -6272,7 +6272,7 @@
                 <w:b w:val="0"/>
                 <w:i w:val="0"/>
                 <w:color w:val="0F172A"/>
-                <w:sz w:val="17"/>
+                <w:sz w:val="20"/>
               </w:rPr>
               <w:t>page shell, boot sequence, API orchestration</w:t>
             </w:r>
@@ -6304,7 +6304,7 @@
                 <w:b w:val="0"/>
                 <w:i w:val="0"/>
                 <w:color w:val="0F172A"/>
-                <w:sz w:val="17"/>
+                <w:sz w:val="20"/>
               </w:rPr>
               <w:t>Map behavior</w:t>
             </w:r>
@@ -6334,7 +6334,7 @@
                 <w:b w:val="0"/>
                 <w:i w:val="0"/>
                 <w:color w:val="0F172A"/>
-                <w:sz w:val="17"/>
+                <w:sz w:val="20"/>
               </w:rPr>
               <w:t>app/static/src/map.js, app/static/src/layers.js</w:t>
             </w:r>
@@ -6364,7 +6364,7 @@
                 <w:b w:val="0"/>
                 <w:i w:val="0"/>
                 <w:color w:val="0F172A"/>
-                <w:sz w:val="17"/>
+                <w:sz w:val="20"/>
               </w:rPr>
               <w:t>Azure Maps path, local fallback, overlays</w:t>
             </w:r>
@@ -6396,7 +6396,7 @@
                 <w:b w:val="0"/>
                 <w:i w:val="0"/>
                 <w:color w:val="0F172A"/>
-                <w:sz w:val="17"/>
+                <w:sz w:val="20"/>
               </w:rPr>
               <w:t>Deployment</w:t>
             </w:r>
@@ -6426,7 +6426,7 @@
                 <w:b w:val="0"/>
                 <w:i w:val="0"/>
                 <w:color w:val="0F172A"/>
-                <w:sz w:val="17"/>
+                <w:sz w:val="20"/>
               </w:rPr>
               <w:t>azure.yaml, infra/main.bicep, scripts/deploy_azure.sh</w:t>
             </w:r>
@@ -6456,7 +6456,7 @@
                 <w:b w:val="0"/>
                 <w:i w:val="0"/>
                 <w:color w:val="0F172A"/>
-                <w:sz w:val="17"/>
+                <w:sz w:val="20"/>
               </w:rPr>
               <w:t>cloud-live path</w:t>
             </w:r>
@@ -6488,7 +6488,7 @@
                 <w:b w:val="0"/>
                 <w:i w:val="0"/>
                 <w:color w:val="0F172A"/>
-                <w:sz w:val="17"/>
+                <w:sz w:val="20"/>
               </w:rPr>
               <w:t>Tests</w:t>
             </w:r>
@@ -6518,7 +6518,7 @@
                 <w:b w:val="0"/>
                 <w:i w:val="0"/>
                 <w:color w:val="0F172A"/>
-                <w:sz w:val="17"/>
+                <w:sz w:val="20"/>
               </w:rPr>
               <w:t>tests/</w:t>
             </w:r>
@@ -6548,7 +6548,7 @@
                 <w:b w:val="0"/>
                 <w:i w:val="0"/>
                 <w:color w:val="0F172A"/>
-                <w:sz w:val="17"/>
+                <w:sz w:val="20"/>
               </w:rPr>
               <w:t>API, data-shape, health, and scoring checks</w:t>
             </w:r>
@@ -6627,7 +6627,7 @@
                 <w:b/>
                 <w:i w:val="0"/>
                 <w:color w:val="08182F"/>
-                <w:sz w:val="18"/>
+                <w:sz w:val="21"/>
               </w:rPr>
               <w:t>File</w:t>
             </w:r>
@@ -6658,7 +6658,7 @@
                 <w:b/>
                 <w:i w:val="0"/>
                 <w:color w:val="08182F"/>
-                <w:sz w:val="18"/>
+                <w:sz w:val="21"/>
               </w:rPr>
               <w:t>Contents</w:t>
             </w:r>
@@ -6689,7 +6689,7 @@
                 <w:b/>
                 <w:i w:val="0"/>
                 <w:color w:val="08182F"/>
-                <w:sz w:val="18"/>
+                <w:sz w:val="21"/>
               </w:rPr>
               <w:t>Records</w:t>
             </w:r>
@@ -6721,7 +6721,7 @@
                 <w:b w:val="0"/>
                 <w:i w:val="0"/>
                 <w:color w:val="0F172A"/>
-                <w:sz w:val="17"/>
+                <w:sz w:val="20"/>
               </w:rPr>
               <w:t>riyadh_metro_lines_sample.geojson</w:t>
             </w:r>
@@ -6751,7 +6751,7 @@
                 <w:b w:val="0"/>
                 <w:i w:val="0"/>
                 <w:color w:val="0F172A"/>
-                <w:sz w:val="17"/>
+                <w:sz w:val="20"/>
               </w:rPr>
               <w:t>Metro line features with names, colors, and geometry</w:t>
             </w:r>
@@ -6781,7 +6781,7 @@
                 <w:b w:val="0"/>
                 <w:i w:val="0"/>
                 <w:color w:val="0F172A"/>
-                <w:sz w:val="17"/>
+                <w:sz w:val="20"/>
               </w:rPr>
               <w:t>6</w:t>
             </w:r>
@@ -6813,7 +6813,7 @@
                 <w:b w:val="0"/>
                 <w:i w:val="0"/>
                 <w:color w:val="0F172A"/>
-                <w:sz w:val="17"/>
+                <w:sz w:val="20"/>
               </w:rPr>
               <w:t>riyadh_bus_routes_sample.geojson</w:t>
             </w:r>
@@ -6843,7 +6843,7 @@
                 <w:b w:val="0"/>
                 <w:i w:val="0"/>
                 <w:color w:val="0F172A"/>
-                <w:sz w:val="17"/>
+                <w:sz w:val="20"/>
               </w:rPr>
               <w:t>Bus route features with route IDs and geometry</w:t>
             </w:r>
@@ -6873,7 +6873,7 @@
                 <w:b w:val="0"/>
                 <w:i w:val="0"/>
                 <w:color w:val="0F172A"/>
-                <w:sz w:val="17"/>
+                <w:sz w:val="20"/>
               </w:rPr>
               <w:t>100</w:t>
             </w:r>
@@ -6905,7 +6905,7 @@
                 <w:b w:val="0"/>
                 <w:i w:val="0"/>
                 <w:color w:val="0F172A"/>
-                <w:sz w:val="17"/>
+                <w:sz w:val="20"/>
               </w:rPr>
               <w:t>district_centers_sample.geojson</w:t>
             </w:r>
@@ -6935,7 +6935,7 @@
                 <w:b w:val="0"/>
                 <w:i w:val="0"/>
                 <w:color w:val="0F172A"/>
-                <w:sz w:val="17"/>
+                <w:sz w:val="20"/>
               </w:rPr>
               <w:t>Riyadh district center points with English and Arabic names</w:t>
             </w:r>
@@ -6965,7 +6965,7 @@
                 <w:b w:val="0"/>
                 <w:i w:val="0"/>
                 <w:color w:val="0F172A"/>
-                <w:sz w:val="17"/>
+                <w:sz w:val="20"/>
               </w:rPr>
               <w:t>10</w:t>
             </w:r>
@@ -6997,7 +6997,7 @@
                 <w:b w:val="0"/>
                 <w:i w:val="0"/>
                 <w:color w:val="0F172A"/>
-                <w:sz w:val="17"/>
+                <w:sz w:val="20"/>
               </w:rPr>
               <w:t>mock_live_events_sample.json</w:t>
             </w:r>
@@ -7027,7 +7027,7 @@
                 <w:b w:val="0"/>
                 <w:i w:val="0"/>
                 <w:color w:val="0F172A"/>
-                <w:sz w:val="17"/>
+                <w:sz w:val="20"/>
               </w:rPr>
               <w:t>Sample delay or incident markers</w:t>
             </w:r>
@@ -7057,7 +7057,7 @@
                 <w:b w:val="0"/>
                 <w:i w:val="0"/>
                 <w:color w:val="0F172A"/>
-                <w:sz w:val="17"/>
+                <w:sz w:val="20"/>
               </w:rPr>
               <w:t>variable</w:t>
             </w:r>
@@ -7220,7 +7220,7 @@
                 <w:b w:val="0"/>
                 <w:i w:val="0"/>
                 <w:color w:val="0F172A"/>
-                <w:sz w:val="17"/>
+                <w:sz w:val="19"/>
               </w:rPr>
               <w:t>git clone https://github.com/Esturban/microsoft-hackathon-riyadh-mobility.git</w:t>
               <w:br/>
@@ -7279,7 +7279,7 @@
                 <w:b w:val="0"/>
                 <w:i w:val="0"/>
                 <w:color w:val="0F172A"/>
-                <w:sz w:val="17"/>
+                <w:sz w:val="19"/>
               </w:rPr>
               <w:t>DATA_MODE=sample</w:t>
               <w:br/>
@@ -7332,17 +7332,17 @@
                 <w:b/>
                 <w:i w:val="0"/>
                 <w:color w:val="0F172A"/>
+                <w:sz w:val="22"/>
+              </w:rPr>
+              <w:t xml:space="preserve">Slow-load warning: </w:t>
+            </w:r>
+            <w:r>
+              <w:rPr>
+                <w:rFonts w:ascii="Aptos" w:hAnsi="Aptos"/>
+                <w:b w:val="0"/>
+                <w:i w:val="0"/>
+                <w:color w:val="0F172A"/>
                 <w:sz w:val="20"/>
-              </w:rPr>
-              <w:t xml:space="preserve">Slow-load warning: </w:t>
-            </w:r>
-            <w:r>
-              <w:rPr>
-                <w:rFonts w:ascii="Aptos" w:hAnsi="Aptos"/>
-                <w:b w:val="0"/>
-                <w:i w:val="0"/>
-                <w:color w:val="0F172A"/>
-                <w:sz w:val="18"/>
               </w:rPr>
               <w:t>The first page load can take time. Wait for the district selector, layer controls, map container, and score panel before judging success.</w:t>
             </w:r>
@@ -7566,7 +7566,7 @@
                 <w:b/>
                 <w:i w:val="0"/>
                 <w:color w:val="0F172A"/>
-                <w:sz w:val="20"/>
+                <w:sz w:val="22"/>
               </w:rPr>
               <w:t>Dashboard loads</w:t>
             </w:r>
@@ -7581,7 +7581,7 @@
                 <w:b w:val="0"/>
                 <w:i w:val="0"/>
                 <w:color w:val="526178"/>
-                <w:sz w:val="16"/>
+                <w:sz w:val="20"/>
               </w:rPr>
               <w:t>Open http://127.0.0.1:8000 and wait for the app shell.</w:t>
             </w:r>
@@ -7597,7 +7597,7 @@
                 <w:b w:val="0"/>
                 <w:i w:val="0"/>
                 <w:color w:val="526178"/>
-                <w:sz w:val="14"/>
+                <w:sz w:val="17"/>
               </w:rPr>
               <w:t>local browser</w:t>
             </w:r>
@@ -7631,7 +7631,7 @@
                 <w:b/>
                 <w:i w:val="0"/>
                 <w:color w:val="0F172A"/>
-                <w:sz w:val="20"/>
+                <w:sz w:val="22"/>
               </w:rPr>
               <w:t>Map renders</w:t>
             </w:r>
@@ -7646,7 +7646,7 @@
                 <w:b w:val="0"/>
                 <w:i w:val="0"/>
                 <w:color w:val="526178"/>
-                <w:sz w:val="16"/>
+                <w:sz w:val="20"/>
               </w:rPr>
               <w:t>Azure Maps or OpenStreetMap should render with route overlays.</w:t>
             </w:r>
@@ -7662,7 +7662,7 @@
                 <w:b w:val="0"/>
                 <w:i w:val="0"/>
                 <w:color w:val="526178"/>
-                <w:sz w:val="14"/>
+                <w:sz w:val="17"/>
               </w:rPr>
               <w:t>map + fallback</w:t>
             </w:r>
@@ -7696,7 +7696,7 @@
                 <w:b/>
                 <w:i w:val="0"/>
                 <w:color w:val="0F172A"/>
-                <w:sz w:val="20"/>
+                <w:sz w:val="22"/>
               </w:rPr>
               <w:t>Districts appear</w:t>
             </w:r>
@@ -7711,7 +7711,7 @@
                 <w:b w:val="0"/>
                 <w:i w:val="0"/>
                 <w:color w:val="526178"/>
-                <w:sz w:val="16"/>
+                <w:sz w:val="20"/>
               </w:rPr>
               <w:t>The selector should show 10 districts and update the panel.</w:t>
             </w:r>
@@ -7727,7 +7727,7 @@
                 <w:b w:val="0"/>
                 <w:i w:val="0"/>
                 <w:color w:val="526178"/>
-                <w:sz w:val="14"/>
+                <w:sz w:val="17"/>
               </w:rPr>
               <w:t>district selector</w:t>
             </w:r>
@@ -7796,7 +7796,7 @@
                 <w:b/>
                 <w:i w:val="0"/>
                 <w:color w:val="0F172A"/>
-                <w:sz w:val="20"/>
+                <w:sz w:val="22"/>
               </w:rPr>
               <w:t>Health endpoint</w:t>
             </w:r>
@@ -7811,7 +7811,7 @@
                 <w:b w:val="0"/>
                 <w:i w:val="0"/>
                 <w:color w:val="526178"/>
-                <w:sz w:val="16"/>
+                <w:sz w:val="20"/>
               </w:rPr>
               <w:t>Return a small OK response from FastAPI.</w:t>
             </w:r>
@@ -7827,7 +7827,7 @@
                 <w:b w:val="0"/>
                 <w:i w:val="0"/>
                 <w:color w:val="526178"/>
-                <w:sz w:val="14"/>
+                <w:sz w:val="17"/>
               </w:rPr>
               <w:t>curl -s /health</w:t>
             </w:r>
@@ -7861,7 +7861,7 @@
                 <w:b/>
                 <w:i w:val="0"/>
                 <w:color w:val="0F172A"/>
-                <w:sz w:val="20"/>
+                <w:sz w:val="22"/>
               </w:rPr>
               <w:t>Data status</w:t>
             </w:r>
@@ -7876,7 +7876,7 @@
                 <w:b w:val="0"/>
                 <w:i w:val="0"/>
                 <w:color w:val="526178"/>
-                <w:sz w:val="16"/>
+                <w:sz w:val="20"/>
               </w:rPr>
               <w:t>Confirm sample mode, counts, and fallback notes.</w:t>
             </w:r>
@@ -7892,7 +7892,7 @@
                 <w:b w:val="0"/>
                 <w:i w:val="0"/>
                 <w:color w:val="526178"/>
-                <w:sz w:val="14"/>
+                <w:sz w:val="17"/>
               </w:rPr>
               <w:t>curl -s /api/data-status</w:t>
             </w:r>
@@ -7926,7 +7926,7 @@
                 <w:b/>
                 <w:i w:val="0"/>
                 <w:color w:val="0F172A"/>
-                <w:sz w:val="20"/>
+                <w:sz w:val="22"/>
               </w:rPr>
               <w:t>Score endpoint</w:t>
             </w:r>
@@ -7941,7 +7941,7 @@
                 <w:b w:val="0"/>
                 <w:i w:val="0"/>
                 <w:color w:val="526178"/>
-                <w:sz w:val="16"/>
+                <w:sz w:val="20"/>
               </w:rPr>
               <w:t>Call or trigger the endpoint to confirm scoring.</w:t>
             </w:r>
@@ -7957,7 +7957,7 @@
                 <w:b w:val="0"/>
                 <w:i w:val="0"/>
                 <w:color w:val="526178"/>
-                <w:sz w:val="14"/>
+                <w:sz w:val="17"/>
               </w:rPr>
               <w:t>/api/score?districtId=...</w:t>
             </w:r>
@@ -8026,7 +8026,7 @@
                 <w:b/>
                 <w:i w:val="0"/>
                 <w:color w:val="0F172A"/>
-                <w:sz w:val="20"/>
+                <w:sz w:val="22"/>
               </w:rPr>
               <w:t>Validate data</w:t>
             </w:r>
@@ -8041,7 +8041,7 @@
                 <w:b w:val="0"/>
                 <w:i w:val="0"/>
                 <w:color w:val="526178"/>
-                <w:sz w:val="16"/>
+                <w:sz w:val="20"/>
               </w:rPr>
               <w:t>Run this when map layers or counts look wrong.</w:t>
             </w:r>
@@ -8057,7 +8057,7 @@
                 <w:b w:val="0"/>
                 <w:i w:val="0"/>
                 <w:color w:val="526178"/>
-                <w:sz w:val="14"/>
+                <w:sz w:val="17"/>
               </w:rPr>
               <w:t>python scripts/validate_data.py</w:t>
             </w:r>
@@ -8091,7 +8091,7 @@
                 <w:b/>
                 <w:i w:val="0"/>
                 <w:color w:val="0F172A"/>
-                <w:sz w:val="20"/>
+                <w:sz w:val="22"/>
               </w:rPr>
               <w:t>Run tests</w:t>
             </w:r>
@@ -8106,7 +8106,7 @@
                 <w:b w:val="0"/>
                 <w:i w:val="0"/>
                 <w:color w:val="526178"/>
-                <w:sz w:val="16"/>
+                <w:sz w:val="20"/>
               </w:rPr>
               <w:t>Catch API, health, data-shape, and scoring regressions.</w:t>
             </w:r>
@@ -8122,7 +8122,7 @@
                 <w:b w:val="0"/>
                 <w:i w:val="0"/>
                 <w:color w:val="526178"/>
-                <w:sz w:val="14"/>
+                <w:sz w:val="17"/>
               </w:rPr>
               <w:t>python -m pytest</w:t>
             </w:r>
@@ -8156,7 +8156,7 @@
                 <w:b/>
                 <w:i w:val="0"/>
                 <w:color w:val="0F172A"/>
-                <w:sz w:val="20"/>
+                <w:sz w:val="22"/>
               </w:rPr>
               <w:t>Stay local first</w:t>
             </w:r>
@@ -8171,7 +8171,7 @@
                 <w:b w:val="0"/>
                 <w:i w:val="0"/>
                 <w:color w:val="526178"/>
-                <w:sz w:val="16"/>
+                <w:sz w:val="20"/>
               </w:rPr>
               <w:t>Move to cloud only after the local proof path is stable.</w:t>
             </w:r>
@@ -8187,7 +8187,7 @@
                 <w:b w:val="0"/>
                 <w:i w:val="0"/>
                 <w:color w:val="526178"/>
-                <w:sz w:val="14"/>
+                <w:sz w:val="17"/>
               </w:rPr>
               <w:t>DATA_MODE=sample</w:t>
             </w:r>
@@ -8236,17 +8236,17 @@
                 <w:b/>
                 <w:i w:val="0"/>
                 <w:color w:val="FFFFFF"/>
+                <w:sz w:val="22"/>
+              </w:rPr>
+              <w:t xml:space="preserve">Success signal: </w:t>
+            </w:r>
+            <w:r>
+              <w:rPr>
+                <w:rFonts w:ascii="Aptos" w:hAnsi="Aptos"/>
+                <w:b w:val="0"/>
+                <w:i w:val="0"/>
+                <w:color w:val="FFFFFF"/>
                 <w:sz w:val="20"/>
-              </w:rPr>
-              <w:t xml:space="preserve">Success signal: </w:t>
-            </w:r>
-            <w:r>
-              <w:rPr>
-                <w:rFonts w:ascii="Aptos" w:hAnsi="Aptos"/>
-                <w:b w:val="0"/>
-                <w:i w:val="0"/>
-                <w:color w:val="FFFFFF"/>
-                <w:sz w:val="18"/>
               </w:rPr>
               <w:t>Dashboard visible, overlays present, selector populated, score panel updating, /health OK, and /api/data-status explaining the active data source.</w:t>
             </w:r>
@@ -8433,7 +8433,7 @@
                 <w:b/>
                 <w:i w:val="0"/>
                 <w:color w:val="0F172A"/>
-                <w:sz w:val="20"/>
+                <w:sz w:val="22"/>
               </w:rPr>
               <w:t>Bootstrap</w:t>
             </w:r>
@@ -8448,7 +8448,7 @@
                 <w:b w:val="0"/>
                 <w:i w:val="0"/>
                 <w:color w:val="526178"/>
-                <w:sz w:val="16"/>
+                <w:sz w:val="20"/>
               </w:rPr>
               <w:t>/health and /api/config confirm app health and runtime settings.</w:t>
             </w:r>
@@ -8464,7 +8464,7 @@
                 <w:b w:val="0"/>
                 <w:i w:val="0"/>
                 <w:color w:val="526178"/>
-                <w:sz w:val="14"/>
+                <w:sz w:val="17"/>
               </w:rPr>
               <w:t>health/config</w:t>
             </w:r>
@@ -8498,7 +8498,7 @@
                 <w:b/>
                 <w:i w:val="0"/>
                 <w:color w:val="0F172A"/>
-                <w:sz w:val="20"/>
+                <w:sz w:val="22"/>
               </w:rPr>
               <w:t>Map layers</w:t>
             </w:r>
@@ -8513,7 +8513,7 @@
                 <w:b w:val="0"/>
                 <w:i w:val="0"/>
                 <w:color w:val="526178"/>
-                <w:sz w:val="16"/>
+                <w:sz w:val="20"/>
               </w:rPr>
               <w:t>/api/routes and /api/routes/geojson?mode=... return counts and map-ready geometry.</w:t>
             </w:r>
@@ -8529,7 +8529,7 @@
                 <w:b w:val="0"/>
                 <w:i w:val="0"/>
                 <w:color w:val="526178"/>
-                <w:sz w:val="14"/>
+                <w:sz w:val="17"/>
               </w:rPr>
               <w:t>routes</w:t>
             </w:r>
@@ -8565,7 +8565,7 @@
                 <w:b/>
                 <w:i w:val="0"/>
                 <w:color w:val="0F172A"/>
-                <w:sz w:val="20"/>
+                <w:sz w:val="22"/>
               </w:rPr>
               <w:t>District scoring</w:t>
             </w:r>
@@ -8580,7 +8580,7 @@
                 <w:b w:val="0"/>
                 <w:i w:val="0"/>
                 <w:color w:val="526178"/>
-                <w:sz w:val="16"/>
+                <w:sz w:val="20"/>
               </w:rPr>
               <w:t>/api/districts and /api/score?districtId=... drive the selector and score panel.</w:t>
             </w:r>
@@ -8596,7 +8596,7 @@
                 <w:b w:val="0"/>
                 <w:i w:val="0"/>
                 <w:color w:val="526178"/>
-                <w:sz w:val="14"/>
+                <w:sz w:val="17"/>
               </w:rPr>
               <w:t>score</w:t>
             </w:r>
@@ -8630,7 +8630,7 @@
                 <w:b/>
                 <w:i w:val="0"/>
                 <w:color w:val="0F172A"/>
-                <w:sz w:val="20"/>
+                <w:sz w:val="22"/>
               </w:rPr>
               <w:t>Diagnostics</w:t>
             </w:r>
@@ -8645,7 +8645,7 @@
                 <w:b w:val="0"/>
                 <w:i w:val="0"/>
                 <w:color w:val="526178"/>
-                <w:sz w:val="16"/>
+                <w:sz w:val="20"/>
               </w:rPr>
               <w:t>/api/live-events and /api/data-status explain events, mode, and fallback behavior.</w:t>
             </w:r>
@@ -8661,7 +8661,7 @@
                 <w:b w:val="0"/>
                 <w:i w:val="0"/>
                 <w:color w:val="526178"/>
-                <w:sz w:val="14"/>
+                <w:sz w:val="17"/>
               </w:rPr>
               <w:t>status</w:t>
             </w:r>
@@ -8723,7 +8723,7 @@
           <w:b w:val="0"/>
           <w:i/>
           <w:color w:val="536987"/>
-          <w:sz w:val="18"/>
+          <w:sz w:val="20"/>
         </w:rPr>
         <w:t>/api/data-status confirms sample mode and explains fallback path.</w:t>
       </w:r>
@@ -8777,7 +8777,7 @@
           <w:b w:val="0"/>
           <w:i/>
           <w:color w:val="536987"/>
-          <w:sz w:val="18"/>
+          <w:sz w:val="20"/>
         </w:rPr>
         <w:t>Score request flow</w:t>
       </w:r>
@@ -8818,7 +8818,7 @@
                 <w:b w:val="0"/>
                 <w:i w:val="0"/>
                 <w:color w:val="0F172A"/>
-                <w:sz w:val="17"/>
+                <w:sz w:val="19"/>
               </w:rPr>
               <w:t>score = (nearby metro count x 3) + nearby bus count - live delay penalty</w:t>
             </w:r>
@@ -8867,17 +8867,17 @@
                 <w:b/>
                 <w:i w:val="0"/>
                 <w:color w:val="FFFFFF"/>
+                <w:sz w:val="22"/>
+              </w:rPr>
+              <w:t xml:space="preserve">Adaptation note: </w:t>
+            </w:r>
+            <w:r>
+              <w:rPr>
+                <w:rFonts w:ascii="Aptos" w:hAnsi="Aptos"/>
+                <w:b w:val="0"/>
+                <w:i w:val="0"/>
+                <w:color w:val="FFFFFF"/>
                 <w:sz w:val="20"/>
-              </w:rPr>
-              <w:t xml:space="preserve">Adaptation note: </w:t>
-            </w:r>
-            <w:r>
-              <w:rPr>
-                <w:rFonts w:ascii="Aptos" w:hAnsi="Aptos"/>
-                <w:b w:val="0"/>
-                <w:i w:val="0"/>
-                <w:color w:val="FFFFFF"/>
-                <w:sz w:val="18"/>
               </w:rPr>
               <w:t>Keep this formula easy to explain. Teams can later replace the weights or add parking, walkability, public services, heat, or event density.</w:t>
             </w:r>
@@ -8961,7 +8961,7 @@
                 <w:b/>
                 <w:i w:val="0"/>
                 <w:color w:val="08182F"/>
-                <w:sz w:val="18"/>
+                <w:sz w:val="21"/>
               </w:rPr>
               <w:t>Layer</w:t>
             </w:r>
@@ -8992,7 +8992,7 @@
                 <w:b/>
                 <w:i w:val="0"/>
                 <w:color w:val="08182F"/>
-                <w:sz w:val="18"/>
+                <w:sz w:val="21"/>
               </w:rPr>
               <w:t>What it shows</w:t>
             </w:r>
@@ -9023,7 +9023,7 @@
                 <w:b/>
                 <w:i w:val="0"/>
                 <w:color w:val="08182F"/>
-                <w:sz w:val="18"/>
+                <w:sz w:val="21"/>
               </w:rPr>
               <w:t>Why it matters</w:t>
             </w:r>
@@ -9055,7 +9055,7 @@
                 <w:b w:val="0"/>
                 <w:i w:val="0"/>
                 <w:color w:val="0F172A"/>
-                <w:sz w:val="17"/>
+                <w:sz w:val="20"/>
               </w:rPr>
               <w:t>Metro lines</w:t>
             </w:r>
@@ -9085,7 +9085,7 @@
                 <w:b w:val="0"/>
                 <w:i w:val="0"/>
                 <w:color w:val="0F172A"/>
-                <w:sz w:val="17"/>
+                <w:sz w:val="20"/>
               </w:rPr>
               <w:t>high-capacity mobility corridors</w:t>
             </w:r>
@@ -9115,7 +9115,7 @@
                 <w:b w:val="0"/>
                 <w:i w:val="0"/>
                 <w:color w:val="0F172A"/>
-                <w:sz w:val="17"/>
+                <w:sz w:val="20"/>
               </w:rPr>
               <w:t>shows structural transit coverage</w:t>
             </w:r>
@@ -9147,7 +9147,7 @@
                 <w:b w:val="0"/>
                 <w:i w:val="0"/>
                 <w:color w:val="0F172A"/>
-                <w:sz w:val="17"/>
+                <w:sz w:val="20"/>
               </w:rPr>
               <w:t>Bus routes</w:t>
             </w:r>
@@ -9177,7 +9177,7 @@
                 <w:b w:val="0"/>
                 <w:i w:val="0"/>
                 <w:color w:val="0F172A"/>
-                <w:sz w:val="17"/>
+                <w:sz w:val="20"/>
               </w:rPr>
               <w:t>surface transit coverage</w:t>
             </w:r>
@@ -9207,7 +9207,7 @@
                 <w:b w:val="0"/>
                 <w:i w:val="0"/>
                 <w:color w:val="0F172A"/>
-                <w:sz w:val="17"/>
+                <w:sz w:val="20"/>
               </w:rPr>
               <w:t>shows fine-grained network reach</w:t>
             </w:r>
@@ -9239,7 +9239,7 @@
                 <w:b w:val="0"/>
                 <w:i w:val="0"/>
                 <w:color w:val="0F172A"/>
-                <w:sz w:val="17"/>
+                <w:sz w:val="20"/>
               </w:rPr>
               <w:t>Districts</w:t>
             </w:r>
@@ -9269,7 +9269,7 @@
                 <w:b w:val="0"/>
                 <w:i w:val="0"/>
                 <w:color w:val="0F172A"/>
-                <w:sz w:val="17"/>
+                <w:sz w:val="20"/>
               </w:rPr>
               <w:t>selectable district points</w:t>
             </w:r>
@@ -9299,7 +9299,7 @@
                 <w:b w:val="0"/>
                 <w:i w:val="0"/>
                 <w:color w:val="0F172A"/>
-                <w:sz w:val="17"/>
+                <w:sz w:val="20"/>
               </w:rPr>
               <w:t>anchors the score conversation</w:t>
             </w:r>
@@ -9331,7 +9331,7 @@
                 <w:b w:val="0"/>
                 <w:i w:val="0"/>
                 <w:color w:val="0F172A"/>
-                <w:sz w:val="17"/>
+                <w:sz w:val="20"/>
               </w:rPr>
               <w:t>Live events</w:t>
             </w:r>
@@ -9361,7 +9361,7 @@
                 <w:b w:val="0"/>
                 <w:i w:val="0"/>
                 <w:color w:val="0F172A"/>
-                <w:sz w:val="17"/>
+                <w:sz w:val="20"/>
               </w:rPr>
               <w:t>delay or incident markers</w:t>
             </w:r>
@@ -9391,7 +9391,7 @@
                 <w:b w:val="0"/>
                 <w:i w:val="0"/>
                 <w:color w:val="0F172A"/>
-                <w:sz w:val="17"/>
+                <w:sz w:val="20"/>
               </w:rPr>
               <w:t>demonstrates cloud-live extension potential</w:t>
             </w:r>
@@ -9423,7 +9423,7 @@
                 <w:b w:val="0"/>
                 <w:i w:val="0"/>
                 <w:color w:val="0F172A"/>
-                <w:sz w:val="17"/>
+                <w:sz w:val="20"/>
               </w:rPr>
               <w:t>Accessibility buffer</w:t>
             </w:r>
@@ -9453,7 +9453,7 @@
                 <w:b w:val="0"/>
                 <w:i w:val="0"/>
                 <w:color w:val="0F172A"/>
-                <w:sz w:val="17"/>
+                <w:sz w:val="20"/>
               </w:rPr>
               <w:t>rough selected-district service area</w:t>
             </w:r>
@@ -9483,7 +9483,7 @@
                 <w:b w:val="0"/>
                 <w:i w:val="0"/>
                 <w:color w:val="0F172A"/>
-                <w:sz w:val="17"/>
+                <w:sz w:val="20"/>
               </w:rPr>
               <w:t>makes the score formula visible</w:t>
             </w:r>
@@ -9545,7 +9545,7 @@
           <w:b w:val="0"/>
           <w:i/>
           <w:color w:val="536987"/>
-          <w:sz w:val="18"/>
+          <w:sz w:val="20"/>
         </w:rPr>
         <w:t>District selector in the dashboard.</w:t>
       </w:r>
@@ -9606,7 +9606,7 @@
                 <w:b/>
                 <w:i w:val="0"/>
                 <w:color w:val="0F172A"/>
-                <w:sz w:val="20"/>
+                <w:sz w:val="22"/>
               </w:rPr>
               <w:t>Selected district</w:t>
             </w:r>
@@ -9621,7 +9621,7 @@
                 <w:b w:val="0"/>
                 <w:i w:val="0"/>
                 <w:color w:val="526178"/>
-                <w:sz w:val="16"/>
+                <w:sz w:val="20"/>
               </w:rPr>
               <w:t>The panel names the district in focus.</w:t>
             </w:r>
@@ -9655,7 +9655,7 @@
                 <w:b/>
                 <w:i w:val="0"/>
                 <w:color w:val="0F172A"/>
-                <w:sz w:val="20"/>
+                <w:sz w:val="22"/>
               </w:rPr>
               <w:t>Score and rating</w:t>
             </w:r>
@@ -9670,7 +9670,7 @@
                 <w:b w:val="0"/>
                 <w:i w:val="0"/>
                 <w:color w:val="526178"/>
-                <w:sz w:val="16"/>
+                <w:sz w:val="20"/>
               </w:rPr>
               <w:t>A readable number and label summarize access.</w:t>
             </w:r>
@@ -9704,7 +9704,7 @@
                 <w:b/>
                 <w:i w:val="0"/>
                 <w:color w:val="0F172A"/>
-                <w:sz w:val="20"/>
+                <w:sz w:val="22"/>
               </w:rPr>
               <w:t>Route counts</w:t>
             </w:r>
@@ -9719,7 +9719,7 @@
                 <w:b w:val="0"/>
                 <w:i w:val="0"/>
                 <w:color w:val="526178"/>
-                <w:sz w:val="16"/>
+                <w:sz w:val="20"/>
               </w:rPr>
               <w:t>Metro and bus counts explain the score.</w:t>
             </w:r>
@@ -9755,7 +9755,7 @@
                 <w:b/>
                 <w:i w:val="0"/>
                 <w:color w:val="0F172A"/>
-                <w:sz w:val="20"/>
+                <w:sz w:val="22"/>
               </w:rPr>
               <w:t>Delay penalty</w:t>
             </w:r>
@@ -9770,7 +9770,7 @@
                 <w:b w:val="0"/>
                 <w:i w:val="0"/>
                 <w:color w:val="526178"/>
-                <w:sz w:val="16"/>
+                <w:sz w:val="20"/>
               </w:rPr>
               <w:t>Live event data can reduce the score.</w:t>
             </w:r>
@@ -9804,7 +9804,7 @@
                 <w:b/>
                 <w:i w:val="0"/>
                 <w:color w:val="0F172A"/>
-                <w:sz w:val="20"/>
+                <w:sz w:val="22"/>
               </w:rPr>
               <w:t>Formula</w:t>
             </w:r>
@@ -9819,7 +9819,7 @@
                 <w:b w:val="0"/>
                 <w:i w:val="0"/>
                 <w:color w:val="526178"/>
-                <w:sz w:val="16"/>
+                <w:sz w:val="20"/>
               </w:rPr>
               <w:t>The current calculation is visible and replaceable.</w:t>
             </w:r>
@@ -9853,7 +9853,7 @@
                 <w:b/>
                 <w:i w:val="0"/>
                 <w:color w:val="0F172A"/>
-                <w:sz w:val="20"/>
+                <w:sz w:val="22"/>
               </w:rPr>
               <w:t>Data source badge</w:t>
             </w:r>
@@ -9868,7 +9868,7 @@
                 <w:b w:val="0"/>
                 <w:i w:val="0"/>
                 <w:color w:val="526178"/>
-                <w:sz w:val="16"/>
+                <w:sz w:val="20"/>
               </w:rPr>
               <w:t>The panel explains sample, Blob, or Cosmos mode.</w:t>
             </w:r>
@@ -9930,7 +9930,7 @@
           <w:b w:val="0"/>
           <w:i/>
           <w:color w:val="536987"/>
-          <w:sz w:val="18"/>
+          <w:sz w:val="20"/>
         </w:rPr>
         <w:t>District score panel after selecting a Riyadh district.</w:t>
       </w:r>
@@ -10110,7 +10110,7 @@
                 <w:b/>
                 <w:i w:val="0"/>
                 <w:color w:val="0F172A"/>
-                <w:sz w:val="20"/>
+                <w:sz w:val="22"/>
               </w:rPr>
               <w:t>Authenticate</w:t>
             </w:r>
@@ -10125,7 +10125,7 @@
                 <w:b w:val="0"/>
                 <w:i w:val="0"/>
                 <w:color w:val="526178"/>
-                <w:sz w:val="16"/>
+                <w:sz w:val="20"/>
               </w:rPr>
               <w:t>az login and azd auth login.</w:t>
             </w:r>
@@ -10141,7 +10141,7 @@
                 <w:b w:val="0"/>
                 <w:i w:val="0"/>
                 <w:color w:val="526178"/>
-                <w:sz w:val="14"/>
+                <w:sz w:val="17"/>
               </w:rPr>
               <w:t>identity</w:t>
             </w:r>
@@ -10175,7 +10175,7 @@
                 <w:b/>
                 <w:i w:val="0"/>
                 <w:color w:val="0F172A"/>
-                <w:sz w:val="20"/>
+                <w:sz w:val="22"/>
               </w:rPr>
               <w:t>Initialize</w:t>
             </w:r>
@@ -10190,7 +10190,7 @@
                 <w:b w:val="0"/>
                 <w:i w:val="0"/>
                 <w:color w:val="526178"/>
-                <w:sz w:val="16"/>
+                <w:sz w:val="20"/>
               </w:rPr>
               <w:t>azd init and set target environment if needed.</w:t>
             </w:r>
@@ -10206,7 +10206,7 @@
                 <w:b w:val="0"/>
                 <w:i w:val="0"/>
                 <w:color w:val="526178"/>
-                <w:sz w:val="14"/>
+                <w:sz w:val="17"/>
               </w:rPr>
               <w:t>environment</w:t>
             </w:r>
@@ -10240,7 +10240,7 @@
                 <w:b/>
                 <w:i w:val="0"/>
                 <w:color w:val="0F172A"/>
-                <w:sz w:val="20"/>
+                <w:sz w:val="22"/>
               </w:rPr>
               <w:t>Deploy</w:t>
             </w:r>
@@ -10255,7 +10255,7 @@
                 <w:b w:val="0"/>
                 <w:i w:val="0"/>
                 <w:color w:val="526178"/>
-                <w:sz w:val="16"/>
+                <w:sz w:val="20"/>
               </w:rPr>
               <w:t>Run bash scripts/deploy_azure.sh.</w:t>
             </w:r>
@@ -10271,7 +10271,7 @@
                 <w:b w:val="0"/>
                 <w:i w:val="0"/>
                 <w:color w:val="526178"/>
-                <w:sz w:val="14"/>
+                <w:sz w:val="17"/>
               </w:rPr>
               <w:t>provision</w:t>
             </w:r>
@@ -10307,7 +10307,7 @@
                 <w:b/>
                 <w:i w:val="0"/>
                 <w:color w:val="0F172A"/>
-                <w:sz w:val="20"/>
+                <w:sz w:val="22"/>
               </w:rPr>
               <w:t>Verify</w:t>
             </w:r>
@@ -10322,7 +10322,7 @@
                 <w:b w:val="0"/>
                 <w:i w:val="0"/>
                 <w:color w:val="526178"/>
-                <w:sz w:val="16"/>
+                <w:sz w:val="20"/>
               </w:rPr>
               <w:t>Open WEB_APP_URL, /health, and /api/data-status.</w:t>
             </w:r>
@@ -10338,7 +10338,7 @@
                 <w:b w:val="0"/>
                 <w:i w:val="0"/>
                 <w:color w:val="526178"/>
-                <w:sz w:val="14"/>
+                <w:sz w:val="17"/>
               </w:rPr>
               <w:t>smoke tests</w:t>
             </w:r>
@@ -10372,7 +10372,7 @@
                 <w:b/>
                 <w:i w:val="0"/>
                 <w:color w:val="0F172A"/>
-                <w:sz w:val="20"/>
+                <w:sz w:val="22"/>
               </w:rPr>
               <w:t>Operate</w:t>
             </w:r>
@@ -10387,7 +10387,7 @@
                 <w:b w:val="0"/>
                 <w:i w:val="0"/>
                 <w:color w:val="526178"/>
-                <w:sz w:val="16"/>
+                <w:sz w:val="20"/>
               </w:rPr>
               <w:t>Use App Insights and logs if the app fails or loads slowly.</w:t>
             </w:r>
@@ -10403,7 +10403,7 @@
                 <w:b w:val="0"/>
                 <w:i w:val="0"/>
                 <w:color w:val="526178"/>
-                <w:sz w:val="14"/>
+                <w:sz w:val="17"/>
               </w:rPr>
               <w:t>diagnostics</w:t>
             </w:r>
@@ -10437,7 +10437,7 @@
                 <w:b/>
                 <w:i w:val="0"/>
                 <w:color w:val="0F172A"/>
-                <w:sz w:val="20"/>
+                <w:sz w:val="22"/>
               </w:rPr>
               <w:t>Teardown</w:t>
             </w:r>
@@ -10452,7 +10452,7 @@
                 <w:b w:val="0"/>
                 <w:i w:val="0"/>
                 <w:color w:val="526178"/>
-                <w:sz w:val="16"/>
+                <w:sz w:val="20"/>
               </w:rPr>
               <w:t>Run destroy_resource_group.sh --yes when finished.</w:t>
             </w:r>
@@ -10468,7 +10468,7 @@
                 <w:b w:val="0"/>
                 <w:i w:val="0"/>
                 <w:color w:val="526178"/>
-                <w:sz w:val="14"/>
+                <w:sz w:val="17"/>
               </w:rPr>
               <w:t>cleanup</w:t>
             </w:r>
@@ -10517,7 +10517,7 @@
                 <w:b w:val="0"/>
                 <w:i w:val="0"/>
                 <w:color w:val="0F172A"/>
-                <w:sz w:val="17"/>
+                <w:sz w:val="19"/>
               </w:rPr>
               <w:t>az login</w:t>
               <w:br/>
@@ -10575,7 +10575,7 @@
                 <w:b/>
                 <w:i w:val="0"/>
                 <w:color w:val="08182F"/>
-                <w:sz w:val="18"/>
+                <w:sz w:val="21"/>
               </w:rPr>
               <w:t>Azure resource</w:t>
             </w:r>
@@ -10606,7 +10606,7 @@
                 <w:b/>
                 <w:i w:val="0"/>
                 <w:color w:val="08182F"/>
-                <w:sz w:val="18"/>
+                <w:sz w:val="21"/>
               </w:rPr>
               <w:t>Role</w:t>
             </w:r>
@@ -10638,7 +10638,7 @@
                 <w:b w:val="0"/>
                 <w:i w:val="0"/>
                 <w:color w:val="0F172A"/>
-                <w:sz w:val="17"/>
+                <w:sz w:val="20"/>
               </w:rPr>
               <w:t>Azure Container Apps</w:t>
             </w:r>
@@ -10668,7 +10668,7 @@
                 <w:b w:val="0"/>
                 <w:i w:val="0"/>
                 <w:color w:val="0F172A"/>
-                <w:sz w:val="17"/>
+                <w:sz w:val="20"/>
               </w:rPr>
               <w:t>hosts FastAPI and the static frontend</w:t>
             </w:r>
@@ -10700,7 +10700,7 @@
                 <w:b w:val="0"/>
                 <w:i w:val="0"/>
                 <w:color w:val="0F172A"/>
-                <w:sz w:val="17"/>
+                <w:sz w:val="20"/>
               </w:rPr>
               <w:t>Azure Container Registry</w:t>
             </w:r>
@@ -10730,7 +10730,7 @@
                 <w:b w:val="0"/>
                 <w:i w:val="0"/>
                 <w:color w:val="0F172A"/>
-                <w:sz w:val="17"/>
+                <w:sz w:val="20"/>
               </w:rPr>
               <w:t>stores the built container image</w:t>
             </w:r>
@@ -10762,7 +10762,7 @@
                 <w:b w:val="0"/>
                 <w:i w:val="0"/>
                 <w:color w:val="0F172A"/>
-                <w:sz w:val="17"/>
+                <w:sz w:val="20"/>
               </w:rPr>
               <w:t>Azure Maps account</w:t>
             </w:r>
@@ -10792,7 +10792,7 @@
                 <w:b w:val="0"/>
                 <w:i w:val="0"/>
                 <w:color w:val="0F172A"/>
-                <w:sz w:val="17"/>
+                <w:sz w:val="20"/>
               </w:rPr>
               <w:t>supports cloud map services</w:t>
             </w:r>
@@ -10824,7 +10824,7 @@
                 <w:b w:val="0"/>
                 <w:i w:val="0"/>
                 <w:color w:val="0F172A"/>
-                <w:sz w:val="17"/>
+                <w:sz w:val="20"/>
               </w:rPr>
               <w:t>Azure Blob Storage</w:t>
             </w:r>
@@ -10854,7 +10854,7 @@
                 <w:b w:val="0"/>
                 <w:i w:val="0"/>
                 <w:color w:val="0F172A"/>
-                <w:sz w:val="17"/>
+                <w:sz w:val="20"/>
               </w:rPr>
               <w:t>stores raw and processed mobility files</w:t>
             </w:r>
@@ -10886,7 +10886,7 @@
                 <w:b w:val="0"/>
                 <w:i w:val="0"/>
                 <w:color w:val="0F172A"/>
-                <w:sz w:val="17"/>
+                <w:sz w:val="20"/>
               </w:rPr>
               <w:t>Azure Cosmos DB</w:t>
             </w:r>
@@ -10916,7 +10916,7 @@
                 <w:b w:val="0"/>
                 <w:i w:val="0"/>
                 <w:color w:val="0F172A"/>
-                <w:sz w:val="17"/>
+                <w:sz w:val="20"/>
               </w:rPr>
               <w:t>stores route, district, and event records</w:t>
             </w:r>
@@ -10948,7 +10948,7 @@
                 <w:b w:val="0"/>
                 <w:i w:val="0"/>
                 <w:color w:val="0F172A"/>
-                <w:sz w:val="17"/>
+                <w:sz w:val="20"/>
               </w:rPr>
               <w:t>Application Insights</w:t>
             </w:r>
@@ -10978,7 +10978,7 @@
                 <w:b w:val="0"/>
                 <w:i w:val="0"/>
                 <w:color w:val="0F172A"/>
-                <w:sz w:val="17"/>
+                <w:sz w:val="20"/>
               </w:rPr>
               <w:t>tracks health, latency, failures, and requests</w:t>
             </w:r>
@@ -11010,7 +11010,7 @@
                 <w:b w:val="0"/>
                 <w:i w:val="0"/>
                 <w:color w:val="0F172A"/>
-                <w:sz w:val="17"/>
+                <w:sz w:val="20"/>
               </w:rPr>
               <w:t>Log Analytics</w:t>
             </w:r>
@@ -11040,7 +11040,7 @@
                 <w:b w:val="0"/>
                 <w:i w:val="0"/>
                 <w:color w:val="0F172A"/>
-                <w:sz w:val="17"/>
+                <w:sz w:val="20"/>
               </w:rPr>
               <w:t>stores logs and diagnostics</w:t>
             </w:r>
@@ -11089,17 +11089,17 @@
                 <w:b/>
                 <w:i w:val="0"/>
                 <w:color w:val="FFFFFF"/>
+                <w:sz w:val="22"/>
+              </w:rPr>
+              <w:t xml:space="preserve">After deploy: </w:t>
+            </w:r>
+            <w:r>
+              <w:rPr>
+                <w:rFonts w:ascii="Aptos" w:hAnsi="Aptos"/>
+                <w:b w:val="0"/>
+                <w:i w:val="0"/>
+                <w:color w:val="FFFFFF"/>
                 <w:sz w:val="20"/>
-              </w:rPr>
-              <w:t xml:space="preserve">After deploy: </w:t>
-            </w:r>
-            <w:r>
-              <w:rPr>
-                <w:rFonts w:ascii="Aptos" w:hAnsi="Aptos"/>
-                <w:b w:val="0"/>
-                <w:i w:val="0"/>
-                <w:color w:val="FFFFFF"/>
-                <w:sz w:val="18"/>
               </w:rPr>
               <w:t>Copy WEB_APP_URL from azd output, open the deployed app, check /health and /api/data-status, confirm active mode, and inspect App Insights if anything fails.</w:t>
             </w:r>
@@ -11270,7 +11270,7 @@
                 <w:b/>
                 <w:i w:val="0"/>
                 <w:color w:val="08182F"/>
-                <w:sz w:val="18"/>
+                <w:sz w:val="21"/>
               </w:rPr>
               <w:t>Route</w:t>
             </w:r>
@@ -11301,7 +11301,7 @@
                 <w:b/>
                 <w:i w:val="0"/>
                 <w:color w:val="08182F"/>
-                <w:sz w:val="18"/>
+                <w:sz w:val="21"/>
               </w:rPr>
               <w:t>Best fit</w:t>
             </w:r>
@@ -11332,7 +11332,7 @@
                 <w:b/>
                 <w:i w:val="0"/>
                 <w:color w:val="08182F"/>
-                <w:sz w:val="18"/>
+                <w:sz w:val="21"/>
               </w:rPr>
               <w:t>Keep / add</w:t>
             </w:r>
@@ -11363,7 +11363,7 @@
                 <w:b/>
                 <w:i w:val="0"/>
                 <w:color w:val="08182F"/>
-                <w:sz w:val="18"/>
+                <w:sz w:val="21"/>
               </w:rPr>
               <w:t>Likely services</w:t>
             </w:r>
@@ -11395,7 +11395,7 @@
                 <w:b w:val="0"/>
                 <w:i w:val="0"/>
                 <w:color w:val="0F172A"/>
-                <w:sz w:val="17"/>
+                <w:sz w:val="20"/>
               </w:rPr>
               <w:t>Mobility Command View</w:t>
             </w:r>
@@ -11425,7 +11425,7 @@
                 <w:b w:val="0"/>
                 <w:i w:val="0"/>
                 <w:color w:val="0F172A"/>
-                <w:sz w:val="17"/>
+                <w:sz w:val="20"/>
               </w:rPr>
               <w:t>Transformational Technology</w:t>
             </w:r>
@@ -11455,7 +11455,7 @@
                 <w:b w:val="0"/>
                 <w:i w:val="0"/>
                 <w:color w:val="0F172A"/>
-                <w:sz w:val="17"/>
+                <w:sz w:val="20"/>
               </w:rPr>
               <w:t>Keep route layers, event overlay, selector, KPIs, data-status. Add congestion, parking demand, peak simulation, delay explanations.</w:t>
             </w:r>
@@ -11485,7 +11485,7 @@
                 <w:b w:val="0"/>
                 <w:i w:val="0"/>
                 <w:color w:val="0F172A"/>
-                <w:sz w:val="17"/>
+                <w:sz w:val="20"/>
               </w:rPr>
               <w:t>Azure Maps, Event Hubs, Stream Analytics, Cosmos DB, App Insights</w:t>
             </w:r>
@@ -11517,7 +11517,7 @@
                 <w:b w:val="0"/>
                 <w:i w:val="0"/>
                 <w:color w:val="0F172A"/>
-                <w:sz w:val="17"/>
+                <w:sz w:val="20"/>
               </w:rPr>
               <w:t>District Intelligence</w:t>
             </w:r>
@@ -11547,7 +11547,7 @@
                 <w:b w:val="0"/>
                 <w:i w:val="0"/>
                 <w:color w:val="0F172A"/>
-                <w:sz w:val="17"/>
+                <w:sz w:val="20"/>
               </w:rPr>
               <w:t>Prosperous People</w:t>
             </w:r>
@@ -11577,7 +11577,7 @@
                 <w:b w:val="0"/>
                 <w:i w:val="0"/>
                 <w:color w:val="0F172A"/>
-                <w:sz w:val="17"/>
+                <w:sz w:val="20"/>
               </w:rPr>
               <w:t>Keep district selector, score panel, map focus, Cosmos-ready records. Add service access, walkability, comparison.</w:t>
             </w:r>
@@ -11607,7 +11607,7 @@
                 <w:b w:val="0"/>
                 <w:i w:val="0"/>
                 <w:color w:val="0F172A"/>
-                <w:sz w:val="17"/>
+                <w:sz w:val="20"/>
               </w:rPr>
               <w:t>Azure Maps, Blob Storage, Cosmos DB, Container Apps, optional Azure OpenAI</w:t>
             </w:r>
@@ -11639,7 +11639,7 @@
                 <w:b w:val="0"/>
                 <w:i w:val="0"/>
                 <w:color w:val="0F172A"/>
-                <w:sz w:val="17"/>
+                <w:sz w:val="20"/>
               </w:rPr>
               <w:t>Sustainable Mobility Overlay</w:t>
             </w:r>
@@ -11669,7 +11669,7 @@
                 <w:b w:val="0"/>
                 <w:i w:val="0"/>
                 <w:color w:val="0F172A"/>
-                <w:sz w:val="17"/>
+                <w:sz w:val="20"/>
               </w:rPr>
               <w:t>Sustainable Solutions</w:t>
             </w:r>
@@ -11699,7 +11699,7 @@
                 <w:b w:val="0"/>
                 <w:i w:val="0"/>
                 <w:color w:val="0F172A"/>
-                <w:sz w:val="17"/>
+                <w:sz w:val="20"/>
               </w:rPr>
               <w:t>Keep mobility layers and selected district context. Add AQI, heat, pollution, clean corridors, emissions scoring.</w:t>
             </w:r>
@@ -11729,7 +11729,7 @@
                 <w:b w:val="0"/>
                 <w:i w:val="0"/>
                 <w:color w:val="0F172A"/>
-                <w:sz w:val="17"/>
+                <w:sz w:val="20"/>
               </w:rPr>
               <w:t>Azure Maps, Blob Storage, Cosmos DB, Power BI, App Insights</w:t>
             </w:r>
@@ -11761,7 +11761,7 @@
                 <w:b w:val="0"/>
                 <w:i w:val="0"/>
                 <w:color w:val="0F172A"/>
-                <w:sz w:val="17"/>
+                <w:sz w:val="20"/>
               </w:rPr>
               <w:t>Culture and Visitor Movement</w:t>
             </w:r>
@@ -11791,7 +11791,7 @@
                 <w:b w:val="0"/>
                 <w:i w:val="0"/>
                 <w:color w:val="0F172A"/>
-                <w:sz w:val="17"/>
+                <w:sz w:val="20"/>
               </w:rPr>
               <w:t>Culture</w:t>
             </w:r>
@@ -11821,7 +11821,7 @@
                 <w:b w:val="0"/>
                 <w:i w:val="0"/>
                 <w:color w:val="0F172A"/>
-                <w:sz w:val="17"/>
+                <w:sz w:val="20"/>
               </w:rPr>
               <w:t>Keep map layers, event markers, route overlays, selected place panel. Add heritage sites, multilingual notes, event-day access.</w:t>
             </w:r>
@@ -11851,7 +11851,7 @@
                 <w:b w:val="0"/>
                 <w:i w:val="0"/>
                 <w:color w:val="0F172A"/>
-                <w:sz w:val="17"/>
+                <w:sz w:val="20"/>
               </w:rPr>
               <w:t>Azure Maps, Cosmos DB, Blob Storage, Container Apps, optional translation</w:t>
             </w:r>
@@ -11900,17 +11900,17 @@
                 <w:b/>
                 <w:i w:val="0"/>
                 <w:color w:val="FFFFFF"/>
+                <w:sz w:val="22"/>
+              </w:rPr>
+              <w:t xml:space="preserve">Winning pattern: </w:t>
+            </w:r>
+            <w:r>
+              <w:rPr>
+                <w:rFonts w:ascii="Aptos" w:hAnsi="Aptos"/>
+                <w:b w:val="0"/>
+                <w:i w:val="0"/>
+                <w:color w:val="FFFFFF"/>
                 <w:sz w:val="20"/>
-              </w:rPr>
-              <w:t xml:space="preserve">Winning pattern: </w:t>
-            </w:r>
-            <w:r>
-              <w:rPr>
-                <w:rFonts w:ascii="Aptos" w:hAnsi="Aptos"/>
-                <w:b w:val="0"/>
-                <w:i w:val="0"/>
-                <w:color w:val="FFFFFF"/>
-                <w:sz w:val="18"/>
               </w:rPr>
               <w:t>Preserve the local-first API, map shell, fallback chain, and deployment path. Replace the domain data and scoring logic only after the core path is working.</w:t>
             </w:r>
@@ -11980,7 +11980,7 @@
                 <w:b/>
                 <w:i w:val="0"/>
                 <w:color w:val="08182F"/>
-                <w:sz w:val="18"/>
+                <w:sz w:val="21"/>
               </w:rPr>
               <w:t>Step</w:t>
             </w:r>
@@ -12011,7 +12011,7 @@
                 <w:b/>
                 <w:i w:val="0"/>
                 <w:color w:val="08182F"/>
-                <w:sz w:val="18"/>
+                <w:sz w:val="21"/>
               </w:rPr>
               <w:t>Show</w:t>
             </w:r>
@@ -12042,7 +12042,7 @@
                 <w:b/>
                 <w:i w:val="0"/>
                 <w:color w:val="08182F"/>
-                <w:sz w:val="18"/>
+                <w:sz w:val="21"/>
               </w:rPr>
               <w:t>Explain</w:t>
             </w:r>
@@ -12074,7 +12074,7 @@
                 <w:b w:val="0"/>
                 <w:i w:val="0"/>
                 <w:color w:val="0F172A"/>
-                <w:sz w:val="17"/>
+                <w:sz w:val="20"/>
               </w:rPr>
               <w:t>1</w:t>
             </w:r>
@@ -12104,7 +12104,7 @@
                 <w:b w:val="0"/>
                 <w:i w:val="0"/>
                 <w:color w:val="0F172A"/>
-                <w:sz w:val="17"/>
+                <w:sz w:val="20"/>
               </w:rPr>
               <w:t>Dashboard landing view</w:t>
             </w:r>
@@ -12134,7 +12134,7 @@
                 <w:b w:val="0"/>
                 <w:i w:val="0"/>
                 <w:color w:val="0F172A"/>
-                <w:sz w:val="17"/>
+                <w:sz w:val="20"/>
               </w:rPr>
               <w:t>This is a Riyadh mobility intelligence starter kit, not just a static map.</w:t>
             </w:r>
@@ -12166,7 +12166,7 @@
                 <w:b w:val="0"/>
                 <w:i w:val="0"/>
                 <w:color w:val="0F172A"/>
-                <w:sz w:val="17"/>
+                <w:sz w:val="20"/>
               </w:rPr>
               <w:t>2</w:t>
             </w:r>
@@ -12196,7 +12196,7 @@
                 <w:b w:val="0"/>
                 <w:i w:val="0"/>
                 <w:color w:val="0F172A"/>
-                <w:sz w:val="17"/>
+                <w:sz w:val="20"/>
               </w:rPr>
               <w:t>Metro and bus toggles</w:t>
             </w:r>
@@ -12226,7 +12226,7 @@
                 <w:b w:val="0"/>
                 <w:i w:val="0"/>
                 <w:color w:val="0F172A"/>
-                <w:sz w:val="17"/>
+                <w:sz w:val="20"/>
               </w:rPr>
               <w:t>The map layers show public transport coverage.</w:t>
             </w:r>
@@ -12258,7 +12258,7 @@
                 <w:b w:val="0"/>
                 <w:i w:val="0"/>
                 <w:color w:val="0F172A"/>
-                <w:sz w:val="17"/>
+                <w:sz w:val="20"/>
               </w:rPr>
               <w:t>3</w:t>
             </w:r>
@@ -12288,7 +12288,7 @@
                 <w:b w:val="0"/>
                 <w:i w:val="0"/>
                 <w:color w:val="0F172A"/>
-                <w:sz w:val="17"/>
+                <w:sz w:val="20"/>
               </w:rPr>
               <w:t>District selector</w:t>
             </w:r>
@@ -12318,7 +12318,7 @@
                 <w:b w:val="0"/>
                 <w:i w:val="0"/>
                 <w:color w:val="0F172A"/>
-                <w:sz w:val="17"/>
+                <w:sz w:val="20"/>
               </w:rPr>
               <w:t>District context drives the scoring workflow.</w:t>
             </w:r>
@@ -12350,7 +12350,7 @@
                 <w:b w:val="0"/>
                 <w:i w:val="0"/>
                 <w:color w:val="0F172A"/>
-                <w:sz w:val="17"/>
+                <w:sz w:val="20"/>
               </w:rPr>
               <w:t>4</w:t>
             </w:r>
@@ -12380,7 +12380,7 @@
                 <w:b w:val="0"/>
                 <w:i w:val="0"/>
                 <w:color w:val="0F172A"/>
-                <w:sz w:val="17"/>
+                <w:sz w:val="20"/>
               </w:rPr>
               <w:t>Score panel</w:t>
             </w:r>
@@ -12410,7 +12410,7 @@
                 <w:b w:val="0"/>
                 <w:i w:val="0"/>
                 <w:color w:val="0F172A"/>
-                <w:sz w:val="17"/>
+                <w:sz w:val="20"/>
               </w:rPr>
               <w:t>The score is transparent and easy to adapt.</w:t>
             </w:r>
@@ -12442,7 +12442,7 @@
                 <w:b w:val="0"/>
                 <w:i w:val="0"/>
                 <w:color w:val="0F172A"/>
-                <w:sz w:val="17"/>
+                <w:sz w:val="20"/>
               </w:rPr>
               <w:t>5</w:t>
             </w:r>
@@ -12472,7 +12472,7 @@
                 <w:b w:val="0"/>
                 <w:i w:val="0"/>
                 <w:color w:val="0F172A"/>
-                <w:sz w:val="17"/>
+                <w:sz w:val="20"/>
               </w:rPr>
               <w:t>/api/data-status</w:t>
             </w:r>
@@ -12502,7 +12502,7 @@
                 <w:b w:val="0"/>
                 <w:i w:val="0"/>
                 <w:color w:val="0F172A"/>
-                <w:sz w:val="17"/>
+                <w:sz w:val="20"/>
               </w:rPr>
               <w:t>The app is fallback-aware and cloud-live ready.</w:t>
             </w:r>
@@ -12534,7 +12534,7 @@
                 <w:b w:val="0"/>
                 <w:i w:val="0"/>
                 <w:color w:val="0F172A"/>
-                <w:sz w:val="17"/>
+                <w:sz w:val="20"/>
               </w:rPr>
               <w:t>6</w:t>
             </w:r>
@@ -12564,7 +12564,7 @@
                 <w:b w:val="0"/>
                 <w:i w:val="0"/>
                 <w:color w:val="0F172A"/>
-                <w:sz w:val="17"/>
+                <w:sz w:val="20"/>
               </w:rPr>
               <w:t>Azure workflow</w:t>
             </w:r>
@@ -12594,7 +12594,7 @@
                 <w:b w:val="0"/>
                 <w:i w:val="0"/>
                 <w:color w:val="0F172A"/>
-                <w:sz w:val="17"/>
+                <w:sz w:val="20"/>
               </w:rPr>
               <w:t>Services map to hosting, maps, files, records, and monitoring.</w:t>
             </w:r>
@@ -12626,7 +12626,7 @@
                 <w:b w:val="0"/>
                 <w:i w:val="0"/>
                 <w:color w:val="0F172A"/>
-                <w:sz w:val="17"/>
+                <w:sz w:val="20"/>
               </w:rPr>
               <w:t>7</w:t>
             </w:r>
@@ -12656,7 +12656,7 @@
                 <w:b w:val="0"/>
                 <w:i w:val="0"/>
                 <w:color w:val="0F172A"/>
-                <w:sz w:val="17"/>
+                <w:sz w:val="20"/>
               </w:rPr>
               <w:t>Adaptation routes</w:t>
             </w:r>
@@ -12686,7 +12686,7 @@
                 <w:b w:val="0"/>
                 <w:i w:val="0"/>
                 <w:color w:val="0F172A"/>
-                <w:sz w:val="17"/>
+                <w:sz w:val="20"/>
               </w:rPr>
               <w:t>The same scaffold supports multiple hackathon tracks.</w:t>
             </w:r>
@@ -12735,17 +12735,17 @@
                 <w:b/>
                 <w:i w:val="0"/>
                 <w:color w:val="FFFFFF"/>
+                <w:sz w:val="22"/>
+              </w:rPr>
+              <w:t xml:space="preserve">Demo rule: </w:t>
+            </w:r>
+            <w:r>
+              <w:rPr>
+                <w:rFonts w:ascii="Aptos" w:hAnsi="Aptos"/>
+                <w:b w:val="0"/>
+                <w:i w:val="0"/>
+                <w:color w:val="FFFFFF"/>
                 <w:sz w:val="20"/>
-              </w:rPr>
-              <w:t xml:space="preserve">Demo rule: </w:t>
-            </w:r>
-            <w:r>
-              <w:rPr>
-                <w:rFonts w:ascii="Aptos" w:hAnsi="Aptos"/>
-                <w:b w:val="0"/>
-                <w:i w:val="0"/>
-                <w:color w:val="FFFFFF"/>
-                <w:sz w:val="18"/>
               </w:rPr>
               <w:t>Keep the live demo local unless the deployed app has already passed /health and /api/data-status checks.</w:t>
             </w:r>
@@ -12822,7 +12822,7 @@
                 <w:b w:val="0"/>
                 <w:i w:val="0"/>
                 <w:color w:val="0F172A"/>
-                <w:sz w:val="17"/>
+                <w:sz w:val="19"/>
               </w:rPr>
               <w:t>python3 -m venv .venv</w:t>
               <w:br/>
@@ -12991,7 +12991,7 @@
                 <w:b/>
                 <w:i w:val="0"/>
                 <w:color w:val="08182F"/>
-                <w:sz w:val="18"/>
+                <w:sz w:val="21"/>
               </w:rPr>
               <w:t>Need</w:t>
             </w:r>
@@ -13022,7 +13022,7 @@
                 <w:b/>
                 <w:i w:val="0"/>
                 <w:color w:val="08182F"/>
-                <w:sz w:val="18"/>
+                <w:sz w:val="21"/>
               </w:rPr>
               <w:t>Open</w:t>
             </w:r>
@@ -13054,7 +13054,7 @@
                 <w:b w:val="0"/>
                 <w:i w:val="0"/>
                 <w:color w:val="0F172A"/>
-                <w:sz w:val="17"/>
+                <w:sz w:val="20"/>
               </w:rPr>
               <w:t>GitHub repo</w:t>
             </w:r>
@@ -13084,7 +13084,7 @@
                 <w:b w:val="0"/>
                 <w:i w:val="0"/>
                 <w:color w:val="0F172A"/>
-                <w:sz w:val="17"/>
+                <w:sz w:val="20"/>
               </w:rPr>
               <w:t>https://github.com/Esturban/microsoft-hackathon-riyadh-mobility</w:t>
             </w:r>
@@ -13116,7 +13116,7 @@
                 <w:b w:val="0"/>
                 <w:i w:val="0"/>
                 <w:color w:val="0F172A"/>
-                <w:sz w:val="17"/>
+                <w:sz w:val="20"/>
               </w:rPr>
               <w:t>Local dashboard</w:t>
             </w:r>
@@ -13146,7 +13146,7 @@
                 <w:b w:val="0"/>
                 <w:i w:val="0"/>
                 <w:color w:val="0F172A"/>
-                <w:sz w:val="17"/>
+                <w:sz w:val="20"/>
               </w:rPr>
               <w:t>http://127.0.0.1:8000</w:t>
             </w:r>
@@ -13178,7 +13178,7 @@
                 <w:b w:val="0"/>
                 <w:i w:val="0"/>
                 <w:color w:val="0F172A"/>
-                <w:sz w:val="17"/>
+                <w:sz w:val="20"/>
               </w:rPr>
               <w:t>atomcamp Arabia</w:t>
             </w:r>
@@ -13208,7 +13208,7 @@
                 <w:b w:val="0"/>
                 <w:i w:val="0"/>
                 <w:color w:val="0F172A"/>
-                <w:sz w:val="17"/>
+                <w:sz w:val="20"/>
               </w:rPr>
               <w:t>https://atomcamparabia.com/</w:t>
             </w:r>
@@ -13240,7 +13240,7 @@
                 <w:b w:val="0"/>
                 <w:i w:val="0"/>
                 <w:color w:val="0F172A"/>
-                <w:sz w:val="17"/>
+                <w:sz w:val="20"/>
               </w:rPr>
               <w:t>Azure Developer CLI docs</w:t>
             </w:r>
@@ -13270,7 +13270,7 @@
                 <w:b w:val="0"/>
                 <w:i w:val="0"/>
                 <w:color w:val="0F172A"/>
-                <w:sz w:val="17"/>
+                <w:sz w:val="20"/>
               </w:rPr>
               <w:t>https://learn.microsoft.com/en-us/azure/developer/azure-developer-cli/</w:t>
             </w:r>
@@ -13302,7 +13302,7 @@
                 <w:b w:val="0"/>
                 <w:i w:val="0"/>
                 <w:color w:val="0F172A"/>
-                <w:sz w:val="17"/>
+                <w:sz w:val="20"/>
               </w:rPr>
               <w:t>Azure Maps docs</w:t>
             </w:r>
@@ -13332,7 +13332,7 @@
                 <w:b w:val="0"/>
                 <w:i w:val="0"/>
                 <w:color w:val="0F172A"/>
-                <w:sz w:val="17"/>
+                <w:sz w:val="20"/>
               </w:rPr>
               <w:t>https://learn.microsoft.com/en-us/azure/azure-maps/</w:t>
             </w:r>
@@ -13364,7 +13364,7 @@
                 <w:b w:val="0"/>
                 <w:i w:val="0"/>
                 <w:color w:val="0F172A"/>
-                <w:sz w:val="17"/>
+                <w:sz w:val="20"/>
               </w:rPr>
               <w:t>Student quickstart</w:t>
             </w:r>
@@ -13394,7 +13394,7 @@
                 <w:b w:val="0"/>
                 <w:i w:val="0"/>
                 <w:color w:val="0F172A"/>
-                <w:sz w:val="17"/>
+                <w:sz w:val="20"/>
               </w:rPr>
               <w:t>README.md</w:t>
             </w:r>
@@ -13426,7 +13426,7 @@
                 <w:b w:val="0"/>
                 <w:i w:val="0"/>
                 <w:color w:val="0F172A"/>
-                <w:sz w:val="17"/>
+                <w:sz w:val="20"/>
               </w:rPr>
               <w:t>Architecture notes</w:t>
             </w:r>
@@ -13456,7 +13456,7 @@
                 <w:b w:val="0"/>
                 <w:i w:val="0"/>
                 <w:color w:val="0F172A"/>
-                <w:sz w:val="17"/>
+                <w:sz w:val="20"/>
               </w:rPr>
               <w:t>docs/architecture.md</w:t>
             </w:r>
@@ -13488,7 +13488,7 @@
                 <w:b w:val="0"/>
                 <w:i w:val="0"/>
                 <w:color w:val="0F172A"/>
-                <w:sz w:val="17"/>
+                <w:sz w:val="20"/>
               </w:rPr>
               <w:t>Azure deployment notes</w:t>
             </w:r>
@@ -13518,7 +13518,7 @@
                 <w:b w:val="0"/>
                 <w:i w:val="0"/>
                 <w:color w:val="0F172A"/>
-                <w:sz w:val="17"/>
+                <w:sz w:val="20"/>
               </w:rPr>
               <w:t>docs/azure_deployment.md</w:t>
             </w:r>
@@ -13550,7 +13550,7 @@
                 <w:b w:val="0"/>
                 <w:i w:val="0"/>
                 <w:color w:val="0F172A"/>
-                <w:sz w:val="17"/>
+                <w:sz w:val="20"/>
               </w:rPr>
               <w:t>Troubleshooting</w:t>
             </w:r>
@@ -13580,7 +13580,7 @@
                 <w:b w:val="0"/>
                 <w:i w:val="0"/>
                 <w:color w:val="0F172A"/>
-                <w:sz w:val="17"/>
+                <w:sz w:val="20"/>
               </w:rPr>
               <w:t>docs/troubleshooting.md</w:t>
             </w:r>
@@ -14000,7 +14000,7 @@
       <w:rFonts w:ascii="Aptos" w:hAnsi="Aptos"/>
       <w:b w:val="0"/>
       <w:color w:val="0F172A"/>
-      <w:sz w:val="21"/>
+      <w:sz w:val="22"/>
     </w:rPr>
   </w:style>
   <w:style w:type="paragraph" w:styleId="Header">

</xml_diff>